<commit_message>
docs: actualizar especificaciones, arquitectura y documentacion general
</commit_message>
<xml_diff>
--- a/Registro_de_Decisiones_Gimnasio.docx
+++ b/Registro_de_Decisiones_Gimnasio.docx
@@ -1,6 +1,6 @@
 
 <file path=word/document.xml><?xml version="1.0" encoding="utf-8"?>
-<w:document xmlns:wpc="http://schemas.microsoft.com/office/word/2010/wordprocessingCanvas" xmlns:mc="http://schemas.openxmlformats.org/markup-compatibility/2006" xmlns:o="urn:schemas-microsoft-com:office:office" xmlns:r="http://schemas.openxmlformats.org/officeDocument/2006/relationships" xmlns:m="http://schemas.openxmlformats.org/officeDocument/2006/math" xmlns:v="urn:schemas-microsoft-com:vml" xmlns:wp14="http://schemas.microsoft.com/office/word/2010/wordprocessingDrawing" xmlns:wp="http://schemas.openxmlformats.org/drawingml/2006/wordprocessingDrawing" xmlns:w10="urn:schemas-microsoft-com:office:word" xmlns:w="http://schemas.openxmlformats.org/wordprocessingml/2006/main" xmlns:w14="http://schemas.microsoft.com/office/word/2010/wordml" xmlns:w15="http://schemas.microsoft.com/office/word/2012/wordml" xmlns:wpg="http://schemas.microsoft.com/office/word/2010/wordprocessingGroup" xmlns:wpi="http://schemas.microsoft.com/office/word/2010/wordprocessingInk" xmlns:wne="http://schemas.microsoft.com/office/word/2006/wordml" xmlns:wps="http://schemas.microsoft.com/office/word/2010/wordprocessingShape" xmlns:cx="http://schemas.microsoft.com/office/drawing/2014/chartex" xmlns:cx1="http://schemas.microsoft.com/office/drawing/2015/9/8/chartex" xmlns:cx2="http://schemas.microsoft.com/office/drawing/2015/10/21/chartex" xmlns:cx3="http://schemas.microsoft.com/office/drawing/2016/5/9/chartex" xmlns:cx4="http://schemas.microsoft.com/office/drawing/2016/5/10/chartex" xmlns:cx5="http://schemas.microsoft.com/office/drawing/2016/5/11/chartex" xmlns:cx6="http://schemas.microsoft.com/office/drawing/2016/5/12/chartex" xmlns:cx7="http://schemas.microsoft.com/office/drawing/2016/5/13/chartex" xmlns:cx8="http://schemas.microsoft.com/office/drawing/2016/5/14/chartex" xmlns:aink="http://schemas.microsoft.com/office/drawing/2016/ink" xmlns:am3d="http://schemas.microsoft.com/office/drawing/2017/model3d" xmlns:w16cex="http://schemas.microsoft.com/office/word/2018/wordml/cex" xmlns:w16cid="http://schemas.microsoft.com/office/word/2016/wordml/cid" xmlns:w16="http://schemas.microsoft.com/office/word/2018/wordml" xmlns:w16sdtdh="http://schemas.microsoft.com/office/word/2020/wordml/sdtdatahash" xmlns:w16se="http://schemas.microsoft.com/office/word/2015/wordml/symex" mc:Ignorable="w14 w15 wp14">
+<w:document xmlns:mc="http://schemas.openxmlformats.org/markup-compatibility/2006" xmlns:r="http://schemas.openxmlformats.org/officeDocument/2006/relationships" xmlns:w="http://schemas.openxmlformats.org/wordprocessingml/2006/main" xmlns:wpc="http://schemas.microsoft.com/office/word/2010/wordprocessingCanvas" xmlns:o="urn:schemas-microsoft-com:office:office" xmlns:m="http://schemas.openxmlformats.org/officeDocument/2006/math" xmlns:v="urn:schemas-microsoft-com:vml" xmlns:wp14="http://schemas.microsoft.com/office/word/2010/wordprocessingDrawing" xmlns:wp="http://schemas.openxmlformats.org/drawingml/2006/wordprocessingDrawing" xmlns:w10="urn:schemas-microsoft-com:office:word" xmlns:w14="http://schemas.microsoft.com/office/word/2010/wordml" xmlns:w15="http://schemas.microsoft.com/office/word/2012/wordml" xmlns:wpg="http://schemas.microsoft.com/office/word/2010/wordprocessingGroup" xmlns:wpi="http://schemas.microsoft.com/office/word/2010/wordprocessingInk" xmlns:wne="http://schemas.microsoft.com/office/word/2006/wordml" xmlns:wps="http://schemas.microsoft.com/office/word/2010/wordprocessingShape" xmlns:cx="http://schemas.microsoft.com/office/drawing/2014/chartex" xmlns:cx1="http://schemas.microsoft.com/office/drawing/2015/9/8/chartex" xmlns:cx2="http://schemas.microsoft.com/office/drawing/2015/10/21/chartex" xmlns:cx3="http://schemas.microsoft.com/office/drawing/2016/5/9/chartex" xmlns:cx4="http://schemas.microsoft.com/office/drawing/2016/5/10/chartex" xmlns:cx5="http://schemas.microsoft.com/office/drawing/2016/5/11/chartex" xmlns:cx6="http://schemas.microsoft.com/office/drawing/2016/5/12/chartex" xmlns:cx7="http://schemas.microsoft.com/office/drawing/2016/5/13/chartex" xmlns:cx8="http://schemas.microsoft.com/office/drawing/2016/5/14/chartex" xmlns:aink="http://schemas.microsoft.com/office/drawing/2016/ink" xmlns:am3d="http://schemas.microsoft.com/office/drawing/2017/model3d" xmlns:w16cex="http://schemas.microsoft.com/office/word/2018/wordml/cex" xmlns:w16cid="http://schemas.microsoft.com/office/word/2016/wordml/cid" xmlns:w16="http://schemas.microsoft.com/office/word/2018/wordml" xmlns:w16sdtdh="http://schemas.microsoft.com/office/word/2020/wordml/sdtdatahash" xmlns:w16se="http://schemas.microsoft.com/office/word/2015/wordml/symex" mc:Ignorable="w14 w15 wp14">
   <w:body>
     <w:p>
       <w:pPr>
@@ -3786,6 +3786,1051 @@
           </w:p>
         </w:tc>
       </w:tr>
+      <w:tr>
+        <w:trPr>
+          <w:tblHeader w:val="false"/>
+        </w:trPr>
+        <w:tc>
+          <w:tcPr>
+            <w:tcW w:type="dxa" w:w="747"/>
+            <w:tcBorders>
+              <w:top w:val="single" w:color="BFBFBF" w:sz="4"/>
+              <w:left w:val="single" w:color="BFBFBF" w:sz="4"/>
+              <w:bottom w:val="single" w:color="BFBFBF" w:sz="4"/>
+              <w:right w:val="single" w:color="BFBFBF" w:sz="4"/>
+            </w:tcBorders>
+            <w:shd w:fill="F2F6FA" w:color="auto" w:val="clear"/>
+            <w:tcMar>
+              <w:top w:type="dxa" w:w="60"/>
+              <w:left w:type="dxa" w:w="100"/>
+              <w:bottom w:type="dxa" w:w="60"/>
+              <w:right w:type="dxa" w:w="100"/>
+            </w:tcMar>
+          </w:tcPr>
+          <w:p>
+            <w:pPr>
+              <w:spacing w:after="0"/>
+            </w:pPr>
+            <w:r>
+              <w:rPr>
+                <w:sz w:val="18"/>
+                <w:szCs w:val="18"/>
+              </w:rPr>
+              <w:t xml:space="preserve">D-42</w:t>
+            </w:r>
+          </w:p>
+        </w:tc>
+        <w:tc>
+          <w:tcPr>
+            <w:tcW w:type="dxa" w:w="4408"/>
+            <w:tcBorders>
+              <w:top w:val="single" w:color="BFBFBF" w:sz="4"/>
+              <w:left w:val="single" w:color="BFBFBF" w:sz="4"/>
+              <w:bottom w:val="single" w:color="BFBFBF" w:sz="4"/>
+              <w:right w:val="single" w:color="BFBFBF" w:sz="4"/>
+            </w:tcBorders>
+            <w:shd w:fill="F2F6FA" w:color="auto" w:val="clear"/>
+            <w:tcMar>
+              <w:top w:type="dxa" w:w="60"/>
+              <w:left w:type="dxa" w:w="100"/>
+              <w:bottom w:type="dxa" w:w="60"/>
+              <w:right w:type="dxa" w:w="100"/>
+            </w:tcMar>
+          </w:tcPr>
+          <w:p>
+            <w:pPr>
+              <w:spacing w:after="0"/>
+            </w:pPr>
+            <w:r>
+              <w:rPr>
+                <w:sz w:val="18"/>
+                <w:szCs w:val="18"/>
+              </w:rPr>
+              <w:t xml:space="preserve">Alcance del servicio operativo para la Entrega 2</w:t>
+            </w:r>
+          </w:p>
+        </w:tc>
+        <w:tc>
+          <w:tcPr>
+            <w:tcW w:type="dxa" w:w="4483"/>
+            <w:tcBorders>
+              <w:top w:val="single" w:color="BFBFBF" w:sz="4"/>
+              <w:left w:val="single" w:color="BFBFBF" w:sz="4"/>
+              <w:bottom w:val="single" w:color="BFBFBF" w:sz="4"/>
+              <w:right w:val="single" w:color="BFBFBF" w:sz="4"/>
+            </w:tcBorders>
+            <w:shd w:fill="F2F6FA" w:color="auto" w:val="clear"/>
+            <w:tcMar>
+              <w:top w:type="dxa" w:w="60"/>
+              <w:left w:type="dxa" w:w="100"/>
+              <w:bottom w:type="dxa" w:w="60"/>
+              <w:right w:type="dxa" w:w="100"/>
+            </w:tcMar>
+          </w:tcPr>
+          <w:p>
+            <w:pPr>
+              <w:spacing w:after="0"/>
+            </w:pPr>
+            <w:r>
+              <w:rPr>
+                <w:sz w:val="18"/>
+                <w:szCs w:val="18"/>
+              </w:rPr>
+              <w:t xml:space="preserve">Seg?n confirmaci?n de la c?tedra comunicada por el equipo el 16/10/2026, benefits-service alcanza tanto para el servicio operativo como para la capacidad propia compartida. Se implementa el flujo de acreditaci?n, saldo, movimientos e idempotencia con PostgreSQL; no se exige un segundo servicio para este requisito de la Entrega 2. Ver docs/PLAN_ENTREGA_2.md ?3.</w:t>
+            </w:r>
+          </w:p>
+        </w:tc>
+      </w:tr>
+      <w:tr>
+        <w:trPr>
+          <w:tblHeader w:val="false"/>
+        </w:trPr>
+        <w:tc>
+          <w:tcPr>
+            <w:tcW w:type="dxa" w:w="747"/>
+            <w:tcBorders>
+              <w:top w:val="single" w:color="BFBFBF" w:sz="4"/>
+              <w:left w:val="single" w:color="BFBFBF" w:sz="4"/>
+              <w:bottom w:val="single" w:color="BFBFBF" w:sz="4"/>
+              <w:right w:val="single" w:color="BFBFBF" w:sz="4"/>
+            </w:tcBorders>
+            <w:shd w:fill="F2F6FA" w:color="auto" w:val="clear"/>
+            <w:tcMar>
+              <w:top w:type="dxa" w:w="60"/>
+              <w:left w:type="dxa" w:w="100"/>
+              <w:bottom w:type="dxa" w:w="60"/>
+              <w:right w:type="dxa" w:w="100"/>
+            </w:tcMar>
+          </w:tcPr>
+          <w:p>
+            <w:pPr>
+              <w:spacing w:after="0"/>
+            </w:pPr>
+            <w:r>
+              <w:rPr>
+                <w:sz w:val="18"/>
+                <w:szCs w:val="18"/>
+              </w:rPr>
+              <w:t xml:space="preserve">D-43</w:t>
+            </w:r>
+          </w:p>
+        </w:tc>
+        <w:tc>
+          <w:tcPr>
+            <w:tcW w:type="dxa" w:w="4408"/>
+            <w:tcBorders>
+              <w:top w:val="single" w:color="BFBFBF" w:sz="4"/>
+              <w:left w:val="single" w:color="BFBFBF" w:sz="4"/>
+              <w:bottom w:val="single" w:color="BFBFBF" w:sz="4"/>
+              <w:right w:val="single" w:color="BFBFBF" w:sz="4"/>
+            </w:tcBorders>
+            <w:shd w:fill="F2F6FA" w:color="auto" w:val="clear"/>
+            <w:tcMar>
+              <w:top w:type="dxa" w:w="60"/>
+              <w:left w:type="dxa" w:w="100"/>
+              <w:bottom w:type="dxa" w:w="60"/>
+              <w:right w:type="dxa" w:w="100"/>
+            </w:tcMar>
+          </w:tcPr>
+          <w:p>
+            <w:pPr>
+              <w:spacing w:after="0"/>
+            </w:pPr>
+            <w:r>
+              <w:rPr>
+                <w:sz w:val="18"/>
+                <w:szCs w:val="18"/>
+              </w:rPr>
+              <w:t xml:space="preserve">Presupuesto inicial de Benefits</w:t>
+            </w:r>
+          </w:p>
+        </w:tc>
+        <w:tc>
+          <w:tcPr>
+            <w:tcW w:type="dxa" w:w="4483"/>
+            <w:tcBorders>
+              <w:top w:val="single" w:color="BFBFBF" w:sz="4"/>
+              <w:left w:val="single" w:color="BFBFBF" w:sz="4"/>
+              <w:bottom w:val="single" w:color="BFBFBF" w:sz="4"/>
+              <w:right w:val="single" w:color="BFBFBF" w:sz="4"/>
+            </w:tcBorders>
+            <w:shd w:fill="F2F6FA" w:color="auto" w:val="clear"/>
+            <w:tcMar>
+              <w:top w:type="dxa" w:w="60"/>
+              <w:left w:type="dxa" w:w="100"/>
+              <w:bottom w:type="dxa" w:w="60"/>
+              <w:right w:type="dxa" w:w="100"/>
+            </w:tcMar>
+          </w:tcPr>
+          <w:p>
+            <w:pPr>
+              <w:spacing w:after="0"/>
+            </w:pPr>
+            <w:r>
+              <w:rPr>
+                <w:sz w:val="18"/>
+                <w:szCs w:val="18"/>
+              </w:rPr>
+              <w:t xml:space="preserve">Aprobado el 16/10/2026: Benefits limita su operación de aplicación y PostgreSQL a 4 segundos, o al tiempo restante del contexto si es menor, dentro de los 5 segundos del gateway. Implementación y validación pendientes. Ver ADR-010.</w:t>
+            </w:r>
+          </w:p>
+        </w:tc>
+      </w:tr>
+      <w:tr>
+        <w:trPr>
+          <w:tblHeader w:val="false"/>
+        </w:trPr>
+        <w:tc>
+          <w:tcPr>
+            <w:tcW w:type="dxa" w:w="747"/>
+            <w:tcBorders>
+              <w:top w:val="single" w:color="BFBFBF" w:sz="4"/>
+              <w:left w:val="single" w:color="BFBFBF" w:sz="4"/>
+              <w:bottom w:val="single" w:color="BFBFBF" w:sz="4"/>
+              <w:right w:val="single" w:color="BFBFBF" w:sz="4"/>
+            </w:tcBorders>
+            <w:shd w:fill="F2F6FA" w:color="auto" w:val="clear"/>
+            <w:tcMar>
+              <w:top w:type="dxa" w:w="60"/>
+              <w:left w:type="dxa" w:w="100"/>
+              <w:bottom w:type="dxa" w:w="60"/>
+              <w:right w:type="dxa" w:w="100"/>
+            </w:tcMar>
+          </w:tcPr>
+          <w:p>
+            <w:pPr>
+              <w:spacing w:after="0"/>
+            </w:pPr>
+            <w:r>
+              <w:rPr>
+                <w:sz w:val="18"/>
+                <w:szCs w:val="18"/>
+              </w:rPr>
+              <w:t xml:space="preserve">D-44</w:t>
+            </w:r>
+          </w:p>
+        </w:tc>
+        <w:tc>
+          <w:tcPr>
+            <w:tcW w:type="dxa" w:w="4408"/>
+            <w:tcBorders>
+              <w:top w:val="single" w:color="BFBFBF" w:sz="4"/>
+              <w:left w:val="single" w:color="BFBFBF" w:sz="4"/>
+              <w:bottom w:val="single" w:color="BFBFBF" w:sz="4"/>
+              <w:right w:val="single" w:color="BFBFBF" w:sz="4"/>
+            </w:tcBorders>
+            <w:shd w:fill="F2F6FA" w:color="auto" w:val="clear"/>
+            <w:tcMar>
+              <w:top w:type="dxa" w:w="60"/>
+              <w:left w:type="dxa" w:w="100"/>
+              <w:bottom w:type="dxa" w:w="60"/>
+              <w:right w:type="dxa" w:w="100"/>
+            </w:tcMar>
+          </w:tcPr>
+          <w:p>
+            <w:pPr>
+              <w:spacing w:after="0"/>
+            </w:pPr>
+            <w:r>
+              <w:rPr>
+                <w:sz w:val="18"/>
+                <w:szCs w:val="18"/>
+              </w:rPr>
+              <w:t xml:space="preserve">Errores de borde del contrato de partners</w:t>
+            </w:r>
+          </w:p>
+        </w:tc>
+        <w:tc>
+          <w:tcPr>
+            <w:tcW w:type="dxa" w:w="4483"/>
+            <w:tcBorders>
+              <w:top w:val="single" w:color="BFBFBF" w:sz="4"/>
+              <w:left w:val="single" w:color="BFBFBF" w:sz="4"/>
+              <w:bottom w:val="single" w:color="BFBFBF" w:sz="4"/>
+              <w:right w:val="single" w:color="BFBFBF" w:sz="4"/>
+            </w:tcBorders>
+            <w:shd w:fill="F2F6FA" w:color="auto" w:val="clear"/>
+            <w:tcMar>
+              <w:top w:type="dxa" w:w="60"/>
+              <w:left w:type="dxa" w:w="100"/>
+              <w:bottom w:type="dxa" w:w="60"/>
+              <w:right w:type="dxa" w:w="100"/>
+            </w:tcMar>
+          </w:tcPr>
+          <w:p>
+            <w:pPr>
+              <w:spacing w:after="0"/>
+            </w:pPr>
+            <w:r>
+              <w:rPr>
+                <w:sz w:val="18"/>
+                <w:szCs w:val="18"/>
+              </w:rPr>
+              <w:t xml:space="preserve">Aprobado el 16/10/2026: OpenAPI 1.1.0 documenta 502 UNAVAILABLE y 504 TIMEOUT con formato de partners y correlationId; 502 incluye Retry-After. Reintento con la misma Idempotency-Key, sin asumir rollback ante timeout. Ver ADR-008 v2; traducción del gateway pendiente de etapa 3.</w:t>
+            </w:r>
+          </w:p>
+        </w:tc>
+      </w:tr>
+      <w:tr>
+        <w:trPr>
+          <w:tblHeader w:val="false"/>
+        </w:trPr>
+        <w:tc>
+          <w:tcPr>
+            <w:tcW w:type="dxa" w:w="747"/>
+            <w:tcBorders>
+              <w:top w:val="single" w:color="BFBFBF" w:sz="4"/>
+              <w:left w:val="single" w:color="BFBFBF" w:sz="4"/>
+              <w:bottom w:val="single" w:color="BFBFBF" w:sz="4"/>
+              <w:right w:val="single" w:color="BFBFBF" w:sz="4"/>
+            </w:tcBorders>
+            <w:shd w:fill="F2F6FA" w:color="auto" w:val="clear"/>
+            <w:tcMar>
+              <w:top w:type="dxa" w:w="60"/>
+              <w:left w:type="dxa" w:w="100"/>
+              <w:bottom w:type="dxa" w:w="60"/>
+              <w:right w:type="dxa" w:w="100"/>
+            </w:tcMar>
+          </w:tcPr>
+          <w:p>
+            <w:pPr>
+              <w:spacing w:after="0"/>
+            </w:pPr>
+            <w:r>
+              <w:rPr>
+                <w:sz w:val="18"/>
+                <w:szCs w:val="18"/>
+              </w:rPr>
+              <w:t xml:space="preserve">D-45</w:t>
+            </w:r>
+          </w:p>
+        </w:tc>
+        <w:tc>
+          <w:tcPr>
+            <w:tcW w:type="dxa" w:w="4408"/>
+            <w:tcBorders>
+              <w:top w:val="single" w:color="BFBFBF" w:sz="4"/>
+              <w:left w:val="single" w:color="BFBFBF" w:sz="4"/>
+              <w:bottom w:val="single" w:color="BFBFBF" w:sz="4"/>
+              <w:right w:val="single" w:color="BFBFBF" w:sz="4"/>
+            </w:tcBorders>
+            <w:shd w:fill="F2F6FA" w:color="auto" w:val="clear"/>
+            <w:tcMar>
+              <w:top w:type="dxa" w:w="60"/>
+              <w:left w:type="dxa" w:w="100"/>
+              <w:bottom w:type="dxa" w:w="60"/>
+              <w:right w:type="dxa" w:w="100"/>
+            </w:tcMar>
+          </w:tcPr>
+          <w:p>
+            <w:pPr>
+              <w:spacing w:after="0"/>
+            </w:pPr>
+            <w:r>
+              <w:rPr>
+                <w:sz w:val="18"/>
+                <w:szCs w:val="18"/>
+              </w:rPr>
+              <w:t xml:space="preserve">Diseño inicial de búsqueda de clases (D6)</w:t>
+            </w:r>
+          </w:p>
+        </w:tc>
+        <w:tc>
+          <w:tcPr>
+            <w:tcW w:type="dxa" w:w="4483"/>
+            <w:tcBorders>
+              <w:top w:val="single" w:color="BFBFBF" w:sz="4"/>
+              <w:left w:val="single" w:color="BFBFBF" w:sz="4"/>
+              <w:bottom w:val="single" w:color="BFBFBF" w:sz="4"/>
+              <w:right w:val="single" w:color="BFBFBF" w:sz="4"/>
+            </w:tcBorders>
+            <w:shd w:fill="F2F6FA" w:color="auto" w:val="clear"/>
+            <w:tcMar>
+              <w:top w:type="dxa" w:w="60"/>
+              <w:left w:type="dxa" w:w="100"/>
+              <w:bottom w:type="dxa" w:w="60"/>
+              <w:right w:type="dxa" w:w="100"/>
+            </w:tcMar>
+          </w:tcPr>
+          <w:p>
+            <w:pPr>
+              <w:spacing w:after="0"/>
+            </w:pPr>
+            <w:r>
+              <w:rPr>
+                <w:sz w:val="18"/>
+                <w:szCs w:val="18"/>
+              </w:rPr>
+              <w:t xml:space="preserve">Aprobado el 16/10/2026: OpenSearch con filtros por actividad, fecha, franja y disponibilidad; orden por inicio ascendente; 20 resultados por página por defecto, máximo 100. Objetivo de actualización menor a 2 segundos en condiciones normales. La reserva confirma el cupo en PostgreSQL. Implementación y medición pendientes. Ver ADR-014.</w:t>
+            </w:r>
+          </w:p>
+        </w:tc>
+      </w:tr>
+      <w:tr>
+        <w:trPr>
+          <w:tblHeader w:val="false"/>
+        </w:trPr>
+        <w:tc>
+          <w:tcPr>
+            <w:tcW w:type="dxa" w:w="747"/>
+            <w:tcBorders>
+              <w:top w:val="single" w:color="BFBFBF" w:sz="4"/>
+              <w:left w:val="single" w:color="BFBFBF" w:sz="4"/>
+              <w:bottom w:val="single" w:color="BFBFBF" w:sz="4"/>
+              <w:right w:val="single" w:color="BFBFBF" w:sz="4"/>
+            </w:tcBorders>
+            <w:shd w:fill="F2F6FA" w:color="auto" w:val="clear"/>
+            <w:tcMar>
+              <w:top w:type="dxa" w:w="60"/>
+              <w:left w:type="dxa" w:w="100"/>
+              <w:bottom w:type="dxa" w:w="60"/>
+              <w:right w:type="dxa" w:w="100"/>
+            </w:tcMar>
+          </w:tcPr>
+          <w:p>
+            <w:pPr>
+              <w:spacing w:after="0"/>
+            </w:pPr>
+            <w:r>
+              <w:rPr>
+                <w:sz w:val="18"/>
+                <w:szCs w:val="18"/>
+              </w:rPr>
+              <w:t xml:space="preserve">D-46</w:t>
+            </w:r>
+          </w:p>
+        </w:tc>
+        <w:tc>
+          <w:tcPr>
+            <w:tcW w:type="dxa" w:w="4408"/>
+            <w:tcBorders>
+              <w:top w:val="single" w:color="BFBFBF" w:sz="4"/>
+              <w:left w:val="single" w:color="BFBFBF" w:sz="4"/>
+              <w:bottom w:val="single" w:color="BFBFBF" w:sz="4"/>
+              <w:right w:val="single" w:color="BFBFBF" w:sz="4"/>
+            </w:tcBorders>
+            <w:shd w:fill="F2F6FA" w:color="auto" w:val="clear"/>
+            <w:tcMar>
+              <w:top w:type="dxa" w:w="60"/>
+              <w:left w:type="dxa" w:w="100"/>
+              <w:bottom w:type="dxa" w:w="60"/>
+              <w:right w:type="dxa" w:w="100"/>
+            </w:tcMar>
+          </w:tcPr>
+          <w:p>
+            <w:pPr>
+              <w:spacing w:after="0"/>
+            </w:pPr>
+            <w:r>
+              <w:rPr>
+                <w:sz w:val="18"/>
+                <w:szCs w:val="18"/>
+              </w:rPr>
+              <w:t xml:space="preserve">Diseño inicial de balanceo de Booking (D12)</w:t>
+            </w:r>
+          </w:p>
+        </w:tc>
+        <w:tc>
+          <w:tcPr>
+            <w:tcW w:type="dxa" w:w="4483"/>
+            <w:tcBorders>
+              <w:top w:val="single" w:color="BFBFBF" w:sz="4"/>
+              <w:left w:val="single" w:color="BFBFBF" w:sz="4"/>
+              <w:bottom w:val="single" w:color="BFBFBF" w:sz="4"/>
+              <w:right w:val="single" w:color="BFBFBF" w:sz="4"/>
+            </w:tcBorders>
+            <w:shd w:fill="F2F6FA" w:color="auto" w:val="clear"/>
+            <w:tcMar>
+              <w:top w:type="dxa" w:w="60"/>
+              <w:left w:type="dxa" w:w="100"/>
+              <w:bottom w:type="dxa" w:w="60"/>
+              <w:right w:type="dxa" w:w="100"/>
+            </w:tcMar>
+          </w:tcPr>
+          <w:p>
+            <w:pPr>
+              <w:spacing w:after="0"/>
+            </w:pPr>
+            <w:r>
+              <w:rPr>
+                <w:sz w:val="18"/>
+                <w:szCs w:val="18"/>
+              </w:rPr>
+              <w:t xml:space="preserve">Aprobado el 16/10/2026: dos instancias de booking-service detrás de Traefik, con igual peso y sin afinidad de sesión. Health checks cada 5 segundos con timeout de 2 segundos; retirar destinos caídos y reincorporarlos al recuperarse. Implementación y evidencia de distribución pendientes. Ver ADR-012.</w:t>
+            </w:r>
+          </w:p>
+        </w:tc>
+      </w:tr>
+      <w:tr>
+        <w:trPr>
+          <w:tblHeader w:val="false"/>
+        </w:trPr>
+        <w:tc>
+          <w:tcPr>
+            <w:tcW w:type="dxa" w:w="747"/>
+            <w:tcBorders>
+              <w:top w:val="single" w:color="BFBFBF" w:sz="4"/>
+              <w:left w:val="single" w:color="BFBFBF" w:sz="4"/>
+              <w:bottom w:val="single" w:color="BFBFBF" w:sz="4"/>
+              <w:right w:val="single" w:color="BFBFBF" w:sz="4"/>
+            </w:tcBorders>
+            <w:shd w:fill="F2F6FA" w:color="auto" w:val="clear"/>
+            <w:tcMar>
+              <w:top w:type="dxa" w:w="60"/>
+              <w:left w:type="dxa" w:w="100"/>
+              <w:bottom w:type="dxa" w:w="60"/>
+              <w:right w:type="dxa" w:w="100"/>
+            </w:tcMar>
+          </w:tcPr>
+          <w:p>
+            <w:pPr>
+              <w:spacing w:after="0"/>
+            </w:pPr>
+            <w:r>
+              <w:rPr>
+                <w:sz w:val="18"/>
+                <w:szCs w:val="18"/>
+              </w:rPr>
+              <w:t xml:space="preserve">D-47</w:t>
+            </w:r>
+          </w:p>
+        </w:tc>
+        <w:tc>
+          <w:tcPr>
+            <w:tcW w:type="dxa" w:w="4408"/>
+            <w:tcBorders>
+              <w:top w:val="single" w:color="BFBFBF" w:sz="4"/>
+              <w:left w:val="single" w:color="BFBFBF" w:sz="4"/>
+              <w:bottom w:val="single" w:color="BFBFBF" w:sz="4"/>
+              <w:right w:val="single" w:color="BFBFBF" w:sz="4"/>
+            </w:tcBorders>
+            <w:shd w:fill="F2F6FA" w:color="auto" w:val="clear"/>
+            <w:tcMar>
+              <w:top w:type="dxa" w:w="60"/>
+              <w:left w:type="dxa" w:w="100"/>
+              <w:bottom w:type="dxa" w:w="60"/>
+              <w:right w:type="dxa" w:w="100"/>
+            </w:tcMar>
+          </w:tcPr>
+          <w:p>
+            <w:pPr>
+              <w:spacing w:after="0"/>
+            </w:pPr>
+            <w:r>
+              <w:rPr>
+                <w:sz w:val="18"/>
+                <w:szCs w:val="18"/>
+              </w:rPr>
+              <w:t xml:space="preserve">Diseño inicial de resiliencia de Benefits (D10)</w:t>
+            </w:r>
+          </w:p>
+        </w:tc>
+        <w:tc>
+          <w:tcPr>
+            <w:tcW w:type="dxa" w:w="4483"/>
+            <w:tcBorders>
+              <w:top w:val="single" w:color="BFBFBF" w:sz="4"/>
+              <w:left w:val="single" w:color="BFBFBF" w:sz="4"/>
+              <w:bottom w:val="single" w:color="BFBFBF" w:sz="4"/>
+              <w:right w:val="single" w:color="BFBFBF" w:sz="4"/>
+            </w:tcBorders>
+            <w:shd w:fill="F2F6FA" w:color="auto" w:val="clear"/>
+            <w:tcMar>
+              <w:top w:type="dxa" w:w="60"/>
+              <w:left w:type="dxa" w:w="100"/>
+              <w:bottom w:type="dxa" w:w="60"/>
+              <w:right w:type="dxa" w:w="100"/>
+            </w:tcMar>
+          </w:tcPr>
+          <w:p>
+            <w:pPr>
+              <w:spacing w:after="0"/>
+            </w:pPr>
+            <w:r>
+              <w:rPr>
+                <w:sz w:val="18"/>
+                <w:szCs w:val="18"/>
+              </w:rPr>
+              <w:t xml:space="preserve">Aprobado el 16/10/2026: el gateway no reintenta escrituras automáticamente; el partner recupera el resultado reintentando con la misma Idempotency-Key. Benefits falla cerrado si PostgreSQL no permite confirmar la operación; un resultado de commit indeterminado no implica rollback. Se conserva el presupuesto D-43 y no se incorpora circuit breaker al flujo inicial Gateway → Benefits. Implementación y prueba de caída sin duplicación pendientes. Ver ADR-010.</w:t>
+            </w:r>
+          </w:p>
+        </w:tc>
+      </w:tr>
+      <w:tr>
+        <w:trPr>
+          <w:tblHeader w:val="false"/>
+        </w:trPr>
+        <w:tc>
+          <w:tcPr>
+            <w:tcW w:type="dxa" w:w="747"/>
+            <w:tcBorders>
+              <w:top w:val="single" w:color="BFBFBF" w:sz="4"/>
+              <w:left w:val="single" w:color="BFBFBF" w:sz="4"/>
+              <w:bottom w:val="single" w:color="BFBFBF" w:sz="4"/>
+              <w:right w:val="single" w:color="BFBFBF" w:sz="4"/>
+            </w:tcBorders>
+            <w:shd w:fill="F2F6FA" w:color="auto" w:val="clear"/>
+            <w:tcMar>
+              <w:top w:type="dxa" w:w="60"/>
+              <w:left w:type="dxa" w:w="100"/>
+              <w:bottom w:type="dxa" w:w="60"/>
+              <w:right w:type="dxa" w:w="100"/>
+            </w:tcMar>
+          </w:tcPr>
+          <w:p>
+            <w:pPr>
+              <w:spacing w:after="0"/>
+            </w:pPr>
+            <w:r>
+              <w:rPr>
+                <w:sz w:val="18"/>
+                <w:szCs w:val="18"/>
+              </w:rPr>
+              <w:t xml:space="preserve">D-48</w:t>
+            </w:r>
+          </w:p>
+        </w:tc>
+        <w:tc>
+          <w:tcPr>
+            <w:tcW w:type="dxa" w:w="4408"/>
+            <w:tcBorders>
+              <w:top w:val="single" w:color="BFBFBF" w:sz="4"/>
+              <w:left w:val="single" w:color="BFBFBF" w:sz="4"/>
+              <w:bottom w:val="single" w:color="BFBFBF" w:sz="4"/>
+              <w:right w:val="single" w:color="BFBFBF" w:sz="4"/>
+            </w:tcBorders>
+            <w:shd w:fill="F2F6FA" w:color="auto" w:val="clear"/>
+            <w:tcMar>
+              <w:top w:type="dxa" w:w="60"/>
+              <w:left w:type="dxa" w:w="100"/>
+              <w:bottom w:type="dxa" w:w="60"/>
+              <w:right w:type="dxa" w:w="100"/>
+            </w:tcMar>
+          </w:tcPr>
+          <w:p>
+            <w:pPr>
+              <w:spacing w:after="0"/>
+            </w:pPr>
+            <w:r>
+              <w:rPr>
+                <w:sz w:val="18"/>
+                <w:szCs w:val="18"/>
+              </w:rPr>
+              <w:t xml:space="preserve">Diseño inicial de observabilidad (D11)</w:t>
+            </w:r>
+          </w:p>
+        </w:tc>
+        <w:tc>
+          <w:tcPr>
+            <w:tcW w:type="dxa" w:w="4483"/>
+            <w:tcBorders>
+              <w:top w:val="single" w:color="BFBFBF" w:sz="4"/>
+              <w:left w:val="single" w:color="BFBFBF" w:sz="4"/>
+              <w:bottom w:val="single" w:color="BFBFBF" w:sz="4"/>
+              <w:right w:val="single" w:color="BFBFBF" w:sz="4"/>
+            </w:tcBorders>
+            <w:shd w:fill="F2F6FA" w:color="auto" w:val="clear"/>
+            <w:tcMar>
+              <w:top w:type="dxa" w:w="60"/>
+              <w:left w:type="dxa" w:w="100"/>
+              <w:bottom w:type="dxa" w:w="60"/>
+              <w:right w:type="dxa" w:w="100"/>
+            </w:tcMar>
+          </w:tcPr>
+          <w:p>
+            <w:pPr>
+              <w:spacing w:after="0"/>
+            </w:pPr>
+            <w:r>
+              <w:rPr>
+                <w:sz w:val="18"/>
+                <w:szCs w:val="18"/>
+              </w:rPr>
+              <w:t xml:space="preserve">Aprobado el 16/10/2026: logs JSON y trazas del flujo Gateway → Benefits → PostgreSQL con OpenTelemetry, Collector y Jaeger. Muestreo local 100 %, sin datos personales ni secretos. Métricas de duración, errores y reintentos; alertas iniciales por readiness crítica en 503 durante 30 s o errores 5xx superiores al 1 % durante 5 min con al menos 100 solicitudes. Instrumentación, primera traza y validación de umbrales pendientes. Ver ADR-011.</w:t>
+            </w:r>
+          </w:p>
+        </w:tc>
+      </w:tr>
+      <w:tr>
+        <w:trPr>
+          <w:tblHeader w:val="false"/>
+        </w:trPr>
+        <w:tc>
+          <w:tcPr>
+            <w:tcW w:type="dxa" w:w="747"/>
+            <w:tcBorders>
+              <w:top w:val="single" w:color="BFBFBF" w:sz="4"/>
+              <w:left w:val="single" w:color="BFBFBF" w:sz="4"/>
+              <w:bottom w:val="single" w:color="BFBFBF" w:sz="4"/>
+              <w:right w:val="single" w:color="BFBFBF" w:sz="4"/>
+            </w:tcBorders>
+            <w:shd w:fill="F2F6FA" w:color="auto" w:val="clear"/>
+            <w:tcMar>
+              <w:top w:type="dxa" w:w="60"/>
+              <w:left w:type="dxa" w:w="100"/>
+              <w:bottom w:type="dxa" w:w="60"/>
+              <w:right w:type="dxa" w:w="100"/>
+            </w:tcMar>
+          </w:tcPr>
+          <w:p>
+            <w:pPr>
+              <w:spacing w:after="0"/>
+            </w:pPr>
+            <w:r>
+              <w:rPr>
+                <w:sz w:val="18"/>
+                <w:szCs w:val="18"/>
+              </w:rPr>
+              <w:t xml:space="preserve">D-49</w:t>
+            </w:r>
+          </w:p>
+        </w:tc>
+        <w:tc>
+          <w:tcPr>
+            <w:tcW w:type="dxa" w:w="4408"/>
+            <w:tcBorders>
+              <w:top w:val="single" w:color="BFBFBF" w:sz="4"/>
+              <w:left w:val="single" w:color="BFBFBF" w:sz="4"/>
+              <w:bottom w:val="single" w:color="BFBFBF" w:sz="4"/>
+              <w:right w:val="single" w:color="BFBFBF" w:sz="4"/>
+            </w:tcBorders>
+            <w:shd w:fill="F2F6FA" w:color="auto" w:val="clear"/>
+            <w:tcMar>
+              <w:top w:type="dxa" w:w="60"/>
+              <w:left w:type="dxa" w:w="100"/>
+              <w:bottom w:type="dxa" w:w="60"/>
+              <w:right w:type="dxa" w:w="100"/>
+            </w:tcMar>
+          </w:tcPr>
+          <w:p>
+            <w:pPr>
+              <w:spacing w:after="0"/>
+            </w:pPr>
+            <w:r>
+              <w:rPr>
+                <w:sz w:val="18"/>
+                <w:szCs w:val="18"/>
+              </w:rPr>
+              <w:t xml:space="preserve">Base académica y herramientas adicionales</w:t>
+            </w:r>
+          </w:p>
+        </w:tc>
+        <w:tc>
+          <w:tcPr>
+            <w:tcW w:type="dxa" w:w="4483"/>
+            <w:tcBorders>
+              <w:top w:val="single" w:color="BFBFBF" w:sz="4"/>
+              <w:left w:val="single" w:color="BFBFBF" w:sz="4"/>
+              <w:bottom w:val="single" w:color="BFBFBF" w:sz="4"/>
+              <w:right w:val="single" w:color="BFBFBF" w:sz="4"/>
+            </w:tcBorders>
+            <w:shd w:fill="F2F6FA" w:color="auto" w:val="clear"/>
+            <w:tcMar>
+              <w:top w:type="dxa" w:w="60"/>
+              <w:left w:type="dxa" w:w="100"/>
+              <w:bottom w:type="dxa" w:w="60"/>
+              <w:right w:type="dxa" w:w="100"/>
+            </w:tcMar>
+          </w:tcPr>
+          <w:p>
+            <w:pPr>
+              <w:spacing w:after="0"/>
+            </w:pPr>
+            <w:r>
+              <w:rPr>
+                <w:sz w:val="18"/>
+                <w:szCs w:val="18"/>
+              </w:rPr>
+              <w:t xml:space="preserve">El 16/10/2026 el equipo aclaró que los conceptos se basan en el teórico y que se permiten herramientas adicionales necesarias y útiles, documentando su finalidad, justificación y vínculo con clase en decisiones y etapas. No atribuirlas al material. Los valores propios se proponen y deciden con el equipo. Conserva las aprobaciones previas; no aprueba automáticamente D13. Ver docs/BASE_TEORICA.md.</w:t>
+            </w:r>
+          </w:p>
+        </w:tc>
+      </w:tr>
+      <w:tr>
+        <w:trPr>
+          <w:tblHeader w:val="false"/>
+        </w:trPr>
+        <w:tc>
+          <w:tcPr>
+            <w:tcW w:type="dxa" w:w="747"/>
+            <w:tcBorders>
+              <w:top w:val="single" w:color="BFBFBF" w:sz="4"/>
+              <w:left w:val="single" w:color="BFBFBF" w:sz="4"/>
+              <w:bottom w:val="single" w:color="BFBFBF" w:sz="4"/>
+              <w:right w:val="single" w:color="BFBFBF" w:sz="4"/>
+            </w:tcBorders>
+            <w:shd w:fill="F2F6FA" w:color="auto" w:val="clear"/>
+            <w:tcMar>
+              <w:top w:type="dxa" w:w="60"/>
+              <w:left w:type="dxa" w:w="100"/>
+              <w:bottom w:type="dxa" w:w="60"/>
+              <w:right w:type="dxa" w:w="100"/>
+            </w:tcMar>
+          </w:tcPr>
+          <w:p>
+            <w:pPr>
+              <w:spacing w:after="0"/>
+            </w:pPr>
+            <w:r>
+              <w:rPr>
+                <w:sz w:val="18"/>
+                <w:szCs w:val="18"/>
+              </w:rPr>
+              <w:t xml:space="preserve">D-50</w:t>
+            </w:r>
+          </w:p>
+        </w:tc>
+        <w:tc>
+          <w:tcPr>
+            <w:tcW w:type="dxa" w:w="4408"/>
+            <w:tcBorders>
+              <w:top w:val="single" w:color="BFBFBF" w:sz="4"/>
+              <w:left w:val="single" w:color="BFBFBF" w:sz="4"/>
+              <w:bottom w:val="single" w:color="BFBFBF" w:sz="4"/>
+              <w:right w:val="single" w:color="BFBFBF" w:sz="4"/>
+            </w:tcBorders>
+            <w:shd w:fill="F2F6FA" w:color="auto" w:val="clear"/>
+            <w:tcMar>
+              <w:top w:type="dxa" w:w="60"/>
+              <w:left w:type="dxa" w:w="100"/>
+              <w:bottom w:type="dxa" w:w="60"/>
+              <w:right w:type="dxa" w:w="100"/>
+            </w:tcMar>
+          </w:tcPr>
+          <w:p>
+            <w:pPr>
+              <w:spacing w:after="0"/>
+            </w:pPr>
+            <w:r>
+              <w:rPr>
+                <w:sz w:val="18"/>
+                <w:szCs w:val="18"/>
+              </w:rPr>
+              <w:t xml:space="preserve">Plan inicial de capacidad y costos (D13)</w:t>
+            </w:r>
+          </w:p>
+        </w:tc>
+        <w:tc>
+          <w:tcPr>
+            <w:tcW w:type="dxa" w:w="4483"/>
+            <w:tcBorders>
+              <w:top w:val="single" w:color="BFBFBF" w:sz="4"/>
+              <w:left w:val="single" w:color="BFBFBF" w:sz="4"/>
+              <w:bottom w:val="single" w:color="BFBFBF" w:sz="4"/>
+              <w:right w:val="single" w:color="BFBFBF" w:sz="4"/>
+            </w:tcBorders>
+            <w:shd w:fill="F2F6FA" w:color="auto" w:val="clear"/>
+            <w:tcMar>
+              <w:top w:type="dxa" w:w="60"/>
+              <w:left w:type="dxa" w:w="100"/>
+              <w:bottom w:type="dxa" w:w="60"/>
+              <w:right w:type="dxa" w:w="100"/>
+            </w:tcMar>
+          </w:tcPr>
+          <w:p>
+            <w:pPr>
+              <w:spacing w:after="0"/>
+            </w:pPr>
+            <w:r>
+              <w:rPr>
+                <w:sz w:val="18"/>
+                <w:szCs w:val="18"/>
+              </w:rPr>
+              <w:t xml:space="preserve">Aprobado el 16/10/2026: usar k6 como herramienta adicional justificada para las pruebas de carga del TP, con 100 cuentas y escalones de 1, 5 y 10 usuarios simultáneos. Objetivos iniciales: cero duplicaciones, p95 de lecturas &lt; 200 ms y escrituras &lt; 500 ms. Comparar al menos dos mejoras y estimar costos con fecha y fuentes. Mediciones y cotización pendientes. Se prioriza lo visto en clase y se consulta cada excepción nueva; esta aprobación no amplía el stack en general. Ver ADR-013.</w:t>
+            </w:r>
+          </w:p>
+        </w:tc>
+      </w:tr>
+      <w:tr>
+        <w:trPr>
+          <w:tblHeader w:val="false"/>
+        </w:trPr>
+        <w:tc>
+          <w:tcPr>
+            <w:tcW w:type="dxa" w:w="747"/>
+            <w:tcBorders>
+              <w:top w:val="single" w:color="BFBFBF" w:sz="4"/>
+              <w:left w:val="single" w:color="BFBFBF" w:sz="4"/>
+              <w:bottom w:val="single" w:color="BFBFBF" w:sz="4"/>
+              <w:right w:val="single" w:color="BFBFBF" w:sz="4"/>
+            </w:tcBorders>
+            <w:shd w:fill="F2F6FA" w:color="auto" w:val="clear"/>
+            <w:tcMar>
+              <w:top w:type="dxa" w:w="60"/>
+              <w:left w:type="dxa" w:w="100"/>
+              <w:bottom w:type="dxa" w:w="60"/>
+              <w:right w:type="dxa" w:w="100"/>
+            </w:tcMar>
+          </w:tcPr>
+          <w:p>
+            <w:pPr>
+              <w:spacing w:after="0"/>
+            </w:pPr>
+            <w:r>
+              <w:rPr>
+                <w:sz w:val="18"/>
+                <w:szCs w:val="18"/>
+              </w:rPr>
+              <w:t xml:space="preserve">D-51</w:t>
+            </w:r>
+          </w:p>
+        </w:tc>
+        <w:tc>
+          <w:tcPr>
+            <w:tcW w:type="dxa" w:w="4408"/>
+            <w:tcBorders>
+              <w:top w:val="single" w:color="BFBFBF" w:sz="4"/>
+              <w:left w:val="single" w:color="BFBFBF" w:sz="4"/>
+              <w:bottom w:val="single" w:color="BFBFBF" w:sz="4"/>
+              <w:right w:val="single" w:color="BFBFBF" w:sz="4"/>
+            </w:tcBorders>
+            <w:shd w:fill="F2F6FA" w:color="auto" w:val="clear"/>
+            <w:tcMar>
+              <w:top w:type="dxa" w:w="60"/>
+              <w:left w:type="dxa" w:w="100"/>
+              <w:bottom w:type="dxa" w:w="60"/>
+              <w:right w:type="dxa" w:w="100"/>
+            </w:tcMar>
+          </w:tcPr>
+          <w:p>
+            <w:pPr>
+              <w:spacing w:after="0"/>
+            </w:pPr>
+            <w:r>
+              <w:rPr>
+                <w:sz w:val="18"/>
+                <w:szCs w:val="18"/>
+              </w:rPr>
+              <w:t xml:space="preserve">Estabilidad de health checks de Booking (D12)</w:t>
+            </w:r>
+          </w:p>
+        </w:tc>
+        <w:tc>
+          <w:tcPr>
+            <w:tcW w:type="dxa" w:w="4483"/>
+            <w:tcBorders>
+              <w:top w:val="single" w:color="BFBFBF" w:sz="4"/>
+              <w:left w:val="single" w:color="BFBFBF" w:sz="4"/>
+              <w:bottom w:val="single" w:color="BFBFBF" w:sz="4"/>
+              <w:right w:val="single" w:color="BFBFBF" w:sz="4"/>
+            </w:tcBorders>
+            <w:shd w:fill="F2F6FA" w:color="auto" w:val="clear"/>
+            <w:tcMar>
+              <w:top w:type="dxa" w:w="60"/>
+              <w:left w:type="dxa" w:w="100"/>
+              <w:bottom w:type="dxa" w:w="60"/>
+              <w:right w:type="dxa" w:w="100"/>
+            </w:tcMar>
+          </w:tcPr>
+          <w:p>
+            <w:pPr>
+              <w:spacing w:after="0"/>
+            </w:pPr>
+            <w:r>
+              <w:rPr>
+                <w:sz w:val="18"/>
+                <w:szCs w:val="18"/>
+              </w:rPr>
+              <w:t xml:space="preserve">Aprobado el 16/10/2026: retirar tras 3 fallos consecutivos y reincorporar tras 2 éxitos consecutivos; conservar checks cada 5 s y timeout 2 s. Complementa D-46. Motivo: evitar entradas/salidas repetidas por demoras pasajeras (flapping), según Teórico EN PDF.pdf, p. 87. El teórico recomienda verificaciones consecutivas; los valores 3/2 son propios del proyecto. Costo: mayor demora para detectar caída y recuperación. Ver ADR-012 v2, que reemplaza ADR-012. Soporte de herramienta, implementación y pruebas pendientes.</w:t>
+            </w:r>
+          </w:p>
+        </w:tc>
+      </w:tr>
+      <w:tr>
+        <w:trPr>
+          <w:tblHeader w:val="false"/>
+        </w:trPr>
+        <w:tc>
+          <w:tcPr>
+            <w:tcW w:type="dxa" w:w="747"/>
+            <w:tcBorders>
+              <w:top w:val="single" w:color="BFBFBF" w:sz="4"/>
+              <w:left w:val="single" w:color="BFBFBF" w:sz="4"/>
+              <w:bottom w:val="single" w:color="BFBFBF" w:sz="4"/>
+              <w:right w:val="single" w:color="BFBFBF" w:sz="4"/>
+            </w:tcBorders>
+            <w:shd w:fill="F2F6FA" w:color="auto" w:val="clear"/>
+            <w:tcMar>
+              <w:top w:type="dxa" w:w="60"/>
+              <w:left w:type="dxa" w:w="100"/>
+              <w:bottom w:type="dxa" w:w="60"/>
+              <w:right w:type="dxa" w:w="100"/>
+            </w:tcMar>
+          </w:tcPr>
+          <w:p>
+            <w:pPr>
+              <w:spacing w:after="0"/>
+            </w:pPr>
+            <w:r>
+              <w:rPr>
+                <w:sz w:val="18"/>
+                <w:szCs w:val="18"/>
+              </w:rPr>
+              <w:t xml:space="preserve">D-52</w:t>
+            </w:r>
+          </w:p>
+        </w:tc>
+        <w:tc>
+          <w:tcPr>
+            <w:tcW w:type="dxa" w:w="4408"/>
+            <w:tcBorders>
+              <w:top w:val="single" w:color="BFBFBF" w:sz="4"/>
+              <w:left w:val="single" w:color="BFBFBF" w:sz="4"/>
+              <w:bottom w:val="single" w:color="BFBFBF" w:sz="4"/>
+              <w:right w:val="single" w:color="BFBFBF" w:sz="4"/>
+            </w:tcBorders>
+            <w:shd w:fill="F2F6FA" w:color="auto" w:val="clear"/>
+            <w:tcMar>
+              <w:top w:type="dxa" w:w="60"/>
+              <w:left w:type="dxa" w:w="100"/>
+              <w:bottom w:type="dxa" w:w="60"/>
+              <w:right w:type="dxa" w:w="100"/>
+            </w:tcMar>
+          </w:tcPr>
+          <w:p>
+            <w:pPr>
+              <w:spacing w:after="0"/>
+            </w:pPr>
+            <w:r>
+              <w:rPr>
+                <w:sz w:val="18"/>
+                <w:szCs w:val="18"/>
+              </w:rPr>
+              <w:t xml:space="preserve">Aclaración del saldo ante reversiones</w:t>
+            </w:r>
+          </w:p>
+        </w:tc>
+        <w:tc>
+          <w:tcPr>
+            <w:tcW w:type="dxa" w:w="4483"/>
+            <w:tcBorders>
+              <w:top w:val="single" w:color="BFBFBF" w:sz="4"/>
+              <w:left w:val="single" w:color="BFBFBF" w:sz="4"/>
+              <w:bottom w:val="single" w:color="BFBFBF" w:sz="4"/>
+              <w:right w:val="single" w:color="BFBFBF" w:sz="4"/>
+            </w:tcBorders>
+            <w:shd w:fill="F2F6FA" w:color="auto" w:val="clear"/>
+            <w:tcMar>
+              <w:top w:type="dxa" w:w="60"/>
+              <w:left w:type="dxa" w:w="100"/>
+              <w:bottom w:type="dxa" w:w="60"/>
+              <w:right w:type="dxa" w:w="100"/>
+            </w:tcMar>
+          </w:tcPr>
+          <w:p>
+            <w:pPr>
+              <w:spacing w:after="0"/>
+            </w:pPr>
+            <w:r>
+              <w:rPr>
+                <w:sz w:val="18"/>
+                <w:szCs w:val="18"/>
+              </w:rPr>
+              <w:t xml:space="preserve">Aprobado el 16/10/2026: alinear el glosario con RN-22, CA-11.1 y CA-19.2. Sumar todos los importes aplicados, incluido el original REVERTIDO y su compensatorio: +100 y −100 dejan saldo 0. REVERTIDO impide otra reversión; no borra el aporte histórico. Motivo: excluir el original produciría un saldo incorrecto. Fundamento de clase: transacciones locales/invariantes, pp. 27–28, y agregado como límite de consistencia, p. 120; la fórmula viene del SPEC. ADR-004 v2 reemplaza al original. SPEC v0.10 preparado localmente, pendiente de revisión de otro integrante según CONTRIBUTING.</w:t>
+            </w:r>
+          </w:p>
+        </w:tc>
+      </w:tr>
     </w:tbl>
     <w:p>
       <w:pPr>
@@ -4750,12 +5795,1498 @@
           </w:p>
         </w:tc>
       </w:tr>
+      <w:tr>
+        <w:trPr>
+          <w:tblHeader w:val="false"/>
+        </w:trPr>
+        <w:tc>
+          <w:tcPr>
+            <w:tcW w:type="dxa" w:w="2029"/>
+            <w:tcBorders>
+              <w:top w:val="single" w:color="BFBFBF" w:sz="4"/>
+              <w:left w:val="single" w:color="BFBFBF" w:sz="4"/>
+              <w:bottom w:val="single" w:color="BFBFBF" w:sz="4"/>
+              <w:right w:val="single" w:color="BFBFBF" w:sz="4"/>
+            </w:tcBorders>
+            <w:tcMar>
+              <w:top w:type="dxa" w:w="60"/>
+              <w:left w:type="dxa" w:w="100"/>
+              <w:bottom w:type="dxa" w:w="60"/>
+              <w:right w:type="dxa" w:w="100"/>
+            </w:tcMar>
+          </w:tcPr>
+          <w:p>
+            <w:pPr>
+              <w:spacing w:after="0"/>
+            </w:pPr>
+            <w:r>
+              <w:rPr>
+                <w:sz w:val="18"/>
+                <w:szCs w:val="18"/>
+              </w:rPr>
+              <w:t xml:space="preserve">16/10/2026</w:t>
+            </w:r>
+          </w:p>
+        </w:tc>
+        <w:tc>
+          <w:tcPr>
+            <w:tcW w:type="dxa" w:w="7609"/>
+            <w:tcBorders>
+              <w:top w:val="single" w:color="BFBFBF" w:sz="4"/>
+              <w:left w:val="single" w:color="BFBFBF" w:sz="4"/>
+              <w:bottom w:val="single" w:color="BFBFBF" w:sz="4"/>
+              <w:right w:val="single" w:color="BFBFBF" w:sz="4"/>
+            </w:tcBorders>
+            <w:tcMar>
+              <w:top w:type="dxa" w:w="60"/>
+              <w:left w:type="dxa" w:w="100"/>
+              <w:bottom w:type="dxa" w:w="60"/>
+              <w:right w:type="dxa" w:w="100"/>
+            </w:tcMar>
+          </w:tcPr>
+          <w:p>
+            <w:pPr>
+              <w:spacing w:after="0"/>
+            </w:pPr>
+            <w:r>
+              <w:rPr>
+                <w:sz w:val="18"/>
+                <w:szCs w:val="18"/>
+              </w:rPr>
+              <w:t xml:space="preserve">Se agrega D-42: la c?tedra confirm? que Benefits alcanza para el requisito de servicio operativo y capacidad compartida de la Entrega 2.</w:t>
+            </w:r>
+          </w:p>
+        </w:tc>
+      </w:tr>
+      <w:tr>
+        <w:trPr>
+          <w:tblHeader w:val="false"/>
+        </w:trPr>
+        <w:tc>
+          <w:tcPr>
+            <w:tcW w:type="dxa" w:w="2029"/>
+            <w:tcBorders>
+              <w:top w:val="single" w:color="BFBFBF" w:sz="4"/>
+              <w:left w:val="single" w:color="BFBFBF" w:sz="4"/>
+              <w:bottom w:val="single" w:color="BFBFBF" w:sz="4"/>
+              <w:right w:val="single" w:color="BFBFBF" w:sz="4"/>
+            </w:tcBorders>
+            <w:tcMar>
+              <w:top w:type="dxa" w:w="60"/>
+              <w:left w:type="dxa" w:w="100"/>
+              <w:bottom w:type="dxa" w:w="60"/>
+              <w:right w:type="dxa" w:w="100"/>
+            </w:tcMar>
+          </w:tcPr>
+          <w:p>
+            <w:pPr>
+              <w:spacing w:after="0"/>
+            </w:pPr>
+            <w:r>
+              <w:rPr>
+                <w:sz w:val="18"/>
+                <w:szCs w:val="18"/>
+              </w:rPr>
+              <w:t xml:space="preserve">16/10/2026</w:t>
+            </w:r>
+          </w:p>
+        </w:tc>
+        <w:tc>
+          <w:tcPr>
+            <w:tcW w:type="dxa" w:w="7609"/>
+            <w:tcBorders>
+              <w:top w:val="single" w:color="BFBFBF" w:sz="4"/>
+              <w:left w:val="single" w:color="BFBFBF" w:sz="4"/>
+              <w:bottom w:val="single" w:color="BFBFBF" w:sz="4"/>
+              <w:right w:val="single" w:color="BFBFBF" w:sz="4"/>
+            </w:tcBorders>
+            <w:tcMar>
+              <w:top w:type="dxa" w:w="60"/>
+              <w:left w:type="dxa" w:w="100"/>
+              <w:bottom w:type="dxa" w:w="60"/>
+              <w:right w:type="dxa" w:w="100"/>
+            </w:tcMar>
+          </w:tcPr>
+          <w:p>
+            <w:pPr>
+              <w:spacing w:after="0"/>
+            </w:pPr>
+            <w:r>
+              <w:rPr>
+                <w:sz w:val="18"/>
+                <w:szCs w:val="18"/>
+              </w:rPr>
+              <w:t xml:space="preserve">Se agregan D-43 y D-44: límite inicial de 4 s en Benefits y contrato 1.1.0 con errores 502/504 aprobados.</w:t>
+            </w:r>
+          </w:p>
+        </w:tc>
+      </w:tr>
+      <w:tr>
+        <w:trPr>
+          <w:tblHeader w:val="false"/>
+        </w:trPr>
+        <w:tc>
+          <w:tcPr>
+            <w:tcW w:type="dxa" w:w="2029"/>
+            <w:tcBorders>
+              <w:top w:val="single" w:color="BFBFBF" w:sz="4"/>
+              <w:left w:val="single" w:color="BFBFBF" w:sz="4"/>
+              <w:bottom w:val="single" w:color="BFBFBF" w:sz="4"/>
+              <w:right w:val="single" w:color="BFBFBF" w:sz="4"/>
+            </w:tcBorders>
+            <w:tcMar>
+              <w:top w:type="dxa" w:w="60"/>
+              <w:left w:type="dxa" w:w="100"/>
+              <w:bottom w:type="dxa" w:w="60"/>
+              <w:right w:type="dxa" w:w="100"/>
+            </w:tcMar>
+          </w:tcPr>
+          <w:p>
+            <w:pPr>
+              <w:spacing w:after="0"/>
+            </w:pPr>
+            <w:r>
+              <w:rPr>
+                <w:sz w:val="18"/>
+                <w:szCs w:val="18"/>
+              </w:rPr>
+              <w:t xml:space="preserve">16/10/2026</w:t>
+            </w:r>
+          </w:p>
+        </w:tc>
+        <w:tc>
+          <w:tcPr>
+            <w:tcW w:type="dxa" w:w="7609"/>
+            <w:tcBorders>
+              <w:top w:val="single" w:color="BFBFBF" w:sz="4"/>
+              <w:left w:val="single" w:color="BFBFBF" w:sz="4"/>
+              <w:bottom w:val="single" w:color="BFBFBF" w:sz="4"/>
+              <w:right w:val="single" w:color="BFBFBF" w:sz="4"/>
+            </w:tcBorders>
+            <w:tcMar>
+              <w:top w:type="dxa" w:w="60"/>
+              <w:left w:type="dxa" w:w="100"/>
+              <w:bottom w:type="dxa" w:w="60"/>
+              <w:right w:type="dxa" w:w="100"/>
+            </w:tcMar>
+          </w:tcPr>
+          <w:p>
+            <w:pPr>
+              <w:spacing w:after="0"/>
+            </w:pPr>
+            <w:r>
+              <w:rPr>
+                <w:sz w:val="18"/>
+                <w:szCs w:val="18"/>
+              </w:rPr>
+              <w:t xml:space="preserve">Se agrega D-45: diseño inicial de búsqueda de clases aprobado (D6 / ADR-014).</w:t>
+            </w:r>
+          </w:p>
+        </w:tc>
+      </w:tr>
+      <w:tr>
+        <w:trPr>
+          <w:tblHeader w:val="false"/>
+        </w:trPr>
+        <w:tc>
+          <w:tcPr>
+            <w:tcW w:type="dxa" w:w="2029"/>
+            <w:tcBorders>
+              <w:top w:val="single" w:color="BFBFBF" w:sz="4"/>
+              <w:left w:val="single" w:color="BFBFBF" w:sz="4"/>
+              <w:bottom w:val="single" w:color="BFBFBF" w:sz="4"/>
+              <w:right w:val="single" w:color="BFBFBF" w:sz="4"/>
+            </w:tcBorders>
+            <w:tcMar>
+              <w:top w:type="dxa" w:w="60"/>
+              <w:left w:type="dxa" w:w="100"/>
+              <w:bottom w:type="dxa" w:w="60"/>
+              <w:right w:type="dxa" w:w="100"/>
+            </w:tcMar>
+          </w:tcPr>
+          <w:p>
+            <w:pPr>
+              <w:spacing w:after="0"/>
+            </w:pPr>
+            <w:r>
+              <w:rPr>
+                <w:sz w:val="18"/>
+                <w:szCs w:val="18"/>
+              </w:rPr>
+              <w:t xml:space="preserve">16/10/2026</w:t>
+            </w:r>
+          </w:p>
+        </w:tc>
+        <w:tc>
+          <w:tcPr>
+            <w:tcW w:type="dxa" w:w="7609"/>
+            <w:tcBorders>
+              <w:top w:val="single" w:color="BFBFBF" w:sz="4"/>
+              <w:left w:val="single" w:color="BFBFBF" w:sz="4"/>
+              <w:bottom w:val="single" w:color="BFBFBF" w:sz="4"/>
+              <w:right w:val="single" w:color="BFBFBF" w:sz="4"/>
+            </w:tcBorders>
+            <w:tcMar>
+              <w:top w:type="dxa" w:w="60"/>
+              <w:left w:type="dxa" w:w="100"/>
+              <w:bottom w:type="dxa" w:w="60"/>
+              <w:right w:type="dxa" w:w="100"/>
+            </w:tcMar>
+          </w:tcPr>
+          <w:p>
+            <w:pPr>
+              <w:spacing w:after="0"/>
+            </w:pPr>
+            <w:r>
+              <w:rPr>
+                <w:sz w:val="18"/>
+                <w:szCs w:val="18"/>
+              </w:rPr>
+              <w:t xml:space="preserve">Se agrega D-46: diseño inicial de balanceo de Booking aprobado (D12 / ADR-012).</w:t>
+            </w:r>
+          </w:p>
+        </w:tc>
+      </w:tr>
+      <w:tr>
+        <w:trPr>
+          <w:tblHeader w:val="false"/>
+        </w:trPr>
+        <w:tc>
+          <w:tcPr>
+            <w:tcW w:type="dxa" w:w="2029"/>
+            <w:tcBorders>
+              <w:top w:val="single" w:color="BFBFBF" w:sz="4"/>
+              <w:left w:val="single" w:color="BFBFBF" w:sz="4"/>
+              <w:bottom w:val="single" w:color="BFBFBF" w:sz="4"/>
+              <w:right w:val="single" w:color="BFBFBF" w:sz="4"/>
+            </w:tcBorders>
+            <w:tcMar>
+              <w:top w:type="dxa" w:w="60"/>
+              <w:left w:type="dxa" w:w="100"/>
+              <w:bottom w:type="dxa" w:w="60"/>
+              <w:right w:type="dxa" w:w="100"/>
+            </w:tcMar>
+          </w:tcPr>
+          <w:p>
+            <w:pPr>
+              <w:spacing w:after="0"/>
+            </w:pPr>
+            <w:r>
+              <w:rPr>
+                <w:sz w:val="18"/>
+                <w:szCs w:val="18"/>
+              </w:rPr>
+              <w:t xml:space="preserve">16/10/2026</w:t>
+            </w:r>
+          </w:p>
+        </w:tc>
+        <w:tc>
+          <w:tcPr>
+            <w:tcW w:type="dxa" w:w="7609"/>
+            <w:tcBorders>
+              <w:top w:val="single" w:color="BFBFBF" w:sz="4"/>
+              <w:left w:val="single" w:color="BFBFBF" w:sz="4"/>
+              <w:bottom w:val="single" w:color="BFBFBF" w:sz="4"/>
+              <w:right w:val="single" w:color="BFBFBF" w:sz="4"/>
+            </w:tcBorders>
+            <w:tcMar>
+              <w:top w:type="dxa" w:w="60"/>
+              <w:left w:type="dxa" w:w="100"/>
+              <w:bottom w:type="dxa" w:w="60"/>
+              <w:right w:type="dxa" w:w="100"/>
+            </w:tcMar>
+          </w:tcPr>
+          <w:p>
+            <w:pPr>
+              <w:spacing w:after="0"/>
+            </w:pPr>
+            <w:r>
+              <w:rPr>
+                <w:sz w:val="18"/>
+                <w:szCs w:val="18"/>
+              </w:rPr>
+              <w:t xml:space="preserve">Se agrega D-47: diseño inicial de resiliencia de Benefits aprobado (D10 / ADR-010).</w:t>
+            </w:r>
+          </w:p>
+        </w:tc>
+      </w:tr>
+      <w:tr>
+        <w:trPr>
+          <w:tblHeader w:val="false"/>
+        </w:trPr>
+        <w:tc>
+          <w:tcPr>
+            <w:tcW w:type="dxa" w:w="2029"/>
+            <w:tcBorders>
+              <w:top w:val="single" w:color="BFBFBF" w:sz="4"/>
+              <w:left w:val="single" w:color="BFBFBF" w:sz="4"/>
+              <w:bottom w:val="single" w:color="BFBFBF" w:sz="4"/>
+              <w:right w:val="single" w:color="BFBFBF" w:sz="4"/>
+            </w:tcBorders>
+            <w:tcMar>
+              <w:top w:type="dxa" w:w="60"/>
+              <w:left w:type="dxa" w:w="100"/>
+              <w:bottom w:type="dxa" w:w="60"/>
+              <w:right w:type="dxa" w:w="100"/>
+            </w:tcMar>
+          </w:tcPr>
+          <w:p>
+            <w:pPr>
+              <w:spacing w:after="0"/>
+            </w:pPr>
+            <w:r>
+              <w:rPr>
+                <w:sz w:val="18"/>
+                <w:szCs w:val="18"/>
+              </w:rPr>
+              <w:t xml:space="preserve">16/10/2026</w:t>
+            </w:r>
+          </w:p>
+        </w:tc>
+        <w:tc>
+          <w:tcPr>
+            <w:tcW w:type="dxa" w:w="7609"/>
+            <w:tcBorders>
+              <w:top w:val="single" w:color="BFBFBF" w:sz="4"/>
+              <w:left w:val="single" w:color="BFBFBF" w:sz="4"/>
+              <w:bottom w:val="single" w:color="BFBFBF" w:sz="4"/>
+              <w:right w:val="single" w:color="BFBFBF" w:sz="4"/>
+            </w:tcBorders>
+            <w:tcMar>
+              <w:top w:type="dxa" w:w="60"/>
+              <w:left w:type="dxa" w:w="100"/>
+              <w:bottom w:type="dxa" w:w="60"/>
+              <w:right w:type="dxa" w:w="100"/>
+            </w:tcMar>
+          </w:tcPr>
+          <w:p>
+            <w:pPr>
+              <w:spacing w:after="0"/>
+            </w:pPr>
+            <w:r>
+              <w:rPr>
+                <w:sz w:val="18"/>
+                <w:szCs w:val="18"/>
+              </w:rPr>
+              <w:t xml:space="preserve">Se agrega D-48: diseño inicial de observabilidad aprobado (D11 / ADR-011).</w:t>
+            </w:r>
+          </w:p>
+        </w:tc>
+      </w:tr>
+      <w:tr>
+        <w:trPr>
+          <w:tblHeader w:val="false"/>
+        </w:trPr>
+        <w:tc>
+          <w:tcPr>
+            <w:tcW w:type="dxa" w:w="2029"/>
+            <w:tcBorders>
+              <w:top w:val="single" w:color="BFBFBF" w:sz="4"/>
+              <w:left w:val="single" w:color="BFBFBF" w:sz="4"/>
+              <w:bottom w:val="single" w:color="BFBFBF" w:sz="4"/>
+              <w:right w:val="single" w:color="BFBFBF" w:sz="4"/>
+            </w:tcBorders>
+            <w:tcMar>
+              <w:top w:type="dxa" w:w="60"/>
+              <w:left w:type="dxa" w:w="100"/>
+              <w:bottom w:type="dxa" w:w="60"/>
+              <w:right w:type="dxa" w:w="100"/>
+            </w:tcMar>
+          </w:tcPr>
+          <w:p>
+            <w:pPr>
+              <w:spacing w:after="0"/>
+            </w:pPr>
+            <w:r>
+              <w:rPr>
+                <w:sz w:val="18"/>
+                <w:szCs w:val="18"/>
+              </w:rPr>
+              <w:t xml:space="preserve">16/10/2026</w:t>
+            </w:r>
+          </w:p>
+        </w:tc>
+        <w:tc>
+          <w:tcPr>
+            <w:tcW w:type="dxa" w:w="7609"/>
+            <w:tcBorders>
+              <w:top w:val="single" w:color="BFBFBF" w:sz="4"/>
+              <w:left w:val="single" w:color="BFBFBF" w:sz="4"/>
+              <w:bottom w:val="single" w:color="BFBFBF" w:sz="4"/>
+              <w:right w:val="single" w:color="BFBFBF" w:sz="4"/>
+            </w:tcBorders>
+            <w:tcMar>
+              <w:top w:type="dxa" w:w="60"/>
+              <w:left w:type="dxa" w:w="100"/>
+              <w:bottom w:type="dxa" w:w="60"/>
+              <w:right w:type="dxa" w:w="100"/>
+            </w:tcMar>
+          </w:tcPr>
+          <w:p>
+            <w:pPr>
+              <w:spacing w:after="0"/>
+            </w:pPr>
+            <w:r>
+              <w:rPr>
+                <w:sz w:val="18"/>
+                <w:szCs w:val="18"/>
+              </w:rPr>
+              <w:t xml:space="preserve">Se agrega D-49: criterio académico aclarado; herramientas adicionales permitidas con justificación explícita.</w:t>
+            </w:r>
+          </w:p>
+        </w:tc>
+      </w:tr>
+      <w:tr>
+        <w:trPr>
+          <w:tblHeader w:val="false"/>
+        </w:trPr>
+        <w:tc>
+          <w:tcPr>
+            <w:tcW w:type="dxa" w:w="2029"/>
+            <w:tcBorders>
+              <w:top w:val="single" w:color="BFBFBF" w:sz="4"/>
+              <w:left w:val="single" w:color="BFBFBF" w:sz="4"/>
+              <w:bottom w:val="single" w:color="BFBFBF" w:sz="4"/>
+              <w:right w:val="single" w:color="BFBFBF" w:sz="4"/>
+            </w:tcBorders>
+            <w:tcMar>
+              <w:top w:type="dxa" w:w="60"/>
+              <w:left w:type="dxa" w:w="100"/>
+              <w:bottom w:type="dxa" w:w="60"/>
+              <w:right w:type="dxa" w:w="100"/>
+            </w:tcMar>
+          </w:tcPr>
+          <w:p>
+            <w:pPr>
+              <w:spacing w:after="0"/>
+            </w:pPr>
+            <w:r>
+              <w:rPr>
+                <w:sz w:val="18"/>
+                <w:szCs w:val="18"/>
+              </w:rPr>
+              <w:t xml:space="preserve">16/10/2026</w:t>
+            </w:r>
+          </w:p>
+        </w:tc>
+        <w:tc>
+          <w:tcPr>
+            <w:tcW w:type="dxa" w:w="7609"/>
+            <w:tcBorders>
+              <w:top w:val="single" w:color="BFBFBF" w:sz="4"/>
+              <w:left w:val="single" w:color="BFBFBF" w:sz="4"/>
+              <w:bottom w:val="single" w:color="BFBFBF" w:sz="4"/>
+              <w:right w:val="single" w:color="BFBFBF" w:sz="4"/>
+            </w:tcBorders>
+            <w:tcMar>
+              <w:top w:type="dxa" w:w="60"/>
+              <w:left w:type="dxa" w:w="100"/>
+              <w:bottom w:type="dxa" w:w="60"/>
+              <w:right w:type="dxa" w:w="100"/>
+            </w:tcMar>
+          </w:tcPr>
+          <w:p>
+            <w:pPr>
+              <w:spacing w:after="0"/>
+            </w:pPr>
+            <w:r>
+              <w:rPr>
+                <w:sz w:val="18"/>
+                <w:szCs w:val="18"/>
+              </w:rPr>
+              <w:t xml:space="preserve">Se agrega D-50: plan inicial D13 aprobado; se precisa la prioridad del material de clase y la aprobación individual de excepciones.</w:t>
+            </w:r>
+          </w:p>
+        </w:tc>
+      </w:tr>
+      <w:tr>
+        <w:trPr>
+          <w:tblHeader w:val="false"/>
+        </w:trPr>
+        <w:tc>
+          <w:tcPr>
+            <w:tcW w:type="dxa" w:w="2029"/>
+            <w:tcBorders>
+              <w:top w:val="single" w:color="BFBFBF" w:sz="4"/>
+              <w:left w:val="single" w:color="BFBFBF" w:sz="4"/>
+              <w:bottom w:val="single" w:color="BFBFBF" w:sz="4"/>
+              <w:right w:val="single" w:color="BFBFBF" w:sz="4"/>
+            </w:tcBorders>
+            <w:tcMar>
+              <w:top w:type="dxa" w:w="60"/>
+              <w:left w:type="dxa" w:w="100"/>
+              <w:bottom w:type="dxa" w:w="60"/>
+              <w:right w:type="dxa" w:w="100"/>
+            </w:tcMar>
+          </w:tcPr>
+          <w:p>
+            <w:pPr>
+              <w:spacing w:after="0"/>
+            </w:pPr>
+            <w:r>
+              <w:rPr>
+                <w:sz w:val="18"/>
+                <w:szCs w:val="18"/>
+              </w:rPr>
+              <w:t xml:space="preserve">16/10/2026</w:t>
+            </w:r>
+          </w:p>
+        </w:tc>
+        <w:tc>
+          <w:tcPr>
+            <w:tcW w:type="dxa" w:w="7609"/>
+            <w:tcBorders>
+              <w:top w:val="single" w:color="BFBFBF" w:sz="4"/>
+              <w:left w:val="single" w:color="BFBFBF" w:sz="4"/>
+              <w:bottom w:val="single" w:color="BFBFBF" w:sz="4"/>
+              <w:right w:val="single" w:color="BFBFBF" w:sz="4"/>
+            </w:tcBorders>
+            <w:tcMar>
+              <w:top w:type="dxa" w:w="60"/>
+              <w:left w:type="dxa" w:w="100"/>
+              <w:bottom w:type="dxa" w:w="60"/>
+              <w:right w:type="dxa" w:w="100"/>
+            </w:tcMar>
+          </w:tcPr>
+          <w:p>
+            <w:pPr>
+              <w:spacing w:after="0"/>
+            </w:pPr>
+            <w:r>
+              <w:rPr>
+                <w:sz w:val="18"/>
+                <w:szCs w:val="18"/>
+              </w:rPr>
+              <w:t xml:space="preserve">Se agrega D-51 y se registra fundamento teórico y motivo de las decisiones de la Entrega 2; ADR-012 v2 conserva la historia del balanceo.</w:t>
+            </w:r>
+          </w:p>
+        </w:tc>
+      </w:tr>
+      <w:tr>
+        <w:trPr>
+          <w:tblHeader w:val="false"/>
+        </w:trPr>
+        <w:tc>
+          <w:tcPr>
+            <w:tcW w:type="dxa" w:w="2029"/>
+            <w:tcBorders>
+              <w:top w:val="single" w:color="BFBFBF" w:sz="4"/>
+              <w:left w:val="single" w:color="BFBFBF" w:sz="4"/>
+              <w:bottom w:val="single" w:color="BFBFBF" w:sz="4"/>
+              <w:right w:val="single" w:color="BFBFBF" w:sz="4"/>
+            </w:tcBorders>
+            <w:tcMar>
+              <w:top w:type="dxa" w:w="60"/>
+              <w:left w:type="dxa" w:w="100"/>
+              <w:bottom w:type="dxa" w:w="60"/>
+              <w:right w:type="dxa" w:w="100"/>
+            </w:tcMar>
+          </w:tcPr>
+          <w:p>
+            <w:pPr>
+              <w:spacing w:after="0"/>
+            </w:pPr>
+            <w:r>
+              <w:rPr>
+                <w:sz w:val="18"/>
+                <w:szCs w:val="18"/>
+              </w:rPr>
+              <w:t xml:space="preserve">16/10/2026</w:t>
+            </w:r>
+          </w:p>
+        </w:tc>
+        <w:tc>
+          <w:tcPr>
+            <w:tcW w:type="dxa" w:w="7609"/>
+            <w:tcBorders>
+              <w:top w:val="single" w:color="BFBFBF" w:sz="4"/>
+              <w:left w:val="single" w:color="BFBFBF" w:sz="4"/>
+              <w:bottom w:val="single" w:color="BFBFBF" w:sz="4"/>
+              <w:right w:val="single" w:color="BFBFBF" w:sz="4"/>
+            </w:tcBorders>
+            <w:tcMar>
+              <w:top w:type="dxa" w:w="60"/>
+              <w:left w:type="dxa" w:w="100"/>
+              <w:bottom w:type="dxa" w:w="60"/>
+              <w:right w:type="dxa" w:w="100"/>
+            </w:tcMar>
+          </w:tcPr>
+          <w:p>
+            <w:pPr>
+              <w:spacing w:after="0"/>
+            </w:pPr>
+            <w:r>
+              <w:rPr>
+                <w:sz w:val="18"/>
+                <w:szCs w:val="18"/>
+              </w:rPr>
+              <w:t xml:space="preserve">Se agrega D-52: saldo alineado con RN-22; SPEC v0.10 y ADR-004 v2 preparados, con revisión de PR pendiente.</w:t>
+            </w:r>
+          </w:p>
+        </w:tc>
+      </w:tr>
     </w:tbl>
     <w:p>
       <w:pPr>
         <w:spacing w:after="120"/>
       </w:pPr>
     </w:p>
+    <w:p>
+      <w:r>
+        <w:t>Justificación teórica de las decisiones de la Entrega 2 (páginas del PDF aportado)</w:t>
+      </w:r>
+    </w:p>
+    <w:tbl>
+      <w:tblPr>
+        <w:tblW w:type="dxa" w:w="9638"/>
+        <w:tblBorders>
+          <w:top w:val="single" w:color="auto" w:sz="4"/>
+          <w:left w:val="single" w:color="auto" w:sz="4"/>
+          <w:bottom w:val="single" w:color="auto" w:sz="4"/>
+          <w:right w:val="single" w:color="auto" w:sz="4"/>
+          <w:insideH w:val="single" w:color="auto" w:sz="4"/>
+          <w:insideV w:val="single" w:color="auto" w:sz="4"/>
+        </w:tblBorders>
+        <w:tblLayout w:type="fixed"/>
+      </w:tblPr>
+      <w:tblGrid>
+        <w:gridCol w:w="747"/>
+        <w:gridCol w:w="4408"/>
+        <w:gridCol w:w="4483"/>
+      </w:tblGrid>
+      <w:tr>
+        <w:trPr>
+          <w:tblHeader/>
+        </w:trPr>
+        <w:tc>
+          <w:tcPr>
+            <w:tcW w:type="dxa" w:w="747"/>
+            <w:tcBorders>
+              <w:top w:val="single" w:color="BFBFBF" w:sz="4"/>
+              <w:left w:val="single" w:color="BFBFBF" w:sz="4"/>
+              <w:bottom w:val="single" w:color="BFBFBF" w:sz="4"/>
+              <w:right w:val="single" w:color="BFBFBF" w:sz="4"/>
+            </w:tcBorders>
+            <w:shd w:fill="1F4E79" w:color="auto" w:val="clear"/>
+            <w:tcMar>
+              <w:top w:type="dxa" w:w="60"/>
+              <w:left w:type="dxa" w:w="100"/>
+              <w:bottom w:type="dxa" w:w="60"/>
+              <w:right w:type="dxa" w:w="100"/>
+            </w:tcMar>
+          </w:tcPr>
+          <w:p>
+            <w:pPr>
+              <w:spacing w:after="0"/>
+            </w:pPr>
+            <w:r>
+              <w:rPr>
+                <w:b/>
+                <w:bCs/>
+                <w:color w:val="FFFFFF"/>
+                <w:sz w:val="18"/>
+                <w:szCs w:val="18"/>
+              </w:rPr>
+              <w:t xml:space="preserve">Decisión</w:t>
+            </w:r>
+          </w:p>
+        </w:tc>
+        <w:tc>
+          <w:tcPr>
+            <w:tcW w:type="dxa" w:w="4408"/>
+            <w:tcBorders>
+              <w:top w:val="single" w:color="BFBFBF" w:sz="4"/>
+              <w:left w:val="single" w:color="BFBFBF" w:sz="4"/>
+              <w:bottom w:val="single" w:color="BFBFBF" w:sz="4"/>
+              <w:right w:val="single" w:color="BFBFBF" w:sz="4"/>
+            </w:tcBorders>
+            <w:shd w:fill="1F4E79" w:color="auto" w:val="clear"/>
+            <w:tcMar>
+              <w:top w:type="dxa" w:w="60"/>
+              <w:left w:type="dxa" w:w="100"/>
+              <w:bottom w:type="dxa" w:w="60"/>
+              <w:right w:type="dxa" w:w="100"/>
+            </w:tcMar>
+          </w:tcPr>
+          <w:p>
+            <w:pPr>
+              <w:spacing w:after="0"/>
+            </w:pPr>
+            <w:r>
+              <w:rPr>
+                <w:b/>
+                <w:bCs/>
+                <w:color w:val="FFFFFF"/>
+                <w:sz w:val="18"/>
+                <w:szCs w:val="18"/>
+              </w:rPr>
+              <w:t xml:space="preserve">Fundamento</w:t>
+            </w:r>
+          </w:p>
+        </w:tc>
+        <w:tc>
+          <w:tcPr>
+            <w:tcW w:type="dxa" w:w="4483"/>
+            <w:tcBorders>
+              <w:top w:val="single" w:color="BFBFBF" w:sz="4"/>
+              <w:left w:val="single" w:color="BFBFBF" w:sz="4"/>
+              <w:bottom w:val="single" w:color="BFBFBF" w:sz="4"/>
+              <w:right w:val="single" w:color="BFBFBF" w:sz="4"/>
+            </w:tcBorders>
+            <w:shd w:fill="1F4E79" w:color="auto" w:val="clear"/>
+            <w:tcMar>
+              <w:top w:type="dxa" w:w="60"/>
+              <w:left w:type="dxa" w:w="100"/>
+              <w:bottom w:type="dxa" w:w="60"/>
+              <w:right w:type="dxa" w:w="100"/>
+            </w:tcMar>
+          </w:tcPr>
+          <w:p>
+            <w:pPr>
+              <w:spacing w:after="0"/>
+            </w:pPr>
+            <w:r>
+              <w:rPr>
+                <w:b/>
+                <w:bCs/>
+                <w:color w:val="FFFFFF"/>
+                <w:sz w:val="18"/>
+                <w:szCs w:val="18"/>
+              </w:rPr>
+              <w:t xml:space="preserve">Motivo y límites</w:t>
+            </w:r>
+          </w:p>
+        </w:tc>
+      </w:tr>
+      <w:tr>
+        <w:trPr>
+          <w:tblHeader/>
+        </w:trPr>
+        <w:tc>
+          <w:tcPr>
+            <w:tcW w:type="dxa" w:w="747"/>
+            <w:tcBorders>
+              <w:top w:val="single" w:color="BFBFBF" w:sz="4"/>
+              <w:left w:val="single" w:color="BFBFBF" w:sz="4"/>
+              <w:bottom w:val="single" w:color="BFBFBF" w:sz="4"/>
+              <w:right w:val="single" w:color="BFBFBF" w:sz="4"/>
+            </w:tcBorders>
+            <w:shd w:fill="1F4E79" w:color="auto" w:val="clear"/>
+            <w:tcMar>
+              <w:top w:type="dxa" w:w="60"/>
+              <w:left w:type="dxa" w:w="100"/>
+              <w:bottom w:type="dxa" w:w="60"/>
+              <w:right w:type="dxa" w:w="100"/>
+            </w:tcMar>
+          </w:tcPr>
+          <w:p>
+            <w:pPr>
+              <w:spacing w:after="0"/>
+            </w:pPr>
+            <w:r>
+              <w:rPr>
+                <w:b/>
+                <w:bCs/>
+                <w:color w:val="FFFFFF"/>
+                <w:sz w:val="18"/>
+                <w:szCs w:val="18"/>
+              </w:rPr>
+              <w:t xml:space="preserve">D-43 / D-47</w:t>
+            </w:r>
+          </w:p>
+        </w:tc>
+        <w:tc>
+          <w:tcPr>
+            <w:tcW w:type="dxa" w:w="4408"/>
+            <w:tcBorders>
+              <w:top w:val="single" w:color="BFBFBF" w:sz="4"/>
+              <w:left w:val="single" w:color="BFBFBF" w:sz="4"/>
+              <w:bottom w:val="single" w:color="BFBFBF" w:sz="4"/>
+              <w:right w:val="single" w:color="BFBFBF" w:sz="4"/>
+            </w:tcBorders>
+            <w:shd w:fill="1F4E79" w:color="auto" w:val="clear"/>
+            <w:tcMar>
+              <w:top w:type="dxa" w:w="60"/>
+              <w:left w:type="dxa" w:w="100"/>
+              <w:bottom w:type="dxa" w:w="60"/>
+              <w:right w:type="dxa" w:w="100"/>
+            </w:tcMar>
+          </w:tcPr>
+          <w:p>
+            <w:pPr>
+              <w:spacing w:after="0"/>
+            </w:pPr>
+            <w:r>
+              <w:rPr>
+                <w:b/>
+                <w:bCs/>
+                <w:color w:val="FFFFFF"/>
+                <w:sz w:val="18"/>
+                <w:szCs w:val="18"/>
+              </w:rPr>
+              <w:t xml:space="preserve">Presupuestos, cancelación e idempotencia: pp. 101–105 y 113–116.</w:t>
+            </w:r>
+          </w:p>
+        </w:tc>
+        <w:tc>
+          <w:tcPr>
+            <w:tcW w:type="dxa" w:w="4483"/>
+            <w:tcBorders>
+              <w:top w:val="single" w:color="BFBFBF" w:sz="4"/>
+              <w:left w:val="single" w:color="BFBFBF" w:sz="4"/>
+              <w:bottom w:val="single" w:color="BFBFBF" w:sz="4"/>
+              <w:right w:val="single" w:color="BFBFBF" w:sz="4"/>
+            </w:tcBorders>
+            <w:shd w:fill="1F4E79" w:color="auto" w:val="clear"/>
+            <w:tcMar>
+              <w:top w:type="dxa" w:w="60"/>
+              <w:left w:type="dxa" w:w="100"/>
+              <w:bottom w:type="dxa" w:w="60"/>
+              <w:right w:type="dxa" w:w="100"/>
+            </w:tcMar>
+          </w:tcPr>
+          <w:p>
+            <w:pPr>
+              <w:spacing w:after="0"/>
+            </w:pPr>
+            <w:r>
+              <w:rPr>
+                <w:b/>
+                <w:bCs/>
+                <w:color w:val="FFFFFF"/>
+                <w:sz w:val="18"/>
+                <w:szCs w:val="18"/>
+              </w:rPr>
+              <w:t xml:space="preserve">Acotar esperas y recuperar resultados inciertos sin duplicar puntos. Los 4 s/5 s son parámetros propios, no valores universales de clase.</w:t>
+            </w:r>
+          </w:p>
+        </w:tc>
+      </w:tr>
+      <w:tr>
+        <w:trPr>
+          <w:tblHeader/>
+        </w:trPr>
+        <w:tc>
+          <w:tcPr>
+            <w:tcW w:type="dxa" w:w="747"/>
+            <w:tcBorders>
+              <w:top w:val="single" w:color="BFBFBF" w:sz="4"/>
+              <w:left w:val="single" w:color="BFBFBF" w:sz="4"/>
+              <w:bottom w:val="single" w:color="BFBFBF" w:sz="4"/>
+              <w:right w:val="single" w:color="BFBFBF" w:sz="4"/>
+            </w:tcBorders>
+            <w:shd w:fill="1F4E79" w:color="auto" w:val="clear"/>
+            <w:tcMar>
+              <w:top w:type="dxa" w:w="60"/>
+              <w:left w:type="dxa" w:w="100"/>
+              <w:bottom w:type="dxa" w:w="60"/>
+              <w:right w:type="dxa" w:w="100"/>
+            </w:tcMar>
+          </w:tcPr>
+          <w:p>
+            <w:pPr>
+              <w:spacing w:after="0"/>
+            </w:pPr>
+            <w:r>
+              <w:rPr>
+                <w:b/>
+                <w:bCs/>
+                <w:color w:val="FFFFFF"/>
+                <w:sz w:val="18"/>
+                <w:szCs w:val="18"/>
+              </w:rPr>
+              <w:t xml:space="preserve">D-44</w:t>
+            </w:r>
+          </w:p>
+        </w:tc>
+        <w:tc>
+          <w:tcPr>
+            <w:tcW w:type="dxa" w:w="4408"/>
+            <w:tcBorders>
+              <w:top w:val="single" w:color="BFBFBF" w:sz="4"/>
+              <w:left w:val="single" w:color="BFBFBF" w:sz="4"/>
+              <w:bottom w:val="single" w:color="BFBFBF" w:sz="4"/>
+              <w:right w:val="single" w:color="BFBFBF" w:sz="4"/>
+            </w:tcBorders>
+            <w:shd w:fill="1F4E79" w:color="auto" w:val="clear"/>
+            <w:tcMar>
+              <w:top w:type="dxa" w:w="60"/>
+              <w:left w:type="dxa" w:w="100"/>
+              <w:bottom w:type="dxa" w:w="60"/>
+              <w:right w:type="dxa" w:w="100"/>
+            </w:tcMar>
+          </w:tcPr>
+          <w:p>
+            <w:pPr>
+              <w:spacing w:after="0"/>
+            </w:pPr>
+            <w:r>
+              <w:rPr>
+                <w:b/>
+                <w:bCs/>
+                <w:color w:val="FFFFFF"/>
+                <w:sz w:val="18"/>
+                <w:szCs w:val="18"/>
+              </w:rPr>
+              <w:t xml:space="preserve">Contratos e idempotencia: pp. 138 y 144–148; presupuestos: pp. 101–105.</w:t>
+            </w:r>
+          </w:p>
+        </w:tc>
+        <w:tc>
+          <w:tcPr>
+            <w:tcW w:type="dxa" w:w="4483"/>
+            <w:tcBorders>
+              <w:top w:val="single" w:color="BFBFBF" w:sz="4"/>
+              <w:left w:val="single" w:color="BFBFBF" w:sz="4"/>
+              <w:bottom w:val="single" w:color="BFBFBF" w:sz="4"/>
+              <w:right w:val="single" w:color="BFBFBF" w:sz="4"/>
+            </w:tcBorders>
+            <w:shd w:fill="1F4E79" w:color="auto" w:val="clear"/>
+            <w:tcMar>
+              <w:top w:type="dxa" w:w="60"/>
+              <w:left w:type="dxa" w:w="100"/>
+              <w:bottom w:type="dxa" w:w="60"/>
+              <w:right w:type="dxa" w:w="100"/>
+            </w:tcMar>
+          </w:tcPr>
+          <w:p>
+            <w:pPr>
+              <w:spacing w:after="0"/>
+            </w:pPr>
+            <w:r>
+              <w:rPr>
+                <w:b/>
+                <w:bCs/>
+                <w:color w:val="FFFFFF"/>
+                <w:sz w:val="18"/>
+                <w:szCs w:val="18"/>
+              </w:rPr>
+              <w:t xml:space="preserve">El contrato debe describir fallas reales del recorrido. Los HTTP/códigos concretos son elección del contrato del proyecto, no prescripción del teórico.</w:t>
+            </w:r>
+          </w:p>
+        </w:tc>
+      </w:tr>
+      <w:tr>
+        <w:trPr>
+          <w:tblHeader/>
+        </w:trPr>
+        <w:tc>
+          <w:tcPr>
+            <w:tcW w:type="dxa" w:w="747"/>
+            <w:tcBorders>
+              <w:top w:val="single" w:color="BFBFBF" w:sz="4"/>
+              <w:left w:val="single" w:color="BFBFBF" w:sz="4"/>
+              <w:bottom w:val="single" w:color="BFBFBF" w:sz="4"/>
+              <w:right w:val="single" w:color="BFBFBF" w:sz="4"/>
+            </w:tcBorders>
+            <w:shd w:fill="1F4E79" w:color="auto" w:val="clear"/>
+            <w:tcMar>
+              <w:top w:type="dxa" w:w="60"/>
+              <w:left w:type="dxa" w:w="100"/>
+              <w:bottom w:type="dxa" w:w="60"/>
+              <w:right w:type="dxa" w:w="100"/>
+            </w:tcMar>
+          </w:tcPr>
+          <w:p>
+            <w:pPr>
+              <w:spacing w:after="0"/>
+            </w:pPr>
+            <w:r>
+              <w:rPr>
+                <w:b/>
+                <w:bCs/>
+                <w:color w:val="FFFFFF"/>
+                <w:sz w:val="18"/>
+                <w:szCs w:val="18"/>
+              </w:rPr>
+              <w:t xml:space="preserve">D-45</w:t>
+            </w:r>
+          </w:p>
+        </w:tc>
+        <w:tc>
+          <w:tcPr>
+            <w:tcW w:type="dxa" w:w="4408"/>
+            <w:tcBorders>
+              <w:top w:val="single" w:color="BFBFBF" w:sz="4"/>
+              <w:left w:val="single" w:color="BFBFBF" w:sz="4"/>
+              <w:bottom w:val="single" w:color="BFBFBF" w:sz="4"/>
+              <w:right w:val="single" w:color="BFBFBF" w:sz="4"/>
+            </w:tcBorders>
+            <w:shd w:fill="1F4E79" w:color="auto" w:val="clear"/>
+            <w:tcMar>
+              <w:top w:type="dxa" w:w="60"/>
+              <w:left w:type="dxa" w:w="100"/>
+              <w:bottom w:type="dxa" w:w="60"/>
+              <w:right w:type="dxa" w:w="100"/>
+            </w:tcMar>
+          </w:tcPr>
+          <w:p>
+            <w:pPr>
+              <w:spacing w:after="0"/>
+            </w:pPr>
+            <w:r>
+              <w:rPr>
+                <w:b/>
+                <w:bCs/>
+                <w:color w:val="FFFFFF"/>
+                <w:sz w:val="18"/>
+                <w:szCs w:val="18"/>
+              </w:rPr>
+              <w:t xml:space="preserve">Búsqueda e índice derivado: pp. 69, 75–77 y 83.</w:t>
+            </w:r>
+          </w:p>
+        </w:tc>
+        <w:tc>
+          <w:tcPr>
+            <w:tcW w:type="dxa" w:w="4483"/>
+            <w:tcBorders>
+              <w:top w:val="single" w:color="BFBFBF" w:sz="4"/>
+              <w:left w:val="single" w:color="BFBFBF" w:sz="4"/>
+              <w:bottom w:val="single" w:color="BFBFBF" w:sz="4"/>
+              <w:right w:val="single" w:color="BFBFBF" w:sz="4"/>
+            </w:tcBorders>
+            <w:shd w:fill="1F4E79" w:color="auto" w:val="clear"/>
+            <w:tcMar>
+              <w:top w:type="dxa" w:w="60"/>
+              <w:left w:type="dxa" w:w="100"/>
+              <w:bottom w:type="dxa" w:w="60"/>
+              <w:right w:type="dxa" w:w="100"/>
+            </w:tcMar>
+          </w:tcPr>
+          <w:p>
+            <w:pPr>
+              <w:spacing w:after="0"/>
+            </w:pPr>
+            <w:r>
+              <w:rPr>
+                <w:b/>
+                <w:bCs/>
+                <w:color w:val="FFFFFF"/>
+                <w:sz w:val="18"/>
+                <w:szCs w:val="18"/>
+              </w:rPr>
+              <w:t xml:space="preserve">Separar búsqueda de la fuente transaccional y validar cupo al reservar. Páginas 20/100 y objetivo &lt; 2 s son valores propios pendientes de medir.</w:t>
+            </w:r>
+          </w:p>
+        </w:tc>
+      </w:tr>
+      <w:tr>
+        <w:trPr>
+          <w:tblHeader/>
+        </w:trPr>
+        <w:tc>
+          <w:tcPr>
+            <w:tcW w:type="dxa" w:w="747"/>
+            <w:tcBorders>
+              <w:top w:val="single" w:color="BFBFBF" w:sz="4"/>
+              <w:left w:val="single" w:color="BFBFBF" w:sz="4"/>
+              <w:bottom w:val="single" w:color="BFBFBF" w:sz="4"/>
+              <w:right w:val="single" w:color="BFBFBF" w:sz="4"/>
+            </w:tcBorders>
+            <w:shd w:fill="1F4E79" w:color="auto" w:val="clear"/>
+            <w:tcMar>
+              <w:top w:type="dxa" w:w="60"/>
+              <w:left w:type="dxa" w:w="100"/>
+              <w:bottom w:type="dxa" w:w="60"/>
+              <w:right w:type="dxa" w:w="100"/>
+            </w:tcMar>
+          </w:tcPr>
+          <w:p>
+            <w:pPr>
+              <w:spacing w:after="0"/>
+            </w:pPr>
+            <w:r>
+              <w:rPr>
+                <w:b/>
+                <w:bCs/>
+                <w:color w:val="FFFFFF"/>
+                <w:sz w:val="18"/>
+                <w:szCs w:val="18"/>
+              </w:rPr>
+              <w:t xml:space="preserve">D-46 / D-51</w:t>
+            </w:r>
+          </w:p>
+        </w:tc>
+        <w:tc>
+          <w:tcPr>
+            <w:tcW w:type="dxa" w:w="4408"/>
+            <w:tcBorders>
+              <w:top w:val="single" w:color="BFBFBF" w:sz="4"/>
+              <w:left w:val="single" w:color="BFBFBF" w:sz="4"/>
+              <w:bottom w:val="single" w:color="BFBFBF" w:sz="4"/>
+              <w:right w:val="single" w:color="BFBFBF" w:sz="4"/>
+            </w:tcBorders>
+            <w:shd w:fill="1F4E79" w:color="auto" w:val="clear"/>
+            <w:tcMar>
+              <w:top w:type="dxa" w:w="60"/>
+              <w:left w:type="dxa" w:w="100"/>
+              <w:bottom w:type="dxa" w:w="60"/>
+              <w:right w:type="dxa" w:w="100"/>
+            </w:tcMar>
+          </w:tcPr>
+          <w:p>
+            <w:pPr>
+              <w:spacing w:after="0"/>
+            </w:pPr>
+            <w:r>
+              <w:rPr>
+                <w:b/>
+                <w:bCs/>
+                <w:color w:val="FFFFFF"/>
+                <w:sz w:val="18"/>
+                <w:szCs w:val="18"/>
+              </w:rPr>
+              <w:t xml:space="preserve">Balanceo, afinidad y salud: pp. 85–87; flapping: p. 87.</w:t>
+            </w:r>
+          </w:p>
+        </w:tc>
+        <w:tc>
+          <w:tcPr>
+            <w:tcW w:type="dxa" w:w="4483"/>
+            <w:tcBorders>
+              <w:top w:val="single" w:color="BFBFBF" w:sz="4"/>
+              <w:left w:val="single" w:color="BFBFBF" w:sz="4"/>
+              <w:bottom w:val="single" w:color="BFBFBF" w:sz="4"/>
+              <w:right w:val="single" w:color="BFBFBF" w:sz="4"/>
+            </w:tcBorders>
+            <w:shd w:fill="1F4E79" w:color="auto" w:val="clear"/>
+            <w:tcMar>
+              <w:top w:type="dxa" w:w="60"/>
+              <w:left w:type="dxa" w:w="100"/>
+              <w:bottom w:type="dxa" w:w="60"/>
+              <w:right w:type="dxa" w:w="100"/>
+            </w:tcMar>
+          </w:tcPr>
+          <w:p>
+            <w:pPr>
+              <w:spacing w:after="0"/>
+            </w:pPr>
+            <w:r>
+              <w:rPr>
+                <w:b/>
+                <w:bCs/>
+                <w:color w:val="FFFFFF"/>
+                <w:sz w:val="18"/>
+                <w:szCs w:val="18"/>
+              </w:rPr>
+              <w:t xml:space="preserve">Repartir tráfico entre réplicas aptas sin cambios por fallas aisladas. Traefik es herramienta adicional justificada; 5 s/2 s y conteos 3/2 son parámetros propios.</w:t>
+            </w:r>
+          </w:p>
+        </w:tc>
+      </w:tr>
+      <w:tr>
+        <w:trPr>
+          <w:tblHeader/>
+        </w:trPr>
+        <w:tc>
+          <w:tcPr>
+            <w:tcW w:type="dxa" w:w="747"/>
+            <w:tcBorders>
+              <w:top w:val="single" w:color="BFBFBF" w:sz="4"/>
+              <w:left w:val="single" w:color="BFBFBF" w:sz="4"/>
+              <w:bottom w:val="single" w:color="BFBFBF" w:sz="4"/>
+              <w:right w:val="single" w:color="BFBFBF" w:sz="4"/>
+            </w:tcBorders>
+            <w:shd w:fill="1F4E79" w:color="auto" w:val="clear"/>
+            <w:tcMar>
+              <w:top w:type="dxa" w:w="60"/>
+              <w:left w:type="dxa" w:w="100"/>
+              <w:bottom w:type="dxa" w:w="60"/>
+              <w:right w:type="dxa" w:w="100"/>
+            </w:tcMar>
+          </w:tcPr>
+          <w:p>
+            <w:pPr>
+              <w:spacing w:after="0"/>
+            </w:pPr>
+            <w:r>
+              <w:rPr>
+                <w:b/>
+                <w:bCs/>
+                <w:color w:val="FFFFFF"/>
+                <w:sz w:val="18"/>
+                <w:szCs w:val="18"/>
+              </w:rPr>
+              <w:t xml:space="preserve">D-48</w:t>
+            </w:r>
+          </w:p>
+        </w:tc>
+        <w:tc>
+          <w:tcPr>
+            <w:tcW w:type="dxa" w:w="4408"/>
+            <w:tcBorders>
+              <w:top w:val="single" w:color="BFBFBF" w:sz="4"/>
+              <w:left w:val="single" w:color="BFBFBF" w:sz="4"/>
+              <w:bottom w:val="single" w:color="BFBFBF" w:sz="4"/>
+              <w:right w:val="single" w:color="BFBFBF" w:sz="4"/>
+            </w:tcBorders>
+            <w:shd w:fill="1F4E79" w:color="auto" w:val="clear"/>
+            <w:tcMar>
+              <w:top w:type="dxa" w:w="60"/>
+              <w:left w:type="dxa" w:w="100"/>
+              <w:bottom w:type="dxa" w:w="60"/>
+              <w:right w:type="dxa" w:w="100"/>
+            </w:tcMar>
+          </w:tcPr>
+          <w:p>
+            <w:pPr>
+              <w:spacing w:after="0"/>
+            </w:pPr>
+            <w:r>
+              <w:rPr>
+                <w:b/>
+                <w:bCs/>
+                <w:color w:val="FFFFFF"/>
+                <w:sz w:val="18"/>
+                <w:szCs w:val="18"/>
+              </w:rPr>
+              <w:t xml:space="preserve">Correlación/trazabilidad: pp. 7–8; señales de resiliencia: pp. 111–112.</w:t>
+            </w:r>
+          </w:p>
+        </w:tc>
+        <w:tc>
+          <w:tcPr>
+            <w:tcW w:type="dxa" w:w="4483"/>
+            <w:tcBorders>
+              <w:top w:val="single" w:color="BFBFBF" w:sz="4"/>
+              <w:left w:val="single" w:color="BFBFBF" w:sz="4"/>
+              <w:bottom w:val="single" w:color="BFBFBF" w:sz="4"/>
+              <w:right w:val="single" w:color="BFBFBF" w:sz="4"/>
+            </w:tcBorders>
+            <w:shd w:fill="1F4E79" w:color="auto" w:val="clear"/>
+            <w:tcMar>
+              <w:top w:type="dxa" w:w="60"/>
+              <w:left w:type="dxa" w:w="100"/>
+              <w:bottom w:type="dxa" w:w="60"/>
+              <w:right w:type="dxa" w:w="100"/>
+            </w:tcMar>
+          </w:tcPr>
+          <w:p>
+            <w:pPr>
+              <w:spacing w:after="0"/>
+            </w:pPr>
+            <w:r>
+              <w:rPr>
+                <w:b/>
+                <w:bCs/>
+                <w:color w:val="FFFFFF"/>
+                <w:sz w:val="18"/>
+                <w:szCs w:val="18"/>
+              </w:rPr>
+              <w:t xml:space="preserve">Reconstruir una petición y localizar fallas. OTel/Collector/Jaeger son instrumentos adicionales, no productos explicados en el apunte; alertas y muestreo son valores propios.</w:t>
+            </w:r>
+          </w:p>
+        </w:tc>
+      </w:tr>
+      <w:tr>
+        <w:trPr>
+          <w:tblHeader/>
+        </w:trPr>
+        <w:tc>
+          <w:tcPr>
+            <w:tcW w:type="dxa" w:w="747"/>
+            <w:tcBorders>
+              <w:top w:val="single" w:color="BFBFBF" w:sz="4"/>
+              <w:left w:val="single" w:color="BFBFBF" w:sz="4"/>
+              <w:bottom w:val="single" w:color="BFBFBF" w:sz="4"/>
+              <w:right w:val="single" w:color="BFBFBF" w:sz="4"/>
+            </w:tcBorders>
+            <w:shd w:fill="1F4E79" w:color="auto" w:val="clear"/>
+            <w:tcMar>
+              <w:top w:type="dxa" w:w="60"/>
+              <w:left w:type="dxa" w:w="100"/>
+              <w:bottom w:type="dxa" w:w="60"/>
+              <w:right w:type="dxa" w:w="100"/>
+            </w:tcMar>
+          </w:tcPr>
+          <w:p>
+            <w:pPr>
+              <w:spacing w:after="0"/>
+            </w:pPr>
+            <w:r>
+              <w:rPr>
+                <w:b/>
+                <w:bCs/>
+                <w:color w:val="FFFFFF"/>
+                <w:sz w:val="18"/>
+                <w:szCs w:val="18"/>
+              </w:rPr>
+              <w:t xml:space="preserve">D-49</w:t>
+            </w:r>
+          </w:p>
+        </w:tc>
+        <w:tc>
+          <w:tcPr>
+            <w:tcW w:type="dxa" w:w="4408"/>
+            <w:tcBorders>
+              <w:top w:val="single" w:color="BFBFBF" w:sz="4"/>
+              <w:left w:val="single" w:color="BFBFBF" w:sz="4"/>
+              <w:bottom w:val="single" w:color="BFBFBF" w:sz="4"/>
+              <w:right w:val="single" w:color="BFBFBF" w:sz="4"/>
+            </w:tcBorders>
+            <w:shd w:fill="1F4E79" w:color="auto" w:val="clear"/>
+            <w:tcMar>
+              <w:top w:type="dxa" w:w="60"/>
+              <w:left w:type="dxa" w:w="100"/>
+              <w:bottom w:type="dxa" w:w="60"/>
+              <w:right w:type="dxa" w:w="100"/>
+            </w:tcMar>
+          </w:tcPr>
+          <w:p>
+            <w:pPr>
+              <w:spacing w:after="0"/>
+            </w:pPr>
+            <w:r>
+              <w:rPr>
+                <w:b/>
+                <w:bCs/>
+                <w:color w:val="FFFFFF"/>
+                <w:sz w:val="18"/>
+                <w:szCs w:val="18"/>
+              </w:rPr>
+              <w:t xml:space="preserve">Criterio explícito del equipo sobre el uso del material.</w:t>
+            </w:r>
+          </w:p>
+        </w:tc>
+        <w:tc>
+          <w:tcPr>
+            <w:tcW w:type="dxa" w:w="4483"/>
+            <w:tcBorders>
+              <w:top w:val="single" w:color="BFBFBF" w:sz="4"/>
+              <w:left w:val="single" w:color="BFBFBF" w:sz="4"/>
+              <w:bottom w:val="single" w:color="BFBFBF" w:sz="4"/>
+              <w:right w:val="single" w:color="BFBFBF" w:sz="4"/>
+            </w:tcBorders>
+            <w:shd w:fill="1F4E79" w:color="auto" w:val="clear"/>
+            <w:tcMar>
+              <w:top w:type="dxa" w:w="60"/>
+              <w:left w:type="dxa" w:w="100"/>
+              <w:bottom w:type="dxa" w:w="60"/>
+              <w:right w:type="dxa" w:w="100"/>
+            </w:tcMar>
+          </w:tcPr>
+          <w:p>
+            <w:pPr>
+              <w:spacing w:after="0"/>
+            </w:pPr>
+            <w:r>
+              <w:rPr>
+                <w:b/>
+                <w:bCs/>
+                <w:color w:val="FFFFFF"/>
+                <w:sz w:val="18"/>
+                <w:szCs w:val="18"/>
+              </w:rPr>
+              <w:t xml:space="preserve">Priorizar lo visto en clase; cada herramienta adicional debe ser necesaria, útil, justificada y consultada. No es un concepto atribuido al PDF.</w:t>
+            </w:r>
+          </w:p>
+        </w:tc>
+      </w:tr>
+      <w:tr>
+        <w:trPr>
+          <w:tblHeader/>
+        </w:trPr>
+        <w:tc>
+          <w:tcPr>
+            <w:tcW w:type="dxa" w:w="747"/>
+            <w:tcBorders>
+              <w:top w:val="single" w:color="BFBFBF" w:sz="4"/>
+              <w:left w:val="single" w:color="BFBFBF" w:sz="4"/>
+              <w:bottom w:val="single" w:color="BFBFBF" w:sz="4"/>
+              <w:right w:val="single" w:color="BFBFBF" w:sz="4"/>
+            </w:tcBorders>
+            <w:shd w:fill="1F4E79" w:color="auto" w:val="clear"/>
+            <w:tcMar>
+              <w:top w:type="dxa" w:w="60"/>
+              <w:left w:type="dxa" w:w="100"/>
+              <w:bottom w:type="dxa" w:w="60"/>
+              <w:right w:type="dxa" w:w="100"/>
+            </w:tcMar>
+          </w:tcPr>
+          <w:p>
+            <w:pPr>
+              <w:spacing w:after="0"/>
+            </w:pPr>
+            <w:r>
+              <w:rPr>
+                <w:b/>
+                <w:bCs/>
+                <w:color w:val="FFFFFF"/>
+                <w:sz w:val="18"/>
+                <w:szCs w:val="18"/>
+              </w:rPr>
+              <w:t xml:space="preserve">D-50</w:t>
+            </w:r>
+          </w:p>
+        </w:tc>
+        <w:tc>
+          <w:tcPr>
+            <w:tcW w:type="dxa" w:w="4408"/>
+            <w:tcBorders>
+              <w:top w:val="single" w:color="BFBFBF" w:sz="4"/>
+              <w:left w:val="single" w:color="BFBFBF" w:sz="4"/>
+              <w:bottom w:val="single" w:color="BFBFBF" w:sz="4"/>
+              <w:right w:val="single" w:color="BFBFBF" w:sz="4"/>
+            </w:tcBorders>
+            <w:shd w:fill="1F4E79" w:color="auto" w:val="clear"/>
+            <w:tcMar>
+              <w:top w:type="dxa" w:w="60"/>
+              <w:left w:type="dxa" w:w="100"/>
+              <w:bottom w:type="dxa" w:w="60"/>
+              <w:right w:type="dxa" w:w="100"/>
+            </w:tcMar>
+          </w:tcPr>
+          <w:p>
+            <w:pPr>
+              <w:spacing w:after="0"/>
+            </w:pPr>
+            <w:r>
+              <w:rPr>
+                <w:b/>
+                <w:bCs/>
+                <w:color w:val="FFFFFF"/>
+                <w:sz w:val="18"/>
+                <w:szCs w:val="18"/>
+              </w:rPr>
+              <w:t xml:space="preserve">Capacidad, latencia y costos: pp. 29–30, 86, 101–102 y 143; pruebas exigidas por el TP.</w:t>
+            </w:r>
+          </w:p>
+        </w:tc>
+        <w:tc>
+          <w:tcPr>
+            <w:tcW w:type="dxa" w:w="4483"/>
+            <w:tcBorders>
+              <w:top w:val="single" w:color="BFBFBF" w:sz="4"/>
+              <w:left w:val="single" w:color="BFBFBF" w:sz="4"/>
+              <w:bottom w:val="single" w:color="BFBFBF" w:sz="4"/>
+              <w:right w:val="single" w:color="BFBFBF" w:sz="4"/>
+            </w:tcBorders>
+            <w:shd w:fill="1F4E79" w:color="auto" w:val="clear"/>
+            <w:tcMar>
+              <w:top w:type="dxa" w:w="60"/>
+              <w:left w:type="dxa" w:w="100"/>
+              <w:bottom w:type="dxa" w:w="60"/>
+              <w:right w:type="dxa" w:w="100"/>
+            </w:tcMar>
+          </w:tcPr>
+          <w:p>
+            <w:pPr>
+              <w:spacing w:after="0"/>
+            </w:pPr>
+            <w:r>
+              <w:rPr>
+                <w:b/>
+                <w:bCs/>
+                <w:color w:val="FFFFFF"/>
+                <w:sz w:val="18"/>
+                <w:szCs w:val="18"/>
+              </w:rPr>
+              <w:t xml:space="preserve">Medir antes de elegir mejoras o afirmar capacidad. k6 y percentiles son instrumentos adicionales aprobados; cargas y objetivos son propios y todavía no medidos.</w:t>
+            </w:r>
+          </w:p>
+        </w:tc>
+      </w:tr>
+    </w:tbl>
     <w:sectPr>
       <w:footerReference w:type="default" r:id="rId7"/>
       <w:pgSz w:w="11906" w:h="16838" w:orient="portrait"/>

</xml_diff>

<commit_message>
docs: registrar evidencia y decisiones de la etapa 3
</commit_message>
<xml_diff>
--- a/Registro_de_Decisiones_Gimnasio.docx
+++ b/Registro_de_Decisiones_Gimnasio.docx
@@ -4831,6 +4831,196 @@
           </w:p>
         </w:tc>
       </w:tr>
+      <w:tr>
+        <w:trPr>
+          <w:tblHeader w:val="false"/>
+        </w:trPr>
+        <w:tc>
+          <w:tcPr>
+            <w:tcW w:type="dxa" w:w="747"/>
+            <w:tcBorders>
+              <w:top w:val="single" w:color="BFBFBF" w:sz="4"/>
+              <w:left w:val="single" w:color="BFBFBF" w:sz="4"/>
+              <w:bottom w:val="single" w:color="BFBFBF" w:sz="4"/>
+              <w:right w:val="single" w:color="BFBFBF" w:sz="4"/>
+            </w:tcBorders>
+            <w:shd w:fill="F2F6FA" w:color="auto" w:val="clear"/>
+            <w:tcMar>
+              <w:top w:type="dxa" w:w="60"/>
+              <w:left w:type="dxa" w:w="100"/>
+              <w:bottom w:type="dxa" w:w="60"/>
+              <w:right w:type="dxa" w:w="100"/>
+            </w:tcMar>
+          </w:tcPr>
+          <w:p>
+            <w:pPr>
+              <w:spacing w:after="0"/>
+            </w:pPr>
+            <w:r>
+              <w:rPr>
+                <w:sz w:val="18"/>
+                <w:szCs w:val="18"/>
+              </w:rPr>
+              <w:t xml:space="preserve">D-53</w:t>
+            </w:r>
+          </w:p>
+        </w:tc>
+        <w:tc>
+          <w:tcPr>
+            <w:tcW w:type="dxa" w:w="4408"/>
+            <w:tcBorders>
+              <w:top w:val="single" w:color="BFBFBF" w:sz="4"/>
+              <w:left w:val="single" w:color="BFBFBF" w:sz="4"/>
+              <w:bottom w:val="single" w:color="BFBFBF" w:sz="4"/>
+              <w:right w:val="single" w:color="BFBFBF" w:sz="4"/>
+            </w:tcBorders>
+            <w:shd w:fill="F2F6FA" w:color="auto" w:val="clear"/>
+            <w:tcMar>
+              <w:top w:type="dxa" w:w="60"/>
+              <w:left w:type="dxa" w:w="100"/>
+              <w:bottom w:type="dxa" w:w="60"/>
+              <w:right w:type="dxa" w:w="100"/>
+            </w:tcMar>
+          </w:tcPr>
+          <w:p>
+            <w:pPr>
+              <w:spacing w:after="0"/>
+            </w:pPr>
+            <w:r>
+              <w:rPr>
+                <w:sz w:val="18"/>
+                <w:szCs w:val="18"/>
+              </w:rPr>
+              <w:t xml:space="preserve">updatedAt de cuentas sin movimientos</w:t>
+            </w:r>
+          </w:p>
+        </w:tc>
+        <w:tc>
+          <w:tcPr>
+            <w:tcW w:type="dxa" w:w="4483"/>
+            <w:tcBorders>
+              <w:top w:val="single" w:color="BFBFBF" w:sz="4"/>
+              <w:left w:val="single" w:color="BFBFBF" w:sz="4"/>
+              <w:bottom w:val="single" w:color="BFBFBF" w:sz="4"/>
+              <w:right w:val="single" w:color="BFBFBF" w:sz="4"/>
+            </w:tcBorders>
+            <w:shd w:fill="F2F6FA" w:color="auto" w:val="clear"/>
+            <w:tcMar>
+              <w:top w:type="dxa" w:w="60"/>
+              <w:left w:type="dxa" w:w="100"/>
+              <w:bottom w:type="dxa" w:w="60"/>
+              <w:right w:type="dxa" w:w="100"/>
+            </w:tcMar>
+          </w:tcPr>
+          <w:p>
+            <w:pPr>
+              <w:spacing w:after="0"/>
+            </w:pPr>
+            <w:r>
+              <w:rPr>
+                <w:sz w:val="18"/>
+                <w:szCs w:val="18"/>
+              </w:rPr>
+              <w:t xml:space="preserve">Aprobado el 16/10/2026: informar fecha de creación hasta el primer movimiento y luego fecha del último movimiento aplicado. Motivo: el campo es obligatorio; usar la hora de consulta inventaría un cambio y omitirlo incumpliría el esquema. Es semántica del contrato, apoyada en estado persistido/invariantes (teórico pp. 27–28 y 120), no una fecha prescrita por clase. OpenAPI 1.1.1 y ADR-008 v3 reemplazan la ambigüedad. Los datos anteriores sin fecha usan inicialmente la fecha de migración.</w:t>
+            </w:r>
+          </w:p>
+        </w:tc>
+      </w:tr>
+      <w:tr>
+        <w:trPr>
+          <w:tblHeader w:val="false"/>
+        </w:trPr>
+        <w:tc>
+          <w:tcPr>
+            <w:tcW w:type="dxa" w:w="747"/>
+            <w:tcBorders>
+              <w:top w:val="single" w:color="BFBFBF" w:sz="4"/>
+              <w:left w:val="single" w:color="BFBFBF" w:sz="4"/>
+              <w:bottom w:val="single" w:color="BFBFBF" w:sz="4"/>
+              <w:right w:val="single" w:color="BFBFBF" w:sz="4"/>
+            </w:tcBorders>
+            <w:shd w:fill="F2F6FA" w:color="auto" w:val="clear"/>
+            <w:tcMar>
+              <w:top w:type="dxa" w:w="60"/>
+              <w:left w:type="dxa" w:w="100"/>
+              <w:bottom w:type="dxa" w:w="60"/>
+              <w:right w:type="dxa" w:w="100"/>
+            </w:tcMar>
+          </w:tcPr>
+          <w:p>
+            <w:pPr>
+              <w:spacing w:after="0"/>
+            </w:pPr>
+            <w:r>
+              <w:rPr>
+                <w:sz w:val="18"/>
+                <w:szCs w:val="18"/>
+              </w:rPr>
+              <w:t xml:space="preserve">D-54</w:t>
+            </w:r>
+          </w:p>
+        </w:tc>
+        <w:tc>
+          <w:tcPr>
+            <w:tcW w:type="dxa" w:w="4408"/>
+            <w:tcBorders>
+              <w:top w:val="single" w:color="BFBFBF" w:sz="4"/>
+              <w:left w:val="single" w:color="BFBFBF" w:sz="4"/>
+              <w:bottom w:val="single" w:color="BFBFBF" w:sz="4"/>
+              <w:right w:val="single" w:color="BFBFBF" w:sz="4"/>
+            </w:tcBorders>
+            <w:shd w:fill="F2F6FA" w:color="auto" w:val="clear"/>
+            <w:tcMar>
+              <w:top w:type="dxa" w:w="60"/>
+              <w:left w:type="dxa" w:w="100"/>
+              <w:bottom w:type="dxa" w:w="60"/>
+              <w:right w:type="dxa" w:w="100"/>
+            </w:tcMar>
+          </w:tcPr>
+          <w:p>
+            <w:pPr>
+              <w:spacing w:after="0"/>
+            </w:pPr>
+            <w:r>
+              <w:rPr>
+                <w:sz w:val="18"/>
+                <w:szCs w:val="18"/>
+              </w:rPr>
+              <w:t xml:space="preserve">Operación idempotente en curso</w:t>
+            </w:r>
+          </w:p>
+        </w:tc>
+        <w:tc>
+          <w:tcPr>
+            <w:tcW w:type="dxa" w:w="4483"/>
+            <w:tcBorders>
+              <w:top w:val="single" w:color="BFBFBF" w:sz="4"/>
+              <w:left w:val="single" w:color="BFBFBF" w:sz="4"/>
+              <w:bottom w:val="single" w:color="BFBFBF" w:sz="4"/>
+              <w:right w:val="single" w:color="BFBFBF" w:sz="4"/>
+            </w:tcBorders>
+            <w:shd w:fill="F2F6FA" w:color="auto" w:val="clear"/>
+            <w:tcMar>
+              <w:top w:type="dxa" w:w="60"/>
+              <w:left w:type="dxa" w:w="100"/>
+              <w:bottom w:type="dxa" w:w="60"/>
+              <w:right w:type="dxa" w:w="100"/>
+            </w:tcMar>
+          </w:tcPr>
+          <w:p>
+            <w:pPr>
+              <w:spacing w:after="0"/>
+            </w:pPr>
+            <w:r>
+              <w:rPr>
+                <w:sz w:val="18"/>
+                <w:szCs w:val="18"/>
+              </w:rPr>
+              <w:t xml:space="preserve">Aprobado el 16/10/2026: intentar un bloqueo transaccional de PostgreSQL por partner/clave sin esperar; si está ocupado, devolver 409 IDEMPOTENCY_IN_PROGRESS. Conservar restricción única, huella y resultado durable. Motivo: cumplir la respuesta en curso del contrato sin esperar ni depender de locks en memoria. Fundamento: transacción local e idempotencia, pp. 27–28, 103–105 y 113–115. La función concreta de PostgreSQL es un detalle técnico adicional aprobado, no enseñado por el apunte. Ver ADR-015.</w:t>
+            </w:r>
+          </w:p>
+        </w:tc>
+      </w:tr>
     </w:tbl>
     <w:p>
       <w:pPr>
@@ -6421,6 +6611,69 @@
                 <w:szCs w:val="18"/>
               </w:rPr>
               <w:t xml:space="preserve">Se agrega D-52: saldo alineado con RN-22; SPEC v0.10 y ADR-004 v2 preparados, con revisión de PR pendiente.</w:t>
+            </w:r>
+          </w:p>
+        </w:tc>
+      </w:tr>
+      <w:tr>
+        <w:trPr>
+          <w:tblHeader w:val="false"/>
+        </w:trPr>
+        <w:tc>
+          <w:tcPr>
+            <w:tcW w:type="dxa" w:w="2029"/>
+            <w:tcBorders>
+              <w:top w:val="single" w:color="BFBFBF" w:sz="4"/>
+              <w:left w:val="single" w:color="BFBFBF" w:sz="4"/>
+              <w:bottom w:val="single" w:color="BFBFBF" w:sz="4"/>
+              <w:right w:val="single" w:color="BFBFBF" w:sz="4"/>
+            </w:tcBorders>
+            <w:tcMar>
+              <w:top w:type="dxa" w:w="60"/>
+              <w:left w:type="dxa" w:w="100"/>
+              <w:bottom w:type="dxa" w:w="60"/>
+              <w:right w:type="dxa" w:w="100"/>
+            </w:tcMar>
+          </w:tcPr>
+          <w:p>
+            <w:pPr>
+              <w:spacing w:after="0"/>
+            </w:pPr>
+            <w:r>
+              <w:rPr>
+                <w:sz w:val="18"/>
+                <w:szCs w:val="18"/>
+              </w:rPr>
+              <w:t xml:space="preserve">16/10/2026</w:t>
+            </w:r>
+          </w:p>
+        </w:tc>
+        <w:tc>
+          <w:tcPr>
+            <w:tcW w:type="dxa" w:w="7609"/>
+            <w:tcBorders>
+              <w:top w:val="single" w:color="BFBFBF" w:sz="4"/>
+              <w:left w:val="single" w:color="BFBFBF" w:sz="4"/>
+              <w:bottom w:val="single" w:color="BFBFBF" w:sz="4"/>
+              <w:right w:val="single" w:color="BFBFBF" w:sz="4"/>
+            </w:tcBorders>
+            <w:tcMar>
+              <w:top w:type="dxa" w:w="60"/>
+              <w:left w:type="dxa" w:w="100"/>
+              <w:bottom w:type="dxa" w:w="60"/>
+              <w:right w:type="dxa" w:w="100"/>
+            </w:tcMar>
+          </w:tcPr>
+          <w:p>
+            <w:pPr>
+              <w:spacing w:after="0"/>
+            </w:pPr>
+            <w:r>
+              <w:rPr>
+                <w:sz w:val="18"/>
+                <w:szCs w:val="18"/>
+              </w:rPr>
+              <w:t xml:space="preserve">Se agregan D-53/D-54 y sus motivos: fecha de cuenta vacía y bloqueo transaccional para operación en curso; avance de etapa 3.</w:t>
             </w:r>
           </w:p>
         </w:tc>

</xml_diff>

<commit_message>
docs: registrar decisiones y evidencia de observabilidad de etapa 4
</commit_message>
<xml_diff>
--- a/Registro_de_Decisiones_Gimnasio.docx
+++ b/Registro_de_Decisiones_Gimnasio.docx
@@ -4446,7 +4446,7 @@
                 <w:sz w:val="18"/>
                 <w:szCs w:val="18"/>
               </w:rPr>
-              <w:t xml:space="preserve">Aprobado el 16/10/2026: logs JSON y trazas del flujo Gateway → Benefits → PostgreSQL con OpenTelemetry, Collector y Jaeger. Muestreo local 100 %, sin datos personales ni secretos. Métricas de duración, errores y reintentos; alertas iniciales por readiness crítica en 503 durante 30 s o errores 5xx superiores al 1 % durante 5 min con al menos 100 solicitudes. Instrumentación, primera traza y validación de umbrales pendientes. Ver ADR-011.</w:t>
+              <w:t xml:space="preserve">Aprobado el 16/10/2026: logs JSON y trazas del flujo Gateway → Benefits → PostgreSQL con OpenTelemetry, Collector y Jaeger. Muestreo local 100 %, sin datos personales ni secretos. Métricas de duración, errores y reintentos; alertas iniciales por readiness crítica en 503 durante 30 s o errores 5xx superiores al 1 % durante 5 min con al menos 100 solicitudes. Logs correlacionados y primera traza implementados y exportados en etapa 4. Métricas, alertas y validación de umbrales pendientes. Ver ADR-011 v2.</w:t>
             </w:r>
           </w:p>
         </w:tc>
@@ -5017,6 +5017,101 @@
                 <w:szCs w:val="18"/>
               </w:rPr>
               <w:t xml:space="preserve">Aprobado el 16/10/2026: intentar un bloqueo transaccional de PostgreSQL por partner/clave sin esperar; si está ocupado, devolver 409 IDEMPOTENCY_IN_PROGRESS. Conservar restricción única, huella y resultado durable. Motivo: cumplir la respuesta en curso del contrato sin esperar ni depender de locks en memoria. Fundamento: transacción local e idempotencia, pp. 27–28, 103–105 y 113–115. La función concreta de PostgreSQL es un detalle técnico adicional aprobado, no enseñado por el apunte. Ver ADR-015.</w:t>
+            </w:r>
+          </w:p>
+        </w:tc>
+      </w:tr>
+      <w:tr>
+        <w:trPr>
+          <w:tblHeader w:val="false"/>
+        </w:trPr>
+        <w:tc>
+          <w:tcPr>
+            <w:tcW w:type="dxa" w:w="747"/>
+            <w:tcBorders>
+              <w:top w:val="single" w:color="BFBFBF" w:sz="4"/>
+              <w:left w:val="single" w:color="BFBFBF" w:sz="4"/>
+              <w:bottom w:val="single" w:color="BFBFBF" w:sz="4"/>
+              <w:right w:val="single" w:color="BFBFBF" w:sz="4"/>
+            </w:tcBorders>
+            <w:shd w:fill="F2F6FA" w:color="auto" w:val="clear"/>
+            <w:tcMar>
+              <w:top w:type="dxa" w:w="60"/>
+              <w:left w:type="dxa" w:w="100"/>
+              <w:bottom w:type="dxa" w:w="60"/>
+              <w:right w:type="dxa" w:w="100"/>
+            </w:tcMar>
+          </w:tcPr>
+          <w:p>
+            <w:pPr>
+              <w:spacing w:after="0"/>
+            </w:pPr>
+            <w:r>
+              <w:rPr>
+                <w:sz w:val="18"/>
+                <w:szCs w:val="18"/>
+              </w:rPr>
+              <w:t xml:space="preserve">D-55</w:t>
+            </w:r>
+          </w:p>
+        </w:tc>
+        <w:tc>
+          <w:tcPr>
+            <w:tcW w:type="dxa" w:w="4408"/>
+            <w:tcBorders>
+              <w:top w:val="single" w:color="BFBFBF" w:sz="4"/>
+              <w:left w:val="single" w:color="BFBFBF" w:sz="4"/>
+              <w:bottom w:val="single" w:color="BFBFBF" w:sz="4"/>
+              <w:right w:val="single" w:color="BFBFBF" w:sz="4"/>
+            </w:tcBorders>
+            <w:shd w:fill="F2F6FA" w:color="auto" w:val="clear"/>
+            <w:tcMar>
+              <w:top w:type="dxa" w:w="60"/>
+              <w:left w:type="dxa" w:w="100"/>
+              <w:bottom w:type="dxa" w:w="60"/>
+              <w:right w:type="dxa" w:w="100"/>
+            </w:tcMar>
+          </w:tcPr>
+          <w:p>
+            <w:pPr>
+              <w:spacing w:after="0"/>
+            </w:pPr>
+            <w:r>
+              <w:rPr>
+                <w:sz w:val="18"/>
+                <w:szCs w:val="18"/>
+              </w:rPr>
+              <w:t xml:space="preserve">Historial de trazas de la demostración</w:t>
+            </w:r>
+          </w:p>
+        </w:tc>
+        <w:tc>
+          <w:tcPr>
+            <w:tcW w:type="dxa" w:w="4483"/>
+            <w:tcBorders>
+              <w:top w:val="single" w:color="BFBFBF" w:sz="4"/>
+              <w:left w:val="single" w:color="BFBFBF" w:sz="4"/>
+              <w:bottom w:val="single" w:color="BFBFBF" w:sz="4"/>
+              <w:right w:val="single" w:color="BFBFBF" w:sz="4"/>
+            </w:tcBorders>
+            <w:shd w:fill="F2F6FA" w:color="auto" w:val="clear"/>
+            <w:tcMar>
+              <w:top w:type="dxa" w:w="60"/>
+              <w:left w:type="dxa" w:w="100"/>
+              <w:bottom w:type="dxa" w:w="60"/>
+              <w:right w:type="dxa" w:w="100"/>
+            </w:tcMar>
+          </w:tcPr>
+          <w:p>
+            <w:pPr>
+              <w:spacing w:after="0"/>
+            </w:pPr>
+            <w:r>
+              <w:rPr>
+                <w:sz w:val="18"/>
+                <w:szCs w:val="18"/>
+              </w:rPr>
+              <w:t xml:space="preserve">Aprobado el 16/10/2026: Jaeger conserva trazas en memoria; reiniciarlo pierde el historial. Exportar una evidencia sanitizada al repositorio. Evita otra base para la primera traza de Entrega 2. Correlación/trazabilidad: pp. 7–8; Jaeger y su configuración son adicionales, no contenido del teórico. ADR-011 v2; etapa 4.</w:t>
             </w:r>
           </w:p>
         </w:tc>
@@ -6678,6 +6773,132 @@
           </w:p>
         </w:tc>
       </w:tr>
+      <w:tr>
+        <w:trPr>
+          <w:tblHeader w:val="false"/>
+        </w:trPr>
+        <w:tc>
+          <w:tcPr>
+            <w:tcW w:type="dxa" w:w="2029"/>
+            <w:tcBorders>
+              <w:top w:val="single" w:color="BFBFBF" w:sz="4"/>
+              <w:left w:val="single" w:color="BFBFBF" w:sz="4"/>
+              <w:bottom w:val="single" w:color="BFBFBF" w:sz="4"/>
+              <w:right w:val="single" w:color="BFBFBF" w:sz="4"/>
+            </w:tcBorders>
+            <w:tcMar>
+              <w:top w:type="dxa" w:w="60"/>
+              <w:left w:type="dxa" w:w="100"/>
+              <w:bottom w:type="dxa" w:w="60"/>
+              <w:right w:type="dxa" w:w="100"/>
+            </w:tcMar>
+          </w:tcPr>
+          <w:p>
+            <w:pPr>
+              <w:spacing w:after="0"/>
+            </w:pPr>
+            <w:r>
+              <w:rPr>
+                <w:sz w:val="18"/>
+                <w:szCs w:val="18"/>
+              </w:rPr>
+              <w:t xml:space="preserve">16/10/2026</w:t>
+            </w:r>
+          </w:p>
+        </w:tc>
+        <w:tc>
+          <w:tcPr>
+            <w:tcW w:type="dxa" w:w="7609"/>
+            <w:tcBorders>
+              <w:top w:val="single" w:color="BFBFBF" w:sz="4"/>
+              <w:left w:val="single" w:color="BFBFBF" w:sz="4"/>
+              <w:bottom w:val="single" w:color="BFBFBF" w:sz="4"/>
+              <w:right w:val="single" w:color="BFBFBF" w:sz="4"/>
+            </w:tcBorders>
+            <w:tcMar>
+              <w:top w:type="dxa" w:w="60"/>
+              <w:left w:type="dxa" w:w="100"/>
+              <w:bottom w:type="dxa" w:w="60"/>
+              <w:right w:type="dxa" w:w="100"/>
+            </w:tcMar>
+          </w:tcPr>
+          <w:p>
+            <w:pPr>
+              <w:spacing w:after="0"/>
+            </w:pPr>
+            <w:r>
+              <w:rPr>
+                <w:sz w:val="18"/>
+                <w:szCs w:val="18"/>
+              </w:rPr>
+              <w:t xml:space="preserve">Se agrega D-55: Jaeger en memoria y evidencia exportada, aprobado para la etapa 4.</w:t>
+            </w:r>
+          </w:p>
+        </w:tc>
+      </w:tr>
+      <w:tr>
+        <w:trPr>
+          <w:tblHeader w:val="false"/>
+        </w:trPr>
+        <w:tc>
+          <w:tcPr>
+            <w:tcW w:type="dxa" w:w="2029"/>
+            <w:tcBorders>
+              <w:top w:val="single" w:color="BFBFBF" w:sz="4"/>
+              <w:left w:val="single" w:color="BFBFBF" w:sz="4"/>
+              <w:bottom w:val="single" w:color="BFBFBF" w:sz="4"/>
+              <w:right w:val="single" w:color="BFBFBF" w:sz="4"/>
+            </w:tcBorders>
+            <w:tcMar>
+              <w:top w:type="dxa" w:w="60"/>
+              <w:left w:type="dxa" w:w="100"/>
+              <w:bottom w:type="dxa" w:w="60"/>
+              <w:right w:type="dxa" w:w="100"/>
+            </w:tcMar>
+          </w:tcPr>
+          <w:p>
+            <w:pPr>
+              <w:spacing w:after="0"/>
+            </w:pPr>
+            <w:r>
+              <w:rPr>
+                <w:sz w:val="18"/>
+                <w:szCs w:val="18"/>
+              </w:rPr>
+              <w:t xml:space="preserve">16/10/2026</w:t>
+            </w:r>
+          </w:p>
+        </w:tc>
+        <w:tc>
+          <w:tcPr>
+            <w:tcW w:type="dxa" w:w="7609"/>
+            <w:tcBorders>
+              <w:top w:val="single" w:color="BFBFBF" w:sz="4"/>
+              <w:left w:val="single" w:color="BFBFBF" w:sz="4"/>
+              <w:bottom w:val="single" w:color="BFBFBF" w:sz="4"/>
+              <w:right w:val="single" w:color="BFBFBF" w:sz="4"/>
+            </w:tcBorders>
+            <w:tcMar>
+              <w:top w:type="dxa" w:w="60"/>
+              <w:left w:type="dxa" w:w="100"/>
+              <w:bottom w:type="dxa" w:w="60"/>
+              <w:right w:type="dxa" w:w="100"/>
+            </w:tcMar>
+          </w:tcPr>
+          <w:p>
+            <w:pPr>
+              <w:spacing w:after="0"/>
+            </w:pPr>
+            <w:r>
+              <w:rPr>
+                <w:sz w:val="18"/>
+                <w:szCs w:val="18"/>
+              </w:rPr>
+              <w:t xml:space="preserve">D-48: primera traza real y logs exportados en etapa 4; métricas y alertas siguen pendientes.</w:t>
+            </w:r>
+          </w:p>
+        </w:tc>
+      </w:tr>
     </w:tbl>
     <w:p>
       <w:pPr>
@@ -7535,6 +7756,110 @@
                 <w:szCs w:val="18"/>
               </w:rPr>
               <w:t xml:space="preserve">Medir antes de elegir mejoras o afirmar capacidad. k6 y percentiles son instrumentos adicionales aprobados; cargas y objetivos son propios y todavía no medidos.</w:t>
+            </w:r>
+          </w:p>
+        </w:tc>
+      </w:tr>
+      <w:tr>
+        <w:trPr>
+          <w:tblHeader/>
+        </w:trPr>
+        <w:tc>
+          <w:tcPr>
+            <w:tcW w:type="dxa" w:w="747"/>
+            <w:tcBorders>
+              <w:top w:val="single" w:color="BFBFBF" w:sz="4"/>
+              <w:left w:val="single" w:color="BFBFBF" w:sz="4"/>
+              <w:bottom w:val="single" w:color="BFBFBF" w:sz="4"/>
+              <w:right w:val="single" w:color="BFBFBF" w:sz="4"/>
+            </w:tcBorders>
+            <w:shd w:fill="1F4E79" w:color="auto" w:val="clear"/>
+            <w:tcMar>
+              <w:top w:type="dxa" w:w="60"/>
+              <w:left w:type="dxa" w:w="100"/>
+              <w:bottom w:type="dxa" w:w="60"/>
+              <w:right w:type="dxa" w:w="100"/>
+            </w:tcMar>
+          </w:tcPr>
+          <w:p>
+            <w:pPr>
+              <w:spacing w:after="0"/>
+            </w:pPr>
+            <w:r>
+              <w:rPr>
+                <w:b/>
+                <w:bCs/>
+                <w:color w:val="FFFFFF"/>
+                <w:sz w:val="18"/>
+                <w:szCs w:val="18"/>
+              </w:rPr>
+              <w:t xml:space="preserve">D-55</w:t>
+            </w:r>
+          </w:p>
+        </w:tc>
+        <w:tc>
+          <w:tcPr>
+            <w:tcW w:type="dxa" w:w="4408"/>
+            <w:tcBorders>
+              <w:top w:val="single" w:color="BFBFBF" w:sz="4"/>
+              <w:left w:val="single" w:color="BFBFBF" w:sz="4"/>
+              <w:bottom w:val="single" w:color="BFBFBF" w:sz="4"/>
+              <w:right w:val="single" w:color="BFBFBF" w:sz="4"/>
+            </w:tcBorders>
+            <w:shd w:fill="1F4E79" w:color="auto" w:val="clear"/>
+            <w:tcMar>
+              <w:top w:type="dxa" w:w="60"/>
+              <w:left w:type="dxa" w:w="100"/>
+              <w:bottom w:type="dxa" w:w="60"/>
+              <w:right w:type="dxa" w:w="100"/>
+            </w:tcMar>
+          </w:tcPr>
+          <w:p>
+            <w:pPr>
+              <w:spacing w:after="0"/>
+            </w:pPr>
+            <w:r>
+              <w:rPr>
+                <w:b/>
+                <w:bCs/>
+                <w:color w:val="FFFFFF"/>
+                <w:sz w:val="18"/>
+                <w:szCs w:val="18"/>
+              </w:rPr>
+              <w:t xml:space="preserve">Correlación y trazabilidad, pp. 7–8; primera traza exigida en Entrega 2.</w:t>
+            </w:r>
+          </w:p>
+        </w:tc>
+        <w:tc>
+          <w:tcPr>
+            <w:tcW w:type="dxa" w:w="4483"/>
+            <w:tcBorders>
+              <w:top w:val="single" w:color="BFBFBF" w:sz="4"/>
+              <w:left w:val="single" w:color="BFBFBF" w:sz="4"/>
+              <w:bottom w:val="single" w:color="BFBFBF" w:sz="4"/>
+              <w:right w:val="single" w:color="BFBFBF" w:sz="4"/>
+            </w:tcBorders>
+            <w:shd w:fill="1F4E79" w:color="auto" w:val="clear"/>
+            <w:tcMar>
+              <w:top w:type="dxa" w:w="60"/>
+              <w:left w:type="dxa" w:w="100"/>
+              <w:bottom w:type="dxa" w:w="60"/>
+              <w:right w:type="dxa" w:w="100"/>
+            </w:tcMar>
+          </w:tcPr>
+          <w:p>
+            <w:pPr>
+              <w:spacing w:after="0"/>
+            </w:pPr>
+            <w:r>
+              <w:rPr>
+                <w:b/>
+                <w:bCs/>
+                <w:color w:val="FFFFFF"/>
+                <w:sz w:val="18"/>
+                <w:szCs w:val="18"/>
+              </w:rPr>
+              <w:t xml:space="preserve">Memoria con exportación evita otra base y conserva evidencia revisable. Historial de pantalla volátil; no es retención productiva. Herramientas adicionales aprobadas en D-48.</w:t>
             </w:r>
           </w:p>
         </w:tc>

</xml_diff>

<commit_message>
docs: registrar evidencia y postmortem de resiliencia de etapa 6
</commit_message>
<xml_diff>
--- a/Registro_de_Decisiones_Gimnasio.docx
+++ b/Registro_de_Decisiones_Gimnasio.docx
@@ -3971,7 +3971,7 @@
                 <w:sz w:val="18"/>
                 <w:szCs w:val="18"/>
               </w:rPr>
-              <w:t xml:space="preserve">Aprobado el 16/10/2026: Benefits limita su operación de aplicación y PostgreSQL a 4 segundos, o al tiempo restante del contexto si es menor, dentro de los 5 segundos del gateway. Implementación y validación pendientes. Ver ADR-010.</w:t>
+              <w:t xml:space="preserve">Aprobado el 16/10/2026: Benefits limita su operación de aplicación y PostgreSQL a 4 segundos, o al tiempo restante del contexto si es menor, dentro de los 5 segundos del gateway. Implementado en etapa 3 y validado en etapa 6 con la tolerancia de medición D-56, sin cambiar el presupuesto. Ver ADR-010 v2.</w:t>
             </w:r>
           </w:p>
         </w:tc>
@@ -4351,7 +4351,7 @@
                 <w:sz w:val="18"/>
                 <w:szCs w:val="18"/>
               </w:rPr>
-              <w:t xml:space="preserve">Aprobado el 16/10/2026: el gateway no reintenta escrituras automáticamente; el partner recupera el resultado reintentando con la misma Idempotency-Key. Benefits falla cerrado si PostgreSQL no permite confirmar la operación; un resultado de commit indeterminado no implica rollback. Se conserva el presupuesto D-43 y no se incorpora circuit breaker al flujo inicial Gateway → Benefits. Implementación y prueba de caída sin duplicación pendientes. Ver ADR-010.</w:t>
+              <w:t xml:space="preserve">Aprobado el 16/10/2026: el gateway no reintenta escrituras automáticamente; el partner recupera el resultado reintentando con la misma Idempotency-Key. Benefits falla cerrado si PostgreSQL no permite confirmar la operación; un resultado de commit indeterminado no implica rollback. Se conserva el presupuesto D-43 y no se incorpora circuit breaker al flujo inicial Gateway → Benefits. Implementado y validado en etapa 6: 502/503/504, recuperación de respuesta confirmada y ausencia de duplicados. Ver ADR-010 v2 y POSTMORTEM.</w:t>
             </w:r>
           </w:p>
         </w:tc>
@@ -5112,6 +5112,101 @@
                 <w:szCs w:val="18"/>
               </w:rPr>
               <w:t xml:space="preserve">Aprobado el 16/10/2026: Jaeger conserva trazas en memoria; reiniciarlo pierde el historial. Exportar una evidencia sanitizada al repositorio. Evita otra base para la primera traza de Entrega 2. Correlación/trazabilidad: pp. 7–8; Jaeger y su configuración son adicionales, no contenido del teórico. ADR-011 v2; etapa 4.</w:t>
+            </w:r>
+          </w:p>
+        </w:tc>
+      </w:tr>
+      <w:tr>
+        <w:trPr>
+          <w:tblHeader w:val="false"/>
+        </w:trPr>
+        <w:tc>
+          <w:tcPr>
+            <w:tcW w:type="dxa" w:w="747"/>
+            <w:tcBorders>
+              <w:top w:val="single" w:color="BFBFBF" w:sz="4"/>
+              <w:left w:val="single" w:color="BFBFBF" w:sz="4"/>
+              <w:bottom w:val="single" w:color="BFBFBF" w:sz="4"/>
+              <w:right w:val="single" w:color="BFBFBF" w:sz="4"/>
+            </w:tcBorders>
+            <w:shd w:fill="F2F6FA" w:color="auto" w:val="clear"/>
+            <w:tcMar>
+              <w:top w:type="dxa" w:w="60"/>
+              <w:left w:type="dxa" w:w="100"/>
+              <w:bottom w:type="dxa" w:w="60"/>
+              <w:right w:type="dxa" w:w="100"/>
+            </w:tcMar>
+          </w:tcPr>
+          <w:p>
+            <w:pPr>
+              <w:spacing w:after="0"/>
+            </w:pPr>
+            <w:r>
+              <w:rPr>
+                <w:sz w:val="18"/>
+                <w:szCs w:val="18"/>
+              </w:rPr>
+              <w:t xml:space="preserve">D-56</w:t>
+            </w:r>
+          </w:p>
+        </w:tc>
+        <w:tc>
+          <w:tcPr>
+            <w:tcW w:type="dxa" w:w="4408"/>
+            <w:tcBorders>
+              <w:top w:val="single" w:color="BFBFBF" w:sz="4"/>
+              <w:left w:val="single" w:color="BFBFBF" w:sz="4"/>
+              <w:bottom w:val="single" w:color="BFBFBF" w:sz="4"/>
+              <w:right w:val="single" w:color="BFBFBF" w:sz="4"/>
+            </w:tcBorders>
+            <w:shd w:fill="F2F6FA" w:color="auto" w:val="clear"/>
+            <w:tcMar>
+              <w:top w:type="dxa" w:w="60"/>
+              <w:left w:type="dxa" w:w="100"/>
+              <w:bottom w:type="dxa" w:w="60"/>
+              <w:right w:type="dxa" w:w="100"/>
+            </w:tcMar>
+          </w:tcPr>
+          <w:p>
+            <w:pPr>
+              <w:spacing w:after="0"/>
+            </w:pPr>
+            <w:r>
+              <w:rPr>
+                <w:sz w:val="18"/>
+                <w:szCs w:val="18"/>
+              </w:rPr>
+              <w:t xml:space="preserve">Tolerancia de medición del ejercicio de resiliencia</w:t>
+            </w:r>
+          </w:p>
+        </w:tc>
+        <w:tc>
+          <w:tcPr>
+            <w:tcW w:type="dxa" w:w="4483"/>
+            <w:tcBorders>
+              <w:top w:val="single" w:color="BFBFBF" w:sz="4"/>
+              <w:left w:val="single" w:color="BFBFBF" w:sz="4"/>
+              <w:bottom w:val="single" w:color="BFBFBF" w:sz="4"/>
+              <w:right w:val="single" w:color="BFBFBF" w:sz="4"/>
+            </w:tcBorders>
+            <w:shd w:fill="F2F6FA" w:color="auto" w:val="clear"/>
+            <w:tcMar>
+              <w:top w:type="dxa" w:w="60"/>
+              <w:left w:type="dxa" w:w="100"/>
+              <w:bottom w:type="dxa" w:w="60"/>
+              <w:right w:type="dxa" w:w="100"/>
+            </w:tcMar>
+          </w:tcPr>
+          <w:p>
+            <w:pPr>
+              <w:spacing w:after="0"/>
+            </w:pPr>
+            <w:r>
+              <w:rPr>
+                <w:sz w:val="18"/>
+                <w:szCs w:val="18"/>
+              </w:rPr>
+              <w:t xml:space="preserve">Aprobado el 16/10/2026: admitir hasta 500 ms adicionales al medir de punta a punta los presupuestos de 4 s en Benefits y 5 s en Gateway. No se cambian timeouts del código ni se define un SLA. Motivo: distinguir transporte y planificación local de la espera protegida. Fundamento: presupuestos y pruebas de fallas, pp. 101–105 y 113–116; el margen es un parámetro propio del ejercicio, no un valor del teórico.</w:t>
             </w:r>
           </w:p>
         </w:tc>
@@ -6899,6 +6994,132 @@
           </w:p>
         </w:tc>
       </w:tr>
+      <w:tr>
+        <w:trPr>
+          <w:tblHeader w:val="false"/>
+        </w:trPr>
+        <w:tc>
+          <w:tcPr>
+            <w:tcW w:type="dxa" w:w="2029"/>
+            <w:tcBorders>
+              <w:top w:val="single" w:color="BFBFBF" w:sz="4"/>
+              <w:left w:val="single" w:color="BFBFBF" w:sz="4"/>
+              <w:bottom w:val="single" w:color="BFBFBF" w:sz="4"/>
+              <w:right w:val="single" w:color="BFBFBF" w:sz="4"/>
+            </w:tcBorders>
+            <w:tcMar>
+              <w:top w:type="dxa" w:w="60"/>
+              <w:left w:type="dxa" w:w="100"/>
+              <w:bottom w:type="dxa" w:w="60"/>
+              <w:right w:type="dxa" w:w="100"/>
+            </w:tcMar>
+          </w:tcPr>
+          <w:p>
+            <w:pPr>
+              <w:spacing w:after="0"/>
+            </w:pPr>
+            <w:r>
+              <w:rPr>
+                <w:sz w:val="18"/>
+                <w:szCs w:val="18"/>
+              </w:rPr>
+              <w:t xml:space="preserve">16/10/2026</w:t>
+            </w:r>
+          </w:p>
+        </w:tc>
+        <w:tc>
+          <w:tcPr>
+            <w:tcW w:type="dxa" w:w="7609"/>
+            <w:tcBorders>
+              <w:top w:val="single" w:color="BFBFBF" w:sz="4"/>
+              <w:left w:val="single" w:color="BFBFBF" w:sz="4"/>
+              <w:bottom w:val="single" w:color="BFBFBF" w:sz="4"/>
+              <w:right w:val="single" w:color="BFBFBF" w:sz="4"/>
+            </w:tcBorders>
+            <w:tcMar>
+              <w:top w:type="dxa" w:w="60"/>
+              <w:left w:type="dxa" w:w="100"/>
+              <w:bottom w:type="dxa" w:w="60"/>
+              <w:right w:type="dxa" w:w="100"/>
+            </w:tcMar>
+          </w:tcPr>
+          <w:p>
+            <w:pPr>
+              <w:spacing w:after="0"/>
+            </w:pPr>
+            <w:r>
+              <w:rPr>
+                <w:sz w:val="18"/>
+                <w:szCs w:val="18"/>
+              </w:rPr>
+              <w:t xml:space="preserve">Se agrega D-56: tolerancia de medición del ejercicio de etapa 6; presupuestos funcionales sin cambios.</w:t>
+            </w:r>
+          </w:p>
+        </w:tc>
+      </w:tr>
+      <w:tr>
+        <w:trPr>
+          <w:tblHeader w:val="false"/>
+        </w:trPr>
+        <w:tc>
+          <w:tcPr>
+            <w:tcW w:type="dxa" w:w="2029"/>
+            <w:tcBorders>
+              <w:top w:val="single" w:color="BFBFBF" w:sz="4"/>
+              <w:left w:val="single" w:color="BFBFBF" w:sz="4"/>
+              <w:bottom w:val="single" w:color="BFBFBF" w:sz="4"/>
+              <w:right w:val="single" w:color="BFBFBF" w:sz="4"/>
+            </w:tcBorders>
+            <w:tcMar>
+              <w:top w:type="dxa" w:w="60"/>
+              <w:left w:type="dxa" w:w="100"/>
+              <w:bottom w:type="dxa" w:w="60"/>
+              <w:right w:type="dxa" w:w="100"/>
+            </w:tcMar>
+          </w:tcPr>
+          <w:p>
+            <w:pPr>
+              <w:spacing w:after="0"/>
+            </w:pPr>
+            <w:r>
+              <w:rPr>
+                <w:sz w:val="18"/>
+                <w:szCs w:val="18"/>
+              </w:rPr>
+              <w:t xml:space="preserve">16/10/2026</w:t>
+            </w:r>
+          </w:p>
+        </w:tc>
+        <w:tc>
+          <w:tcPr>
+            <w:tcW w:type="dxa" w:w="7609"/>
+            <w:tcBorders>
+              <w:top w:val="single" w:color="BFBFBF" w:sz="4"/>
+              <w:left w:val="single" w:color="BFBFBF" w:sz="4"/>
+              <w:bottom w:val="single" w:color="BFBFBF" w:sz="4"/>
+              <w:right w:val="single" w:color="BFBFBF" w:sz="4"/>
+            </w:tcBorders>
+            <w:tcMar>
+              <w:top w:type="dxa" w:w="60"/>
+              <w:left w:type="dxa" w:w="100"/>
+              <w:bottom w:type="dxa" w:w="60"/>
+              <w:right w:type="dxa" w:w="100"/>
+            </w:tcMar>
+          </w:tcPr>
+          <w:p>
+            <w:pPr>
+              <w:spacing w:after="0"/>
+            </w:pPr>
+            <w:r>
+              <w:rPr>
+                <w:sz w:val="18"/>
+                <w:szCs w:val="18"/>
+              </w:rPr>
+              <w:t xml:space="preserve">D-43/D-47: presupuestos y recuperación idempotente validados en etapa 6; postmortem y evidencia exportada.</w:t>
+            </w:r>
+          </w:p>
+        </w:tc>
+      </w:tr>
     </w:tbl>
     <w:p>
       <w:pPr>
@@ -7860,6 +8081,110 @@
                 <w:szCs w:val="18"/>
               </w:rPr>
               <w:t xml:space="preserve">Memoria con exportación evita otra base y conserva evidencia revisable. Historial de pantalla volátil; no es retención productiva. Herramientas adicionales aprobadas en D-48.</w:t>
+            </w:r>
+          </w:p>
+        </w:tc>
+      </w:tr>
+      <w:tr>
+        <w:trPr>
+          <w:tblHeader/>
+        </w:trPr>
+        <w:tc>
+          <w:tcPr>
+            <w:tcW w:type="dxa" w:w="747"/>
+            <w:tcBorders>
+              <w:top w:val="single" w:color="BFBFBF" w:sz="4"/>
+              <w:left w:val="single" w:color="BFBFBF" w:sz="4"/>
+              <w:bottom w:val="single" w:color="BFBFBF" w:sz="4"/>
+              <w:right w:val="single" w:color="BFBFBF" w:sz="4"/>
+            </w:tcBorders>
+            <w:shd w:fill="1F4E79" w:color="auto" w:val="clear"/>
+            <w:tcMar>
+              <w:top w:type="dxa" w:w="60"/>
+              <w:left w:type="dxa" w:w="100"/>
+              <w:bottom w:type="dxa" w:w="60"/>
+              <w:right w:type="dxa" w:w="100"/>
+            </w:tcMar>
+          </w:tcPr>
+          <w:p>
+            <w:pPr>
+              <w:spacing w:after="0"/>
+            </w:pPr>
+            <w:r>
+              <w:rPr>
+                <w:b/>
+                <w:bCs/>
+                <w:color w:val="FFFFFF"/>
+                <w:sz w:val="18"/>
+                <w:szCs w:val="18"/>
+              </w:rPr>
+              <w:t xml:space="preserve">D-56</w:t>
+            </w:r>
+          </w:p>
+        </w:tc>
+        <w:tc>
+          <w:tcPr>
+            <w:tcW w:type="dxa" w:w="4408"/>
+            <w:tcBorders>
+              <w:top w:val="single" w:color="BFBFBF" w:sz="4"/>
+              <w:left w:val="single" w:color="BFBFBF" w:sz="4"/>
+              <w:bottom w:val="single" w:color="BFBFBF" w:sz="4"/>
+              <w:right w:val="single" w:color="BFBFBF" w:sz="4"/>
+            </w:tcBorders>
+            <w:shd w:fill="1F4E79" w:color="auto" w:val="clear"/>
+            <w:tcMar>
+              <w:top w:type="dxa" w:w="60"/>
+              <w:left w:type="dxa" w:w="100"/>
+              <w:bottom w:type="dxa" w:w="60"/>
+              <w:right w:type="dxa" w:w="100"/>
+            </w:tcMar>
+          </w:tcPr>
+          <w:p>
+            <w:pPr>
+              <w:spacing w:after="0"/>
+            </w:pPr>
+            <w:r>
+              <w:rPr>
+                <w:b/>
+                <w:bCs/>
+                <w:color w:val="FFFFFF"/>
+                <w:sz w:val="18"/>
+                <w:szCs w:val="18"/>
+              </w:rPr>
+              <w:t xml:space="preserve">Presupuestos y pruebas de fallas, pp. 101–105 y 113–116.</w:t>
+            </w:r>
+          </w:p>
+        </w:tc>
+        <w:tc>
+          <w:tcPr>
+            <w:tcW w:type="dxa" w:w="4483"/>
+            <w:tcBorders>
+              <w:top w:val="single" w:color="BFBFBF" w:sz="4"/>
+              <w:left w:val="single" w:color="BFBFBF" w:sz="4"/>
+              <w:bottom w:val="single" w:color="BFBFBF" w:sz="4"/>
+              <w:right w:val="single" w:color="BFBFBF" w:sz="4"/>
+            </w:tcBorders>
+            <w:shd w:fill="1F4E79" w:color="auto" w:val="clear"/>
+            <w:tcMar>
+              <w:top w:type="dxa" w:w="60"/>
+              <w:left w:type="dxa" w:w="100"/>
+              <w:bottom w:type="dxa" w:w="60"/>
+              <w:right w:type="dxa" w:w="100"/>
+            </w:tcMar>
+          </w:tcPr>
+          <w:p>
+            <w:pPr>
+              <w:spacing w:after="0"/>
+            </w:pPr>
+            <w:r>
+              <w:rPr>
+                <w:b/>
+                <w:bCs/>
+                <w:color w:val="FFFFFF"/>
+                <w:sz w:val="18"/>
+                <w:szCs w:val="18"/>
+              </w:rPr>
+              <w:t xml:space="preserve">Margen de medición local aprobado para transporte y planificación; no amplía el contexto del negocio, no es SLA ni cifra del teórico.</w:t>
             </w:r>
           </w:p>
         </w:tc>

</xml_diff>

<commit_message>
docs: registrar capacidad costos y decisiones de etapa 7
</commit_message>
<xml_diff>
--- a/Registro_de_Decisiones_Gimnasio.docx
+++ b/Registro_de_Decisiones_Gimnasio.docx
@@ -4636,7 +4636,7 @@
                 <w:sz w:val="18"/>
                 <w:szCs w:val="18"/>
               </w:rPr>
-              <w:t xml:space="preserve">Aprobado el 16/10/2026: usar k6 como herramienta adicional justificada para las pruebas de carga del TP, con 100 cuentas y escalones de 1, 5 y 10 usuarios simultáneos. Objetivos iniciales: cero duplicaciones, p95 de lecturas &lt; 200 ms y escrituras &lt; 500 ms. Comparar al menos dos mejoras y estimar costos con fecha y fuentes. Mediciones y cotización pendientes. Se prioriza lo visto en clase y se consulta cada excepción nueva; esta aprobación no amplía el stack en general. Ver ADR-013.</w:t>
+              <w:t xml:space="preserve">Aprobado el 16/10/2026: usar k6 como herramienta adicional justificada para las pruebas de carga del TP, con 100 cuentas y escalones de 1, 5 y 10 usuarios simultáneos. Objetivos iniciales: cero duplicaciones, p95 de lecturas &lt; 200 ms y escrituras &lt; 500 ms. Comparar al menos dos mejoras y estimar costos con fecha y fuentes. Etapa 7 completó 36 fases locales, sin fallas funcionales ni inconsistencias; objetivos iniciales cumplidos. Experimento sin pausa: contención sobre una cuenta y p95 de 472,24 ms con 10 VU; no es capacidad máxima universal. Alternativas y costos fechados São Paulo USD/ARS documentados. Se prioriza clase y cada excepción se consulta. Ver ADR-013 v2 y ETAPA_7_CAPACIDAD_COSTOS.md.</w:t>
             </w:r>
           </w:p>
         </w:tc>
@@ -5207,6 +5207,386 @@
                 <w:szCs w:val="18"/>
               </w:rPr>
               <w:t xml:space="preserve">Aprobado el 16/10/2026: admitir hasta 500 ms adicionales al medir de punta a punta los presupuestos de 4 s en Benefits y 5 s en Gateway. No se cambian timeouts del código ni se define un SLA. Motivo: distinguir transporte y planificación local de la espera protegida. Fundamento: presupuestos y pruebas de fallas, pp. 101–105 y 113–116; el margen es un parámetro propio del ejercicio, no un valor del teórico.</w:t>
+            </w:r>
+          </w:p>
+        </w:tc>
+      </w:tr>
+      <w:tr>
+        <w:trPr>
+          <w:tblHeader w:val="false"/>
+        </w:trPr>
+        <w:tc>
+          <w:tcPr>
+            <w:tcW w:type="dxa" w:w="747"/>
+            <w:tcBorders>
+              <w:top w:val="single" w:color="BFBFBF" w:sz="4"/>
+              <w:left w:val="single" w:color="BFBFBF" w:sz="4"/>
+              <w:bottom w:val="single" w:color="BFBFBF" w:sz="4"/>
+              <w:right w:val="single" w:color="BFBFBF" w:sz="4"/>
+            </w:tcBorders>
+            <w:shd w:fill="F2F6FA" w:color="auto" w:val="clear"/>
+            <w:tcMar>
+              <w:top w:type="dxa" w:w="60"/>
+              <w:left w:type="dxa" w:w="100"/>
+              <w:bottom w:type="dxa" w:w="60"/>
+              <w:right w:type="dxa" w:w="100"/>
+            </w:tcMar>
+          </w:tcPr>
+          <w:p>
+            <w:pPr>
+              <w:spacing w:after="0"/>
+            </w:pPr>
+            <w:r>
+              <w:rPr>
+                <w:sz w:val="18"/>
+                <w:szCs w:val="18"/>
+              </w:rPr>
+              <w:t xml:space="preserve">D-57</w:t>
+            </w:r>
+          </w:p>
+        </w:tc>
+        <w:tc>
+          <w:tcPr>
+            <w:tcW w:type="dxa" w:w="4408"/>
+            <w:tcBorders>
+              <w:top w:val="single" w:color="BFBFBF" w:sz="4"/>
+              <w:left w:val="single" w:color="BFBFBF" w:sz="4"/>
+              <w:bottom w:val="single" w:color="BFBFBF" w:sz="4"/>
+              <w:right w:val="single" w:color="BFBFBF" w:sz="4"/>
+            </w:tcBorders>
+            <w:shd w:fill="F2F6FA" w:color="auto" w:val="clear"/>
+            <w:tcMar>
+              <w:top w:type="dxa" w:w="60"/>
+              <w:left w:type="dxa" w:w="100"/>
+              <w:bottom w:type="dxa" w:w="60"/>
+              <w:right w:type="dxa" w:w="100"/>
+            </w:tcMar>
+          </w:tcPr>
+          <w:p>
+            <w:pPr>
+              <w:spacing w:after="0"/>
+            </w:pPr>
+            <w:r>
+              <w:rPr>
+                <w:sz w:val="18"/>
+                <w:szCs w:val="18"/>
+              </w:rPr>
+              <w:t xml:space="preserve">Datos y ritmo inicial de las pruebas de carga</w:t>
+            </w:r>
+          </w:p>
+        </w:tc>
+        <w:tc>
+          <w:tcPr>
+            <w:tcW w:type="dxa" w:w="4483"/>
+            <w:tcBorders>
+              <w:top w:val="single" w:color="BFBFBF" w:sz="4"/>
+              <w:left w:val="single" w:color="BFBFBF" w:sz="4"/>
+              <w:bottom w:val="single" w:color="BFBFBF" w:sz="4"/>
+              <w:right w:val="single" w:color="BFBFBF" w:sz="4"/>
+            </w:tcBorders>
+            <w:shd w:fill="F2F6FA" w:color="auto" w:val="clear"/>
+            <w:tcMar>
+              <w:top w:type="dxa" w:w="60"/>
+              <w:left w:type="dxa" w:w="100"/>
+              <w:bottom w:type="dxa" w:w="60"/>
+              <w:right w:type="dxa" w:w="100"/>
+            </w:tcMar>
+          </w:tcPr>
+          <w:p>
+            <w:pPr>
+              <w:spacing w:after="0"/>
+            </w:pPr>
+            <w:r>
+              <w:rPr>
+                <w:sz w:val="18"/>
+                <w:szCs w:val="18"/>
+              </w:rPr>
+              <w:t xml:space="preserve">Aprobado el 16/10/2026: pausa de 100 ms por iteración y 100 cuentas con 10 movimientos sintéticos iniciales cada una. Cada usuario virtual dispone de una clave ya confirmada para replay. Motivo: comenzar con carga acotada y distinguir replay de contención por una misma clave. Se registra si limita la aplicación o el generador; esta carga no demuestra capacidad máxima. Fundamento: capacidad, latencia y límites, pp. 29–30, 86 y 101–102; son parámetros propios, no valores del teórico. Complementa D-50; etapa 7.</w:t>
+            </w:r>
+          </w:p>
+        </w:tc>
+      </w:tr>
+      <w:tr>
+        <w:trPr>
+          <w:tblHeader w:val="false"/>
+        </w:trPr>
+        <w:tc>
+          <w:tcPr>
+            <w:tcW w:type="dxa" w:w="747"/>
+            <w:tcBorders>
+              <w:top w:val="single" w:color="BFBFBF" w:sz="4"/>
+              <w:left w:val="single" w:color="BFBFBF" w:sz="4"/>
+              <w:bottom w:val="single" w:color="BFBFBF" w:sz="4"/>
+              <w:right w:val="single" w:color="BFBFBF" w:sz="4"/>
+            </w:tcBorders>
+            <w:shd w:fill="F2F6FA" w:color="auto" w:val="clear"/>
+            <w:tcMar>
+              <w:top w:type="dxa" w:w="60"/>
+              <w:left w:type="dxa" w:w="100"/>
+              <w:bottom w:type="dxa" w:w="60"/>
+              <w:right w:type="dxa" w:w="100"/>
+            </w:tcMar>
+          </w:tcPr>
+          <w:p>
+            <w:pPr>
+              <w:spacing w:after="0"/>
+            </w:pPr>
+            <w:r>
+              <w:rPr>
+                <w:sz w:val="18"/>
+                <w:szCs w:val="18"/>
+              </w:rPr>
+              <w:t xml:space="preserve">D-58</w:t>
+            </w:r>
+          </w:p>
+        </w:tc>
+        <w:tc>
+          <w:tcPr>
+            <w:tcW w:type="dxa" w:w="4408"/>
+            <w:tcBorders>
+              <w:top w:val="single" w:color="BFBFBF" w:sz="4"/>
+              <w:left w:val="single" w:color="BFBFBF" w:sz="4"/>
+              <w:bottom w:val="single" w:color="BFBFBF" w:sz="4"/>
+              <w:right w:val="single" w:color="BFBFBF" w:sz="4"/>
+            </w:tcBorders>
+            <w:shd w:fill="F2F6FA" w:color="auto" w:val="clear"/>
+            <w:tcMar>
+              <w:top w:type="dxa" w:w="60"/>
+              <w:left w:type="dxa" w:w="100"/>
+              <w:bottom w:type="dxa" w:w="60"/>
+              <w:right w:type="dxa" w:w="100"/>
+            </w:tcMar>
+          </w:tcPr>
+          <w:p>
+            <w:pPr>
+              <w:spacing w:after="0"/>
+            </w:pPr>
+            <w:r>
+              <w:rPr>
+                <w:sz w:val="18"/>
+                <w:szCs w:val="18"/>
+              </w:rPr>
+              <w:t xml:space="preserve">Región y monedas de la estimación de nube</w:t>
+            </w:r>
+          </w:p>
+        </w:tc>
+        <w:tc>
+          <w:tcPr>
+            <w:tcW w:type="dxa" w:w="4483"/>
+            <w:tcBorders>
+              <w:top w:val="single" w:color="BFBFBF" w:sz="4"/>
+              <w:left w:val="single" w:color="BFBFBF" w:sz="4"/>
+              <w:bottom w:val="single" w:color="BFBFBF" w:sz="4"/>
+              <w:right w:val="single" w:color="BFBFBF" w:sz="4"/>
+            </w:tcBorders>
+            <w:shd w:fill="F2F6FA" w:color="auto" w:val="clear"/>
+            <w:tcMar>
+              <w:top w:type="dxa" w:w="60"/>
+              <w:left w:type="dxa" w:w="100"/>
+              <w:bottom w:type="dxa" w:w="60"/>
+              <w:right w:type="dxa" w:w="100"/>
+            </w:tcMar>
+          </w:tcPr>
+          <w:p>
+            <w:pPr>
+              <w:spacing w:after="0"/>
+            </w:pPr>
+            <w:r>
+              <w:rPr>
+                <w:sz w:val="18"/>
+                <w:szCs w:val="18"/>
+              </w:rPr>
+              <w:t xml:space="preserve">Aprobado el 16/10/2026: São Paulo, Brasil (sa-saopaulo-1), como región de referencia de Oracle Cloud; presentar USD y equivalente ARS con tipo de cambio, fecha y fuente explícitos. La región es la ubicación de los servidores, independiente de que el gimnasio opere en Córdoba. Solo estimación: no crea ni contrata recursos. Motivo: cotización reproducible y comprensible para el equipo; disponibilidad, franquicias, impuestos y suficiencia se verifican por separado. Fundamento: criterios de costos/capacidad, pp. 29–30 y 143; región y monedas son elecciones del proyecto.</w:t>
+            </w:r>
+          </w:p>
+        </w:tc>
+      </w:tr>
+      <w:tr>
+        <w:trPr>
+          <w:tblHeader w:val="false"/>
+        </w:trPr>
+        <w:tc>
+          <w:tcPr>
+            <w:tcW w:type="dxa" w:w="747"/>
+            <w:tcBorders>
+              <w:top w:val="single" w:color="BFBFBF" w:sz="4"/>
+              <w:left w:val="single" w:color="BFBFBF" w:sz="4"/>
+              <w:bottom w:val="single" w:color="BFBFBF" w:sz="4"/>
+              <w:right w:val="single" w:color="BFBFBF" w:sz="4"/>
+            </w:tcBorders>
+            <w:shd w:fill="F2F6FA" w:color="auto" w:val="clear"/>
+            <w:tcMar>
+              <w:top w:type="dxa" w:w="60"/>
+              <w:left w:type="dxa" w:w="100"/>
+              <w:bottom w:type="dxa" w:w="60"/>
+              <w:right w:type="dxa" w:w="100"/>
+            </w:tcMar>
+          </w:tcPr>
+          <w:p>
+            <w:pPr>
+              <w:spacing w:after="0"/>
+            </w:pPr>
+            <w:r>
+              <w:rPr>
+                <w:sz w:val="18"/>
+                <w:szCs w:val="18"/>
+              </w:rPr>
+              <w:t xml:space="preserve">D-59</w:t>
+            </w:r>
+          </w:p>
+        </w:tc>
+        <w:tc>
+          <w:tcPr>
+            <w:tcW w:type="dxa" w:w="4408"/>
+            <w:tcBorders>
+              <w:top w:val="single" w:color="BFBFBF" w:sz="4"/>
+              <w:left w:val="single" w:color="BFBFBF" w:sz="4"/>
+              <w:bottom w:val="single" w:color="BFBFBF" w:sz="4"/>
+              <w:right w:val="single" w:color="BFBFBF" w:sz="4"/>
+            </w:tcBorders>
+            <w:shd w:fill="F2F6FA" w:color="auto" w:val="clear"/>
+            <w:tcMar>
+              <w:top w:type="dxa" w:w="60"/>
+              <w:left w:type="dxa" w:w="100"/>
+              <w:bottom w:type="dxa" w:w="60"/>
+              <w:right w:type="dxa" w:w="100"/>
+            </w:tcMar>
+          </w:tcPr>
+          <w:p>
+            <w:pPr>
+              <w:spacing w:after="0"/>
+            </w:pPr>
+            <w:r>
+              <w:rPr>
+                <w:sz w:val="18"/>
+                <w:szCs w:val="18"/>
+              </w:rPr>
+              <w:t xml:space="preserve">Experimento adicional de escrituras sin pausa</w:t>
+            </w:r>
+          </w:p>
+        </w:tc>
+        <w:tc>
+          <w:tcPr>
+            <w:tcW w:type="dxa" w:w="4483"/>
+            <w:tcBorders>
+              <w:top w:val="single" w:color="BFBFBF" w:sz="4"/>
+              <w:left w:val="single" w:color="BFBFBF" w:sz="4"/>
+              <w:bottom w:val="single" w:color="BFBFBF" w:sz="4"/>
+              <w:right w:val="single" w:color="BFBFBF" w:sz="4"/>
+            </w:tcBorders>
+            <w:shd w:fill="F2F6FA" w:color="auto" w:val="clear"/>
+            <w:tcMar>
+              <w:top w:type="dxa" w:w="60"/>
+              <w:left w:type="dxa" w:w="100"/>
+              <w:bottom w:type="dxa" w:w="60"/>
+              <w:right w:type="dxa" w:w="100"/>
+            </w:tcMar>
+          </w:tcPr>
+          <w:p>
+            <w:pPr>
+              <w:spacing w:after="0"/>
+            </w:pPr>
+            <w:r>
+              <w:rPr>
+                <w:sz w:val="18"/>
+                <w:szCs w:val="18"/>
+              </w:rPr>
+              <w:t xml:space="preserve">Aprobado el 16/10/2026, condicionado a que la matriz con pausa no identifique saturación: medir créditos únicos sobre una cuenta, sin pausa, con 1/5/10 VU durante 30 s por nivel. Conservar precarga y calentamiento; ejecutar después y guardar evidencia separada. Motivo: distinguir el techo del generador de un límite del servicio. Sin cambiar código productivo, timeouts, pool ni invariantes. Fundamento: capacidad y límites, pp. 29–30, 86 y 101–102; los niveles y duración son parámetros propios aprobados, no cifras del teórico.</w:t>
+            </w:r>
+          </w:p>
+        </w:tc>
+      </w:tr>
+      <w:tr>
+        <w:trPr>
+          <w:tblHeader w:val="false"/>
+        </w:trPr>
+        <w:tc>
+          <w:tcPr>
+            <w:tcW w:type="dxa" w:w="747"/>
+            <w:tcBorders>
+              <w:top w:val="single" w:color="BFBFBF" w:sz="4"/>
+              <w:left w:val="single" w:color="BFBFBF" w:sz="4"/>
+              <w:bottom w:val="single" w:color="BFBFBF" w:sz="4"/>
+              <w:right w:val="single" w:color="BFBFBF" w:sz="4"/>
+            </w:tcBorders>
+            <w:shd w:fill="F2F6FA" w:color="auto" w:val="clear"/>
+            <w:tcMar>
+              <w:top w:type="dxa" w:w="60"/>
+              <w:left w:type="dxa" w:w="100"/>
+              <w:bottom w:type="dxa" w:w="60"/>
+              <w:right w:type="dxa" w:w="100"/>
+            </w:tcMar>
+          </w:tcPr>
+          <w:p>
+            <w:pPr>
+              <w:spacing w:after="0"/>
+            </w:pPr>
+            <w:r>
+              <w:rPr>
+                <w:sz w:val="18"/>
+                <w:szCs w:val="18"/>
+              </w:rPr>
+              <w:t xml:space="preserve">D-60</w:t>
+            </w:r>
+          </w:p>
+        </w:tc>
+        <w:tc>
+          <w:tcPr>
+            <w:tcW w:type="dxa" w:w="4408"/>
+            <w:tcBorders>
+              <w:top w:val="single" w:color="BFBFBF" w:sz="4"/>
+              <w:left w:val="single" w:color="BFBFBF" w:sz="4"/>
+              <w:bottom w:val="single" w:color="BFBFBF" w:sz="4"/>
+              <w:right w:val="single" w:color="BFBFBF" w:sz="4"/>
+            </w:tcBorders>
+            <w:shd w:fill="F2F6FA" w:color="auto" w:val="clear"/>
+            <w:tcMar>
+              <w:top w:type="dxa" w:w="60"/>
+              <w:left w:type="dxa" w:w="100"/>
+              <w:bottom w:type="dxa" w:w="60"/>
+              <w:right w:type="dxa" w:w="100"/>
+            </w:tcMar>
+          </w:tcPr>
+          <w:p>
+            <w:pPr>
+              <w:spacing w:after="0"/>
+            </w:pPr>
+            <w:r>
+              <w:rPr>
+                <w:sz w:val="18"/>
+                <w:szCs w:val="18"/>
+              </w:rPr>
+              <w:t xml:space="preserve">Supuesto de demanda para estimar almacenamiento</w:t>
+            </w:r>
+          </w:p>
+        </w:tc>
+        <w:tc>
+          <w:tcPr>
+            <w:tcW w:type="dxa" w:w="4483"/>
+            <w:tcBorders>
+              <w:top w:val="single" w:color="BFBFBF" w:sz="4"/>
+              <w:left w:val="single" w:color="BFBFBF" w:sz="4"/>
+              <w:bottom w:val="single" w:color="BFBFBF" w:sz="4"/>
+              <w:right w:val="single" w:color="BFBFBF" w:sz="4"/>
+            </w:tcBorders>
+            <w:shd w:fill="F2F6FA" w:color="auto" w:val="clear"/>
+            <w:tcMar>
+              <w:top w:type="dxa" w:w="60"/>
+              <w:left w:type="dxa" w:w="100"/>
+              <w:bottom w:type="dxa" w:w="60"/>
+              <w:right w:type="dxa" w:w="100"/>
+            </w:tcMar>
+          </w:tcPr>
+          <w:p>
+            <w:pPr>
+              <w:spacing w:after="0"/>
+            </w:pPr>
+            <w:r>
+              <w:rPr>
+                <w:sz w:val="18"/>
+                <w:szCs w:val="18"/>
+              </w:rPr>
+              <w:t xml:space="preserve">Aprobado el 16/10/2026: escenario ilustrativo de 100 cuentas y 2 movimientos diarios por cuenta (200 movimientos/día), usando tamaños medidos. No es demanda real confirmada ni compromiso de capacidad. Conservar movimientos y respuestas idempotentes al menos 30 días; hoy no existe purga automática, por lo que no se presupone una meseta de almacenamiento. Motivo: hacer explícita la demanda de la proyección sin inventar usuarios reales. Fundamento: dimensionamiento y costos, pp. 29–30 y 143; cantidades propias aprobadas para el cálculo de etapa 7.</w:t>
             </w:r>
           </w:p>
         </w:tc>
@@ -7120,6 +7500,258 @@
           </w:p>
         </w:tc>
       </w:tr>
+      <w:tr>
+        <w:trPr>
+          <w:tblHeader w:val="false"/>
+        </w:trPr>
+        <w:tc>
+          <w:tcPr>
+            <w:tcW w:type="dxa" w:w="2029"/>
+            <w:tcBorders>
+              <w:top w:val="single" w:color="BFBFBF" w:sz="4"/>
+              <w:left w:val="single" w:color="BFBFBF" w:sz="4"/>
+              <w:bottom w:val="single" w:color="BFBFBF" w:sz="4"/>
+              <w:right w:val="single" w:color="BFBFBF" w:sz="4"/>
+            </w:tcBorders>
+            <w:tcMar>
+              <w:top w:type="dxa" w:w="60"/>
+              <w:left w:type="dxa" w:w="100"/>
+              <w:bottom w:type="dxa" w:w="60"/>
+              <w:right w:type="dxa" w:w="100"/>
+            </w:tcMar>
+          </w:tcPr>
+          <w:p>
+            <w:pPr>
+              <w:spacing w:after="0"/>
+            </w:pPr>
+            <w:r>
+              <w:rPr>
+                <w:sz w:val="18"/>
+                <w:szCs w:val="18"/>
+              </w:rPr>
+              <w:t xml:space="preserve">16/10/2026</w:t>
+            </w:r>
+          </w:p>
+        </w:tc>
+        <w:tc>
+          <w:tcPr>
+            <w:tcW w:type="dxa" w:w="7609"/>
+            <w:tcBorders>
+              <w:top w:val="single" w:color="BFBFBF" w:sz="4"/>
+              <w:left w:val="single" w:color="BFBFBF" w:sz="4"/>
+              <w:bottom w:val="single" w:color="BFBFBF" w:sz="4"/>
+              <w:right w:val="single" w:color="BFBFBF" w:sz="4"/>
+            </w:tcBorders>
+            <w:tcMar>
+              <w:top w:type="dxa" w:w="60"/>
+              <w:left w:type="dxa" w:w="100"/>
+              <w:bottom w:type="dxa" w:w="60"/>
+              <w:right w:type="dxa" w:w="100"/>
+            </w:tcMar>
+          </w:tcPr>
+          <w:p>
+            <w:pPr>
+              <w:spacing w:after="0"/>
+            </w:pPr>
+            <w:r>
+              <w:rPr>
+                <w:sz w:val="18"/>
+                <w:szCs w:val="18"/>
+              </w:rPr>
+              <w:t xml:space="preserve">Se agregan D-57/D-58: pausa, precarga, región y monedas aprobadas para etapa 7; mediciones en curso.</w:t>
+            </w:r>
+          </w:p>
+        </w:tc>
+      </w:tr>
+      <w:tr>
+        <w:trPr>
+          <w:tblHeader w:val="false"/>
+        </w:trPr>
+        <w:tc>
+          <w:tcPr>
+            <w:tcW w:type="dxa" w:w="2029"/>
+            <w:tcBorders>
+              <w:top w:val="single" w:color="BFBFBF" w:sz="4"/>
+              <w:left w:val="single" w:color="BFBFBF" w:sz="4"/>
+              <w:bottom w:val="single" w:color="BFBFBF" w:sz="4"/>
+              <w:right w:val="single" w:color="BFBFBF" w:sz="4"/>
+            </w:tcBorders>
+            <w:tcMar>
+              <w:top w:type="dxa" w:w="60"/>
+              <w:left w:type="dxa" w:w="100"/>
+              <w:bottom w:type="dxa" w:w="60"/>
+              <w:right w:type="dxa" w:w="100"/>
+            </w:tcMar>
+          </w:tcPr>
+          <w:p>
+            <w:pPr>
+              <w:spacing w:after="0"/>
+            </w:pPr>
+            <w:r>
+              <w:rPr>
+                <w:sz w:val="18"/>
+                <w:szCs w:val="18"/>
+              </w:rPr>
+              <w:t xml:space="preserve">16/10/2026</w:t>
+            </w:r>
+          </w:p>
+        </w:tc>
+        <w:tc>
+          <w:tcPr>
+            <w:tcW w:type="dxa" w:w="7609"/>
+            <w:tcBorders>
+              <w:top w:val="single" w:color="BFBFBF" w:sz="4"/>
+              <w:left w:val="single" w:color="BFBFBF" w:sz="4"/>
+              <w:bottom w:val="single" w:color="BFBFBF" w:sz="4"/>
+              <w:right w:val="single" w:color="BFBFBF" w:sz="4"/>
+            </w:tcBorders>
+            <w:tcMar>
+              <w:top w:type="dxa" w:w="60"/>
+              <w:left w:type="dxa" w:w="100"/>
+              <w:bottom w:type="dxa" w:w="60"/>
+              <w:right w:type="dxa" w:w="100"/>
+            </w:tcMar>
+          </w:tcPr>
+          <w:p>
+            <w:pPr>
+              <w:spacing w:after="0"/>
+            </w:pPr>
+            <w:r>
+              <w:rPr>
+                <w:sz w:val="18"/>
+                <w:szCs w:val="18"/>
+              </w:rPr>
+              <w:t xml:space="preserve">D-59: experimento adicional sin pausa aprobado si la matriz inicial no identifica saturación; evidencia separada.</w:t>
+            </w:r>
+          </w:p>
+        </w:tc>
+      </w:tr>
+      <w:tr>
+        <w:trPr>
+          <w:tblHeader w:val="false"/>
+        </w:trPr>
+        <w:tc>
+          <w:tcPr>
+            <w:tcW w:type="dxa" w:w="2029"/>
+            <w:tcBorders>
+              <w:top w:val="single" w:color="BFBFBF" w:sz="4"/>
+              <w:left w:val="single" w:color="BFBFBF" w:sz="4"/>
+              <w:bottom w:val="single" w:color="BFBFBF" w:sz="4"/>
+              <w:right w:val="single" w:color="BFBFBF" w:sz="4"/>
+            </w:tcBorders>
+            <w:tcMar>
+              <w:top w:type="dxa" w:w="60"/>
+              <w:left w:type="dxa" w:w="100"/>
+              <w:bottom w:type="dxa" w:w="60"/>
+              <w:right w:type="dxa" w:w="100"/>
+            </w:tcMar>
+          </w:tcPr>
+          <w:p>
+            <w:pPr>
+              <w:spacing w:after="0"/>
+            </w:pPr>
+            <w:r>
+              <w:rPr>
+                <w:sz w:val="18"/>
+                <w:szCs w:val="18"/>
+              </w:rPr>
+              <w:t xml:space="preserve">16/10/2026</w:t>
+            </w:r>
+          </w:p>
+        </w:tc>
+        <w:tc>
+          <w:tcPr>
+            <w:tcW w:type="dxa" w:w="7609"/>
+            <w:tcBorders>
+              <w:top w:val="single" w:color="BFBFBF" w:sz="4"/>
+              <w:left w:val="single" w:color="BFBFBF" w:sz="4"/>
+              <w:bottom w:val="single" w:color="BFBFBF" w:sz="4"/>
+              <w:right w:val="single" w:color="BFBFBF" w:sz="4"/>
+            </w:tcBorders>
+            <w:tcMar>
+              <w:top w:type="dxa" w:w="60"/>
+              <w:left w:type="dxa" w:w="100"/>
+              <w:bottom w:type="dxa" w:w="60"/>
+              <w:right w:type="dxa" w:w="100"/>
+            </w:tcMar>
+          </w:tcPr>
+          <w:p>
+            <w:pPr>
+              <w:spacing w:after="0"/>
+            </w:pPr>
+            <w:r>
+              <w:rPr>
+                <w:sz w:val="18"/>
+                <w:szCs w:val="18"/>
+              </w:rPr>
+              <w:t xml:space="preserve">D-60: supuesto ilustrativo de 200 movimientos diarios aprobado para proyectar almacenamiento medido.</w:t>
+            </w:r>
+          </w:p>
+        </w:tc>
+      </w:tr>
+      <w:tr>
+        <w:trPr>
+          <w:tblHeader w:val="false"/>
+        </w:trPr>
+        <w:tc>
+          <w:tcPr>
+            <w:tcW w:type="dxa" w:w="2029"/>
+            <w:tcBorders>
+              <w:top w:val="single" w:color="BFBFBF" w:sz="4"/>
+              <w:left w:val="single" w:color="BFBFBF" w:sz="4"/>
+              <w:bottom w:val="single" w:color="BFBFBF" w:sz="4"/>
+              <w:right w:val="single" w:color="BFBFBF" w:sz="4"/>
+            </w:tcBorders>
+            <w:tcMar>
+              <w:top w:type="dxa" w:w="60"/>
+              <w:left w:type="dxa" w:w="100"/>
+              <w:bottom w:type="dxa" w:w="60"/>
+              <w:right w:type="dxa" w:w="100"/>
+            </w:tcMar>
+          </w:tcPr>
+          <w:p>
+            <w:pPr>
+              <w:spacing w:after="0"/>
+            </w:pPr>
+            <w:r>
+              <w:rPr>
+                <w:sz w:val="18"/>
+                <w:szCs w:val="18"/>
+              </w:rPr>
+              <w:t xml:space="preserve">16/10/2026</w:t>
+            </w:r>
+          </w:p>
+        </w:tc>
+        <w:tc>
+          <w:tcPr>
+            <w:tcW w:type="dxa" w:w="7609"/>
+            <w:tcBorders>
+              <w:top w:val="single" w:color="BFBFBF" w:sz="4"/>
+              <w:left w:val="single" w:color="BFBFBF" w:sz="4"/>
+              <w:bottom w:val="single" w:color="BFBFBF" w:sz="4"/>
+              <w:right w:val="single" w:color="BFBFBF" w:sz="4"/>
+            </w:tcBorders>
+            <w:tcMar>
+              <w:top w:type="dxa" w:w="60"/>
+              <w:left w:type="dxa" w:w="100"/>
+              <w:bottom w:type="dxa" w:w="60"/>
+              <w:right w:type="dxa" w:w="100"/>
+            </w:tcMar>
+          </w:tcPr>
+          <w:p>
+            <w:pPr>
+              <w:spacing w:after="0"/>
+            </w:pPr>
+            <w:r>
+              <w:rPr>
+                <w:sz w:val="18"/>
+                <w:szCs w:val="18"/>
+              </w:rPr>
+              <w:t xml:space="preserve">D-50: etapa 7 completada con 36 fases, invariantes, límite explorado, alternativas y costos; ADR-013 v2 conserva la historia.</w:t>
+            </w:r>
+          </w:p>
+        </w:tc>
+      </w:tr>
     </w:tbl>
     <w:p>
       <w:pPr>
@@ -7976,7 +8608,7 @@
                 <w:sz w:val="18"/>
                 <w:szCs w:val="18"/>
               </w:rPr>
-              <w:t xml:space="preserve">Medir antes de elegir mejoras o afirmar capacidad. k6 y percentiles son instrumentos adicionales aprobados; cargas y objetivos son propios y todavía no medidos.</w:t>
+              <w:t xml:space="preserve">Medir antes de elegir mejoras o afirmar capacidad. k6 y percentiles son instrumentos adicionales aprobados; cargas y objetivos son propios; evidencia local completada en etapa 7, sin garantía de capacidad ARM.</w:t>
             </w:r>
           </w:p>
         </w:tc>
@@ -8185,6 +8817,422 @@
                 <w:szCs w:val="18"/>
               </w:rPr>
               <w:t xml:space="preserve">Margen de medición local aprobado para transporte y planificación; no amplía el contexto del negocio, no es SLA ni cifra del teórico.</w:t>
+            </w:r>
+          </w:p>
+        </w:tc>
+      </w:tr>
+      <w:tr>
+        <w:trPr>
+          <w:tblHeader/>
+        </w:trPr>
+        <w:tc>
+          <w:tcPr>
+            <w:tcW w:type="dxa" w:w="747"/>
+            <w:tcBorders>
+              <w:top w:val="single" w:color="BFBFBF" w:sz="4"/>
+              <w:left w:val="single" w:color="BFBFBF" w:sz="4"/>
+              <w:bottom w:val="single" w:color="BFBFBF" w:sz="4"/>
+              <w:right w:val="single" w:color="BFBFBF" w:sz="4"/>
+            </w:tcBorders>
+            <w:shd w:fill="1F4E79" w:color="auto" w:val="clear"/>
+            <w:tcMar>
+              <w:top w:type="dxa" w:w="60"/>
+              <w:left w:type="dxa" w:w="100"/>
+              <w:bottom w:type="dxa" w:w="60"/>
+              <w:right w:type="dxa" w:w="100"/>
+            </w:tcMar>
+          </w:tcPr>
+          <w:p>
+            <w:pPr>
+              <w:spacing w:after="0"/>
+            </w:pPr>
+            <w:r>
+              <w:rPr>
+                <w:b/>
+                <w:bCs/>
+                <w:color w:val="FFFFFF"/>
+                <w:sz w:val="18"/>
+                <w:szCs w:val="18"/>
+              </w:rPr>
+              <w:t xml:space="preserve">D-57</w:t>
+            </w:r>
+          </w:p>
+        </w:tc>
+        <w:tc>
+          <w:tcPr>
+            <w:tcW w:type="dxa" w:w="4408"/>
+            <w:tcBorders>
+              <w:top w:val="single" w:color="BFBFBF" w:sz="4"/>
+              <w:left w:val="single" w:color="BFBFBF" w:sz="4"/>
+              <w:bottom w:val="single" w:color="BFBFBF" w:sz="4"/>
+              <w:right w:val="single" w:color="BFBFBF" w:sz="4"/>
+            </w:tcBorders>
+            <w:shd w:fill="1F4E79" w:color="auto" w:val="clear"/>
+            <w:tcMar>
+              <w:top w:type="dxa" w:w="60"/>
+              <w:left w:type="dxa" w:w="100"/>
+              <w:bottom w:type="dxa" w:w="60"/>
+              <w:right w:type="dxa" w:w="100"/>
+            </w:tcMar>
+          </w:tcPr>
+          <w:p>
+            <w:pPr>
+              <w:spacing w:after="0"/>
+            </w:pPr>
+            <w:r>
+              <w:rPr>
+                <w:b/>
+                <w:bCs/>
+                <w:color w:val="FFFFFF"/>
+                <w:sz w:val="18"/>
+                <w:szCs w:val="18"/>
+              </w:rPr>
+              <w:t xml:space="preserve">Capacidad, latencia y límites: pp. 29–30, 86 y 101–102.</w:t>
+            </w:r>
+          </w:p>
+        </w:tc>
+        <w:tc>
+          <w:tcPr>
+            <w:tcW w:type="dxa" w:w="4483"/>
+            <w:tcBorders>
+              <w:top w:val="single" w:color="BFBFBF" w:sz="4"/>
+              <w:left w:val="single" w:color="BFBFBF" w:sz="4"/>
+              <w:bottom w:val="single" w:color="BFBFBF" w:sz="4"/>
+              <w:right w:val="single" w:color="BFBFBF" w:sz="4"/>
+            </w:tcBorders>
+            <w:shd w:fill="1F4E79" w:color="auto" w:val="clear"/>
+            <w:tcMar>
+              <w:top w:type="dxa" w:w="60"/>
+              <w:left w:type="dxa" w:w="100"/>
+              <w:bottom w:type="dxa" w:w="60"/>
+              <w:right w:type="dxa" w:w="100"/>
+            </w:tcMar>
+          </w:tcPr>
+          <w:p>
+            <w:pPr>
+              <w:spacing w:after="0"/>
+            </w:pPr>
+            <w:r>
+              <w:rPr>
+                <w:b/>
+                <w:bCs/>
+                <w:color w:val="FFFFFF"/>
+                <w:sz w:val="18"/>
+                <w:szCs w:val="18"/>
+              </w:rPr>
+              <w:t xml:space="preserve">Pausa y precarga controlan el experimento y permiten replay real. Los valores son propios; resultados con pausa no demuestran saturación.</w:t>
+            </w:r>
+          </w:p>
+        </w:tc>
+      </w:tr>
+      <w:tr>
+        <w:trPr>
+          <w:tblHeader/>
+        </w:trPr>
+        <w:tc>
+          <w:tcPr>
+            <w:tcW w:type="dxa" w:w="747"/>
+            <w:tcBorders>
+              <w:top w:val="single" w:color="BFBFBF" w:sz="4"/>
+              <w:left w:val="single" w:color="BFBFBF" w:sz="4"/>
+              <w:bottom w:val="single" w:color="BFBFBF" w:sz="4"/>
+              <w:right w:val="single" w:color="BFBFBF" w:sz="4"/>
+            </w:tcBorders>
+            <w:shd w:fill="1F4E79" w:color="auto" w:val="clear"/>
+            <w:tcMar>
+              <w:top w:type="dxa" w:w="60"/>
+              <w:left w:type="dxa" w:w="100"/>
+              <w:bottom w:type="dxa" w:w="60"/>
+              <w:right w:type="dxa" w:w="100"/>
+            </w:tcMar>
+          </w:tcPr>
+          <w:p>
+            <w:pPr>
+              <w:spacing w:after="0"/>
+            </w:pPr>
+            <w:r>
+              <w:rPr>
+                <w:b/>
+                <w:bCs/>
+                <w:color w:val="FFFFFF"/>
+                <w:sz w:val="18"/>
+                <w:szCs w:val="18"/>
+              </w:rPr>
+              <w:t xml:space="preserve">D-58</w:t>
+            </w:r>
+          </w:p>
+        </w:tc>
+        <w:tc>
+          <w:tcPr>
+            <w:tcW w:type="dxa" w:w="4408"/>
+            <w:tcBorders>
+              <w:top w:val="single" w:color="BFBFBF" w:sz="4"/>
+              <w:left w:val="single" w:color="BFBFBF" w:sz="4"/>
+              <w:bottom w:val="single" w:color="BFBFBF" w:sz="4"/>
+              <w:right w:val="single" w:color="BFBFBF" w:sz="4"/>
+            </w:tcBorders>
+            <w:shd w:fill="1F4E79" w:color="auto" w:val="clear"/>
+            <w:tcMar>
+              <w:top w:type="dxa" w:w="60"/>
+              <w:left w:type="dxa" w:w="100"/>
+              <w:bottom w:type="dxa" w:w="60"/>
+              <w:right w:type="dxa" w:w="100"/>
+            </w:tcMar>
+          </w:tcPr>
+          <w:p>
+            <w:pPr>
+              <w:spacing w:after="0"/>
+            </w:pPr>
+            <w:r>
+              <w:rPr>
+                <w:b/>
+                <w:bCs/>
+                <w:color w:val="FFFFFF"/>
+                <w:sz w:val="18"/>
+                <w:szCs w:val="18"/>
+              </w:rPr>
+              <w:t xml:space="preserve">Criterios de costos y capacidad: pp. 29–30 y 143.</w:t>
+            </w:r>
+          </w:p>
+        </w:tc>
+        <w:tc>
+          <w:tcPr>
+            <w:tcW w:type="dxa" w:w="4483"/>
+            <w:tcBorders>
+              <w:top w:val="single" w:color="BFBFBF" w:sz="4"/>
+              <w:left w:val="single" w:color="BFBFBF" w:sz="4"/>
+              <w:bottom w:val="single" w:color="BFBFBF" w:sz="4"/>
+              <w:right w:val="single" w:color="BFBFBF" w:sz="4"/>
+            </w:tcBorders>
+            <w:shd w:fill="1F4E79" w:color="auto" w:val="clear"/>
+            <w:tcMar>
+              <w:top w:type="dxa" w:w="60"/>
+              <w:left w:type="dxa" w:w="100"/>
+              <w:bottom w:type="dxa" w:w="60"/>
+              <w:right w:type="dxa" w:w="100"/>
+            </w:tcMar>
+          </w:tcPr>
+          <w:p>
+            <w:pPr>
+              <w:spacing w:after="0"/>
+            </w:pPr>
+            <w:r>
+              <w:rPr>
+                <w:b/>
+                <w:bCs/>
+                <w:color w:val="FFFFFF"/>
+                <w:sz w:val="18"/>
+                <w:szCs w:val="18"/>
+              </w:rPr>
+              <w:t xml:space="preserve">Fuentes, fecha, región y conversión hacen revisable la estimación. El teórico no prescribe Oracle, São Paulo ni una cotización cambiaria.</w:t>
+            </w:r>
+          </w:p>
+        </w:tc>
+      </w:tr>
+      <w:tr>
+        <w:trPr>
+          <w:tblHeader/>
+        </w:trPr>
+        <w:tc>
+          <w:tcPr>
+            <w:tcW w:type="dxa" w:w="747"/>
+            <w:tcBorders>
+              <w:top w:val="single" w:color="BFBFBF" w:sz="4"/>
+              <w:left w:val="single" w:color="BFBFBF" w:sz="4"/>
+              <w:bottom w:val="single" w:color="BFBFBF" w:sz="4"/>
+              <w:right w:val="single" w:color="BFBFBF" w:sz="4"/>
+            </w:tcBorders>
+            <w:shd w:fill="1F4E79" w:color="auto" w:val="clear"/>
+            <w:tcMar>
+              <w:top w:type="dxa" w:w="60"/>
+              <w:left w:type="dxa" w:w="100"/>
+              <w:bottom w:type="dxa" w:w="60"/>
+              <w:right w:type="dxa" w:w="100"/>
+            </w:tcMar>
+          </w:tcPr>
+          <w:p>
+            <w:pPr>
+              <w:spacing w:after="0"/>
+            </w:pPr>
+            <w:r>
+              <w:rPr>
+                <w:b/>
+                <w:bCs/>
+                <w:color w:val="FFFFFF"/>
+                <w:sz w:val="18"/>
+                <w:szCs w:val="18"/>
+              </w:rPr>
+              <w:t xml:space="preserve">D-59</w:t>
+            </w:r>
+          </w:p>
+        </w:tc>
+        <w:tc>
+          <w:tcPr>
+            <w:tcW w:type="dxa" w:w="4408"/>
+            <w:tcBorders>
+              <w:top w:val="single" w:color="BFBFBF" w:sz="4"/>
+              <w:left w:val="single" w:color="BFBFBF" w:sz="4"/>
+              <w:bottom w:val="single" w:color="BFBFBF" w:sz="4"/>
+              <w:right w:val="single" w:color="BFBFBF" w:sz="4"/>
+            </w:tcBorders>
+            <w:shd w:fill="1F4E79" w:color="auto" w:val="clear"/>
+            <w:tcMar>
+              <w:top w:type="dxa" w:w="60"/>
+              <w:left w:type="dxa" w:w="100"/>
+              <w:bottom w:type="dxa" w:w="60"/>
+              <w:right w:type="dxa" w:w="100"/>
+            </w:tcMar>
+          </w:tcPr>
+          <w:p>
+            <w:pPr>
+              <w:spacing w:after="0"/>
+            </w:pPr>
+            <w:r>
+              <w:rPr>
+                <w:b/>
+                <w:bCs/>
+                <w:color w:val="FFFFFF"/>
+                <w:sz w:val="18"/>
+                <w:szCs w:val="18"/>
+              </w:rPr>
+              <w:t xml:space="preserve">Capacidad y límites: pp. 29–30, 86 y 101–102.</w:t>
+            </w:r>
+          </w:p>
+        </w:tc>
+        <w:tc>
+          <w:tcPr>
+            <w:tcW w:type="dxa" w:w="4483"/>
+            <w:tcBorders>
+              <w:top w:val="single" w:color="BFBFBF" w:sz="4"/>
+              <w:left w:val="single" w:color="BFBFBF" w:sz="4"/>
+              <w:bottom w:val="single" w:color="BFBFBF" w:sz="4"/>
+              <w:right w:val="single" w:color="BFBFBF" w:sz="4"/>
+            </w:tcBorders>
+            <w:shd w:fill="1F4E79" w:color="auto" w:val="clear"/>
+            <w:tcMar>
+              <w:top w:type="dxa" w:w="60"/>
+              <w:left w:type="dxa" w:w="100"/>
+              <w:bottom w:type="dxa" w:w="60"/>
+              <w:right w:type="dxa" w:w="100"/>
+            </w:tcMar>
+          </w:tcPr>
+          <w:p>
+            <w:pPr>
+              <w:spacing w:after="0"/>
+            </w:pPr>
+            <w:r>
+              <w:rPr>
+                <w:b/>
+                <w:bCs/>
+                <w:color w:val="FFFFFF"/>
+                <w:sz w:val="18"/>
+                <w:szCs w:val="18"/>
+              </w:rPr>
+              <w:t xml:space="preserve">Experimento acotado sin pausa para distinguir pacing de contención o recursos. No garantiza encontrar capacidad máxima ni autoriza ampliar concurrencia sin consulta.</w:t>
+            </w:r>
+          </w:p>
+        </w:tc>
+      </w:tr>
+      <w:tr>
+        <w:trPr>
+          <w:tblHeader/>
+        </w:trPr>
+        <w:tc>
+          <w:tcPr>
+            <w:tcW w:type="dxa" w:w="747"/>
+            <w:tcBorders>
+              <w:top w:val="single" w:color="BFBFBF" w:sz="4"/>
+              <w:left w:val="single" w:color="BFBFBF" w:sz="4"/>
+              <w:bottom w:val="single" w:color="BFBFBF" w:sz="4"/>
+              <w:right w:val="single" w:color="BFBFBF" w:sz="4"/>
+            </w:tcBorders>
+            <w:shd w:fill="1F4E79" w:color="auto" w:val="clear"/>
+            <w:tcMar>
+              <w:top w:type="dxa" w:w="60"/>
+              <w:left w:type="dxa" w:w="100"/>
+              <w:bottom w:type="dxa" w:w="60"/>
+              <w:right w:type="dxa" w:w="100"/>
+            </w:tcMar>
+          </w:tcPr>
+          <w:p>
+            <w:pPr>
+              <w:spacing w:after="0"/>
+            </w:pPr>
+            <w:r>
+              <w:rPr>
+                <w:b/>
+                <w:bCs/>
+                <w:color w:val="FFFFFF"/>
+                <w:sz w:val="18"/>
+                <w:szCs w:val="18"/>
+              </w:rPr>
+              <w:t xml:space="preserve">D-60</w:t>
+            </w:r>
+          </w:p>
+        </w:tc>
+        <w:tc>
+          <w:tcPr>
+            <w:tcW w:type="dxa" w:w="4408"/>
+            <w:tcBorders>
+              <w:top w:val="single" w:color="BFBFBF" w:sz="4"/>
+              <w:left w:val="single" w:color="BFBFBF" w:sz="4"/>
+              <w:bottom w:val="single" w:color="BFBFBF" w:sz="4"/>
+              <w:right w:val="single" w:color="BFBFBF" w:sz="4"/>
+            </w:tcBorders>
+            <w:shd w:fill="1F4E79" w:color="auto" w:val="clear"/>
+            <w:tcMar>
+              <w:top w:type="dxa" w:w="60"/>
+              <w:left w:type="dxa" w:w="100"/>
+              <w:bottom w:type="dxa" w:w="60"/>
+              <w:right w:type="dxa" w:w="100"/>
+            </w:tcMar>
+          </w:tcPr>
+          <w:p>
+            <w:pPr>
+              <w:spacing w:after="0"/>
+            </w:pPr>
+            <w:r>
+              <w:rPr>
+                <w:b/>
+                <w:bCs/>
+                <w:color w:val="FFFFFF"/>
+                <w:sz w:val="18"/>
+                <w:szCs w:val="18"/>
+              </w:rPr>
+              <w:t xml:space="preserve">Dimensionamiento y costos: pp. 29–30 y 143.</w:t>
+            </w:r>
+          </w:p>
+        </w:tc>
+        <w:tc>
+          <w:tcPr>
+            <w:tcW w:type="dxa" w:w="4483"/>
+            <w:tcBorders>
+              <w:top w:val="single" w:color="BFBFBF" w:sz="4"/>
+              <w:left w:val="single" w:color="BFBFBF" w:sz="4"/>
+              <w:bottom w:val="single" w:color="BFBFBF" w:sz="4"/>
+              <w:right w:val="single" w:color="BFBFBF" w:sz="4"/>
+            </w:tcBorders>
+            <w:shd w:fill="1F4E79" w:color="auto" w:val="clear"/>
+            <w:tcMar>
+              <w:top w:type="dxa" w:w="60"/>
+              <w:left w:type="dxa" w:w="100"/>
+              <w:bottom w:type="dxa" w:w="60"/>
+              <w:right w:type="dxa" w:w="100"/>
+            </w:tcMar>
+          </w:tcPr>
+          <w:p>
+            <w:pPr>
+              <w:spacing w:after="0"/>
+            </w:pPr>
+            <w:r>
+              <w:rPr>
+                <w:b/>
+                <w:bCs/>
+                <w:color w:val="FFFFFF"/>
+                <w:sz w:val="18"/>
+                <w:szCs w:val="18"/>
+              </w:rPr>
+              <w:t xml:space="preserve">Relacionar tasa supuesta con bytes medidos y retención efectiva. El supuesto no reemplaza una previsión real ni prueba rendimiento con ese historial.</w:t>
             </w:r>
           </w:p>
         </w:tc>

</xml_diff>

<commit_message>
docs: corregir referencias pendientes de entrega 2
</commit_message>
<xml_diff>
--- a/Registro_de_Decisiones_Gimnasio.docx
+++ b/Registro_de_Decisiones_Gimnasio.docx
@@ -4066,7 +4066,7 @@
                 <w:sz w:val="18"/>
                 <w:szCs w:val="18"/>
               </w:rPr>
-              <w:t xml:space="preserve">Aprobado el 16/10/2026: OpenAPI 1.1.0 documenta 502 UNAVAILABLE y 504 TIMEOUT con formato de partners y correlationId; 502 incluye Retry-After. Reintento con la misma Idempotency-Key, sin asumir rollback ante timeout. Ver ADR-008 v2; traducción del gateway pendiente de etapa 3.</w:t>
+              <w:t xml:space="preserve">Aprobado el 16/10/2026: OpenAPI 1.1.0 documenta 502 UNAVAILABLE y 504 TIMEOUT con formato de partners y correlationId; 502 incluye Retry-After. Reintento con la misma Idempotency-Key, sin asumir rollback ante timeout. La traducción del gateway fue implementada en la etapa 3 y validada en la etapa 6. Ver ADR-008 v2.</w:t>
             </w:r>
           </w:p>
         </w:tc>
@@ -4826,7 +4826,7 @@
                 <w:sz w:val="18"/>
                 <w:szCs w:val="18"/>
               </w:rPr>
-              <w:t xml:space="preserve">Aprobado el 16/10/2026: alinear el glosario con RN-22, CA-11.1 y CA-19.2. Sumar todos los importes aplicados, incluido el original REVERTIDO y su compensatorio: +100 y −100 dejan saldo 0. REVERTIDO impide otra reversión; no borra el aporte histórico. Motivo: excluir el original produciría un saldo incorrecto. Fundamento de clase: transacciones locales/invariantes, pp. 27–28, y agregado como límite de consistencia, p. 120; la fórmula viene del SPEC. ADR-004 v2 reemplaza al original. SPEC v0.10 preparado localmente, pendiente de revisión de otro integrante según CONTRIBUTING.</w:t>
+              <w:t xml:space="preserve">Aprobado el 16/10/2026: alinear el glosario con RN-22, CA-11.1 y CA-19.2. Sumar todos los importes aplicados, incluido el original REVERTIDO y su compensatorio: +100 y −100 dejan saldo 0. REVERTIDO impide otra reversión; no borra el aporte histórico. Motivo: excluir el original produciría un saldo incorrecto. Fundamento de clase: transacciones locales/invariantes, pp. 27–28, y agregado como límite de consistencia, p. 120; la fórmula viene del SPEC. ADR-004 v2 reemplaza al original. SPEC v0.10 fue revisado e integrado en main mediante el PR #1.</w:t>
             </w:r>
           </w:p>
         </w:tc>

</xml_diff>